<commit_message>
chore(release): public snapshot v0.2.2
</commit_message>
<xml_diff>
--- a/docs/需求说明书.docx
+++ b/docs/需求说明书.docx
@@ -69,7 +69,7 @@
           <w:color w:val="5A6370"/>
           <w:sz w:val="20"/>
         </w:rPr>
-        <w:t>文档编号  ADVP-SRS-001        版本  v0.2.1</w:t>
+        <w:t>文档编号  ADVP-SRS-001        版本  v0.2.2</w:t>
       </w:r>
     </w:p>
     <w:p>
@@ -173,7 +173,7 @@
         <w:rPr>
           <w:rFonts w:ascii="微软雅黑" w:hAnsi="微软雅黑" w:eastAsia="微软雅黑"/>
         </w:rPr>
-        <w:instrText xml:space="preserve"> HYPERLINK \l _Toc26852 </w:instrText>
+        <w:instrText xml:space="preserve"> HYPERLINK \l _Toc291 </w:instrText>
       </w:r>
       <w:r>
         <w:rPr>
@@ -194,7 +194,7 @@
         <w:fldChar w:fldCharType="begin"/>
       </w:r>
       <w:r>
-        <w:instrText xml:space="preserve"> PAGEREF _Toc26852 \h </w:instrText>
+        <w:instrText xml:space="preserve"> PAGEREF _Toc291 \h </w:instrText>
       </w:r>
       <w:r>
         <w:fldChar w:fldCharType="separate"/>
@@ -231,7 +231,7 @@
         <w:rPr>
           <w:rFonts w:ascii="微软雅黑" w:hAnsi="微软雅黑" w:eastAsia="微软雅黑"/>
         </w:rPr>
-        <w:instrText xml:space="preserve"> HYPERLINK \l _Toc11553 </w:instrText>
+        <w:instrText xml:space="preserve"> HYPERLINK \l _Toc22486 </w:instrText>
       </w:r>
       <w:r>
         <w:rPr>
@@ -252,7 +252,7 @@
         <w:fldChar w:fldCharType="begin"/>
       </w:r>
       <w:r>
-        <w:instrText xml:space="preserve"> PAGEREF _Toc11553 \h </w:instrText>
+        <w:instrText xml:space="preserve"> PAGEREF _Toc22486 \h </w:instrText>
       </w:r>
       <w:r>
         <w:fldChar w:fldCharType="separate"/>
@@ -289,7 +289,7 @@
         <w:rPr>
           <w:rFonts w:ascii="微软雅黑" w:hAnsi="微软雅黑" w:eastAsia="微软雅黑"/>
         </w:rPr>
-        <w:instrText xml:space="preserve"> HYPERLINK \l _Toc19455 </w:instrText>
+        <w:instrText xml:space="preserve"> HYPERLINK \l _Toc22102 </w:instrText>
       </w:r>
       <w:r>
         <w:rPr>
@@ -310,7 +310,7 @@
         <w:fldChar w:fldCharType="begin"/>
       </w:r>
       <w:r>
-        <w:instrText xml:space="preserve"> PAGEREF _Toc19455 \h </w:instrText>
+        <w:instrText xml:space="preserve"> PAGEREF _Toc22102 \h </w:instrText>
       </w:r>
       <w:r>
         <w:fldChar w:fldCharType="separate"/>
@@ -347,7 +347,7 @@
         <w:rPr>
           <w:rFonts w:ascii="微软雅黑" w:hAnsi="微软雅黑" w:eastAsia="微软雅黑"/>
         </w:rPr>
-        <w:instrText xml:space="preserve"> HYPERLINK \l _Toc26581 </w:instrText>
+        <w:instrText xml:space="preserve"> HYPERLINK \l _Toc15098 </w:instrText>
       </w:r>
       <w:r>
         <w:rPr>
@@ -368,7 +368,7 @@
         <w:fldChar w:fldCharType="begin"/>
       </w:r>
       <w:r>
-        <w:instrText xml:space="preserve"> PAGEREF _Toc26581 \h </w:instrText>
+        <w:instrText xml:space="preserve"> PAGEREF _Toc15098 \h </w:instrText>
       </w:r>
       <w:r>
         <w:fldChar w:fldCharType="separate"/>
@@ -405,7 +405,7 @@
         <w:rPr>
           <w:rFonts w:ascii="微软雅黑" w:hAnsi="微软雅黑" w:eastAsia="微软雅黑"/>
         </w:rPr>
-        <w:instrText xml:space="preserve"> HYPERLINK \l _Toc14705 </w:instrText>
+        <w:instrText xml:space="preserve"> HYPERLINK \l _Toc29907 </w:instrText>
       </w:r>
       <w:r>
         <w:rPr>
@@ -426,7 +426,7 @@
         <w:fldChar w:fldCharType="begin"/>
       </w:r>
       <w:r>
-        <w:instrText xml:space="preserve"> PAGEREF _Toc14705 \h </w:instrText>
+        <w:instrText xml:space="preserve"> PAGEREF _Toc29907 \h </w:instrText>
       </w:r>
       <w:r>
         <w:fldChar w:fldCharType="separate"/>
@@ -463,7 +463,7 @@
         <w:rPr>
           <w:rFonts w:ascii="微软雅黑" w:hAnsi="微软雅黑" w:eastAsia="微软雅黑"/>
         </w:rPr>
-        <w:instrText xml:space="preserve"> HYPERLINK \l _Toc27126 </w:instrText>
+        <w:instrText xml:space="preserve"> HYPERLINK \l _Toc14191 </w:instrText>
       </w:r>
       <w:r>
         <w:rPr>
@@ -484,13 +484,13 @@
         <w:fldChar w:fldCharType="begin"/>
       </w:r>
       <w:r>
-        <w:instrText xml:space="preserve"> PAGEREF _Toc27126 \h </w:instrText>
+        <w:instrText xml:space="preserve"> PAGEREF _Toc14191 \h </w:instrText>
       </w:r>
       <w:r>
         <w:fldChar w:fldCharType="separate"/>
       </w:r>
       <w:r>
-        <w:t>28</w:t>
+        <w:t>29</w:t>
       </w:r>
       <w:r>
         <w:fldChar w:fldCharType="end"/>
@@ -521,7 +521,7 @@
         <w:rPr>
           <w:rFonts w:ascii="微软雅黑" w:hAnsi="微软雅黑" w:eastAsia="微软雅黑"/>
         </w:rPr>
-        <w:instrText xml:space="preserve"> HYPERLINK \l _Toc27216 </w:instrText>
+        <w:instrText xml:space="preserve"> HYPERLINK \l _Toc26837 </w:instrText>
       </w:r>
       <w:r>
         <w:rPr>
@@ -542,7 +542,7 @@
         <w:fldChar w:fldCharType="begin"/>
       </w:r>
       <w:r>
-        <w:instrText xml:space="preserve"> PAGEREF _Toc27216 \h </w:instrText>
+        <w:instrText xml:space="preserve"> PAGEREF _Toc26837 \h </w:instrText>
       </w:r>
       <w:r>
         <w:fldChar w:fldCharType="separate"/>
@@ -579,7 +579,7 @@
         <w:rPr>
           <w:rFonts w:ascii="微软雅黑" w:hAnsi="微软雅黑" w:eastAsia="微软雅黑"/>
         </w:rPr>
-        <w:instrText xml:space="preserve"> HYPERLINK \l _Toc28087 </w:instrText>
+        <w:instrText xml:space="preserve"> HYPERLINK \l _Toc19424 </w:instrText>
       </w:r>
       <w:r>
         <w:rPr>
@@ -600,7 +600,7 @@
         <w:fldChar w:fldCharType="begin"/>
       </w:r>
       <w:r>
-        <w:instrText xml:space="preserve"> PAGEREF _Toc28087 \h </w:instrText>
+        <w:instrText xml:space="preserve"> PAGEREF _Toc19424 \h </w:instrText>
       </w:r>
       <w:r>
         <w:fldChar w:fldCharType="separate"/>
@@ -637,7 +637,7 @@
         <w:rPr>
           <w:rFonts w:ascii="微软雅黑" w:hAnsi="微软雅黑" w:eastAsia="微软雅黑"/>
         </w:rPr>
-        <w:instrText xml:space="preserve"> HYPERLINK \l _Toc26512 </w:instrText>
+        <w:instrText xml:space="preserve"> HYPERLINK \l _Toc21563 </w:instrText>
       </w:r>
       <w:r>
         <w:rPr>
@@ -658,7 +658,7 @@
         <w:fldChar w:fldCharType="begin"/>
       </w:r>
       <w:r>
-        <w:instrText xml:space="preserve"> PAGEREF _Toc26512 \h </w:instrText>
+        <w:instrText xml:space="preserve"> PAGEREF _Toc21563 \h </w:instrText>
       </w:r>
       <w:r>
         <w:fldChar w:fldCharType="separate"/>
@@ -695,7 +695,7 @@
         <w:rPr>
           <w:rFonts w:ascii="微软雅黑" w:hAnsi="微软雅黑" w:eastAsia="微软雅黑"/>
         </w:rPr>
-        <w:instrText xml:space="preserve"> HYPERLINK \l _Toc31112 </w:instrText>
+        <w:instrText xml:space="preserve"> HYPERLINK \l _Toc8487 </w:instrText>
       </w:r>
       <w:r>
         <w:rPr>
@@ -716,13 +716,13 @@
         <w:fldChar w:fldCharType="begin"/>
       </w:r>
       <w:r>
-        <w:instrText xml:space="preserve"> PAGEREF _Toc31112 \h </w:instrText>
+        <w:instrText xml:space="preserve"> PAGEREF _Toc8487 \h </w:instrText>
       </w:r>
       <w:r>
         <w:fldChar w:fldCharType="separate"/>
       </w:r>
       <w:r>
-        <w:t>34</w:t>
+        <w:t>35</w:t>
       </w:r>
       <w:r>
         <w:fldChar w:fldCharType="end"/>
@@ -753,7 +753,7 @@
         <w:rPr>
           <w:rFonts w:ascii="微软雅黑" w:hAnsi="微软雅黑" w:eastAsia="微软雅黑"/>
         </w:rPr>
-        <w:instrText xml:space="preserve"> HYPERLINK \l _Toc25095 </w:instrText>
+        <w:instrText xml:space="preserve"> HYPERLINK \l _Toc22812 </w:instrText>
       </w:r>
       <w:r>
         <w:rPr>
@@ -774,7 +774,7 @@
         <w:fldChar w:fldCharType="begin"/>
       </w:r>
       <w:r>
-        <w:instrText xml:space="preserve"> PAGEREF _Toc25095 \h </w:instrText>
+        <w:instrText xml:space="preserve"> PAGEREF _Toc22812 \h </w:instrText>
       </w:r>
       <w:r>
         <w:fldChar w:fldCharType="separate"/>
@@ -811,7 +811,7 @@
         <w:rPr>
           <w:rFonts w:ascii="微软雅黑" w:hAnsi="微软雅黑" w:eastAsia="微软雅黑"/>
         </w:rPr>
-        <w:instrText xml:space="preserve"> HYPERLINK \l _Toc13953 </w:instrText>
+        <w:instrText xml:space="preserve"> HYPERLINK \l _Toc8957 </w:instrText>
       </w:r>
       <w:r>
         <w:rPr>
@@ -832,65 +832,7 @@
         <w:fldChar w:fldCharType="begin"/>
       </w:r>
       <w:r>
-        <w:instrText xml:space="preserve"> PAGEREF _Toc13953 \h </w:instrText>
-      </w:r>
-      <w:r>
-        <w:fldChar w:fldCharType="separate"/>
-      </w:r>
-      <w:r>
-        <w:t>36</w:t>
-      </w:r>
-      <w:r>
-        <w:fldChar w:fldCharType="end"/>
-      </w:r>
-      <w:r>
-        <w:rPr>
-          <w:rFonts w:ascii="微软雅黑" w:hAnsi="微软雅黑" w:eastAsia="微软雅黑"/>
-          <w:color w:val="5A6370"/>
-        </w:rPr>
-        <w:fldChar w:fldCharType="end"/>
-      </w:r>
-    </w:p>
-    <w:p>
-      <w:pPr>
-        <w:pStyle w:val="28"/>
-        <w:tabs>
-          <w:tab w:val="right" w:leader="dot" w:pos="9638"/>
-        </w:tabs>
-      </w:pPr>
-      <w:r>
-        <w:rPr>
-          <w:rFonts w:ascii="微软雅黑" w:hAnsi="微软雅黑" w:eastAsia="微软雅黑"/>
-          <w:color w:val="5A6370"/>
-        </w:rPr>
-        <w:fldChar w:fldCharType="begin"/>
-      </w:r>
-      <w:r>
-        <w:rPr>
-          <w:rFonts w:ascii="微软雅黑" w:hAnsi="微软雅黑" w:eastAsia="微软雅黑"/>
-        </w:rPr>
-        <w:instrText xml:space="preserve"> HYPERLINK \l _Toc5025 </w:instrText>
-      </w:r>
-      <w:r>
-        <w:rPr>
-          <w:rFonts w:ascii="微软雅黑" w:hAnsi="微软雅黑" w:eastAsia="微软雅黑"/>
-        </w:rPr>
-        <w:fldChar w:fldCharType="separate"/>
-      </w:r>
-      <w:r>
-        <w:rPr>
-          <w:rFonts w:ascii="微软雅黑" w:hAnsi="微软雅黑" w:eastAsia="微软雅黑"/>
-        </w:rPr>
-        <w:t>12. 默认参数与已确认项</w:t>
-      </w:r>
-      <w:r>
-        <w:tab/>
-      </w:r>
-      <w:r>
-        <w:fldChar w:fldCharType="begin"/>
-      </w:r>
-      <w:r>
-        <w:instrText xml:space="preserve"> PAGEREF _Toc5025 \h </w:instrText>
+        <w:instrText xml:space="preserve"> PAGEREF _Toc8957 \h </w:instrText>
       </w:r>
       <w:r>
         <w:fldChar w:fldCharType="separate"/>
@@ -927,7 +869,7 @@
         <w:rPr>
           <w:rFonts w:ascii="微软雅黑" w:hAnsi="微软雅黑" w:eastAsia="微软雅黑"/>
         </w:rPr>
-        <w:instrText xml:space="preserve"> HYPERLINK \l _Toc8009 </w:instrText>
+        <w:instrText xml:space="preserve"> HYPERLINK \l _Toc17995 </w:instrText>
       </w:r>
       <w:r>
         <w:rPr>
@@ -939,7 +881,7 @@
         <w:rPr>
           <w:rFonts w:ascii="微软雅黑" w:hAnsi="微软雅黑" w:eastAsia="微软雅黑"/>
         </w:rPr>
-        <w:t>13. 需求追溯矩阵</w:t>
+        <w:t>12. 默认参数与已确认项</w:t>
       </w:r>
       <w:r>
         <w:tab/>
@@ -948,7 +890,7 @@
         <w:fldChar w:fldCharType="begin"/>
       </w:r>
       <w:r>
-        <w:instrText xml:space="preserve"> PAGEREF _Toc8009 \h </w:instrText>
+        <w:instrText xml:space="preserve"> PAGEREF _Toc17995 \h </w:instrText>
       </w:r>
       <w:r>
         <w:fldChar w:fldCharType="separate"/>
@@ -985,7 +927,7 @@
         <w:rPr>
           <w:rFonts w:ascii="微软雅黑" w:hAnsi="微软雅黑" w:eastAsia="微软雅黑"/>
         </w:rPr>
-        <w:instrText xml:space="preserve"> HYPERLINK \l _Toc15141 </w:instrText>
+        <w:instrText xml:space="preserve"> HYPERLINK \l _Toc5888 </w:instrText>
       </w:r>
       <w:r>
         <w:rPr>
@@ -997,7 +939,7 @@
         <w:rPr>
           <w:rFonts w:ascii="微软雅黑" w:hAnsi="微软雅黑" w:eastAsia="微软雅黑"/>
         </w:rPr>
-        <w:t>附录 A：交付物清单</w:t>
+        <w:t>13. 需求追溯矩阵</w:t>
       </w:r>
       <w:r>
         <w:tab/>
@@ -1006,13 +948,13 @@
         <w:fldChar w:fldCharType="begin"/>
       </w:r>
       <w:r>
-        <w:instrText xml:space="preserve"> PAGEREF _Toc15141 \h </w:instrText>
+        <w:instrText xml:space="preserve"> PAGEREF _Toc5888 \h </w:instrText>
       </w:r>
       <w:r>
         <w:fldChar w:fldCharType="separate"/>
       </w:r>
       <w:r>
-        <w:t>40</w:t>
+        <w:t>39</w:t>
       </w:r>
       <w:r>
         <w:fldChar w:fldCharType="end"/>
@@ -1043,7 +985,7 @@
         <w:rPr>
           <w:rFonts w:ascii="微软雅黑" w:hAnsi="微软雅黑" w:eastAsia="微软雅黑"/>
         </w:rPr>
-        <w:instrText xml:space="preserve"> HYPERLINK \l _Toc29509 </w:instrText>
+        <w:instrText xml:space="preserve"> HYPERLINK \l _Toc31927 </w:instrText>
       </w:r>
       <w:r>
         <w:rPr>
@@ -1055,7 +997,7 @@
         <w:rPr>
           <w:rFonts w:ascii="微软雅黑" w:hAnsi="微软雅黑" w:eastAsia="微软雅黑"/>
         </w:rPr>
-        <w:t>附录 B：安全与仓库操作约定</w:t>
+        <w:t>附录 A：交付物清单</w:t>
       </w:r>
       <w:r>
         <w:tab/>
@@ -1064,7 +1006,7 @@
         <w:fldChar w:fldCharType="begin"/>
       </w:r>
       <w:r>
-        <w:instrText xml:space="preserve"> PAGEREF _Toc29509 \h </w:instrText>
+        <w:instrText xml:space="preserve"> PAGEREF _Toc31927 \h </w:instrText>
       </w:r>
       <w:r>
         <w:fldChar w:fldCharType="separate"/>
@@ -1101,7 +1043,65 @@
         <w:rPr>
           <w:rFonts w:ascii="微软雅黑" w:hAnsi="微软雅黑" w:eastAsia="微软雅黑"/>
         </w:rPr>
-        <w:instrText xml:space="preserve"> HYPERLINK \l _Toc3900 </w:instrText>
+        <w:instrText xml:space="preserve"> HYPERLINK \l _Toc27904 </w:instrText>
+      </w:r>
+      <w:r>
+        <w:rPr>
+          <w:rFonts w:ascii="微软雅黑" w:hAnsi="微软雅黑" w:eastAsia="微软雅黑"/>
+        </w:rPr>
+        <w:fldChar w:fldCharType="separate"/>
+      </w:r>
+      <w:r>
+        <w:rPr>
+          <w:rFonts w:ascii="微软雅黑" w:hAnsi="微软雅黑" w:eastAsia="微软雅黑"/>
+        </w:rPr>
+        <w:t>附录 B：安全与仓库操作约定</w:t>
+      </w:r>
+      <w:r>
+        <w:tab/>
+      </w:r>
+      <w:r>
+        <w:fldChar w:fldCharType="begin"/>
+      </w:r>
+      <w:r>
+        <w:instrText xml:space="preserve"> PAGEREF _Toc27904 \h </w:instrText>
+      </w:r>
+      <w:r>
+        <w:fldChar w:fldCharType="separate"/>
+      </w:r>
+      <w:r>
+        <w:t>41</w:t>
+      </w:r>
+      <w:r>
+        <w:fldChar w:fldCharType="end"/>
+      </w:r>
+      <w:r>
+        <w:rPr>
+          <w:rFonts w:ascii="微软雅黑" w:hAnsi="微软雅黑" w:eastAsia="微软雅黑"/>
+          <w:color w:val="5A6370"/>
+        </w:rPr>
+        <w:fldChar w:fldCharType="end"/>
+      </w:r>
+    </w:p>
+    <w:p>
+      <w:pPr>
+        <w:pStyle w:val="28"/>
+        <w:tabs>
+          <w:tab w:val="right" w:leader="dot" w:pos="9638"/>
+        </w:tabs>
+      </w:pPr>
+      <w:r>
+        <w:rPr>
+          <w:rFonts w:ascii="微软雅黑" w:hAnsi="微软雅黑" w:eastAsia="微软雅黑"/>
+          <w:color w:val="5A6370"/>
+        </w:rPr>
+        <w:fldChar w:fldCharType="begin"/>
+      </w:r>
+      <w:r>
+        <w:rPr>
+          <w:rFonts w:ascii="微软雅黑" w:hAnsi="微软雅黑" w:eastAsia="微软雅黑"/>
+        </w:rPr>
+        <w:instrText xml:space="preserve"> HYPERLINK \l _Toc32007 </w:instrText>
       </w:r>
       <w:r>
         <w:rPr>
@@ -1122,13 +1122,13 @@
         <w:fldChar w:fldCharType="begin"/>
       </w:r>
       <w:r>
-        <w:instrText xml:space="preserve"> PAGEREF _Toc3900 \h </w:instrText>
+        <w:instrText xml:space="preserve"> PAGEREF _Toc32007 \h </w:instrText>
       </w:r>
       <w:r>
         <w:fldChar w:fldCharType="separate"/>
       </w:r>
       <w:r>
-        <w:t>41</w:t>
+        <w:t>42</w:t>
       </w:r>
       <w:r>
         <w:fldChar w:fldCharType="end"/>
@@ -1161,7 +1161,7 @@
         <w:keepNext/>
         <w:spacing w:before="240" w:after="100"/>
       </w:pPr>
-      <w:bookmarkStart w:id="0" w:name="_Toc26852"/>
+      <w:bookmarkStart w:id="0" w:name="_Toc291"/>
       <w:r>
         <w:rPr>
           <w:rFonts w:ascii="微软雅黑" w:hAnsi="微软雅黑" w:eastAsia="微软雅黑"/>
@@ -1434,7 +1434,7 @@
                 <w:color w:val="242A33"/>
                 <w:sz w:val="16"/>
               </w:rPr>
-              <w:t>v0.2.1</w:t>
+              <w:t>v0.2.2</w:t>
             </w:r>
           </w:p>
         </w:tc>
@@ -2067,7 +2067,7 @@
                 <w:color w:val="242A33"/>
                 <w:sz w:val="16"/>
               </w:rPr>
-              <w:t>v0.2.1</w:t>
+              <w:t>v0.2.2</w:t>
             </w:r>
           </w:p>
         </w:tc>
@@ -2086,7 +2086,7 @@
                 <w:color w:val="242A33"/>
                 <w:sz w:val="16"/>
               </w:rPr>
-              <w:t>2026-10-22</w:t>
+              <w:t>2026-10-23</w:t>
             </w:r>
           </w:p>
         </w:tc>
@@ -2105,7 +2105,7 @@
                 <w:color w:val="242A33"/>
                 <w:sz w:val="16"/>
               </w:rPr>
-              <w:t>docs(repo): add GitHub publication guide and ignore local agent state</w:t>
+              <w:t>fix(ci): correct frontend working-directory and document private protection limit</w:t>
             </w:r>
           </w:p>
         </w:tc>
@@ -2184,7 +2184,7 @@
                 <w:color w:val="242A33"/>
                 <w:sz w:val="16"/>
               </w:rPr>
-              <w:t>v0.2.0</w:t>
+              <w:t>v0.2.1</w:t>
             </w:r>
           </w:p>
         </w:tc>
@@ -2224,7 +2224,7 @@
                 <w:color w:val="242A33"/>
                 <w:sz w:val="16"/>
               </w:rPr>
-              <w:t>feat(scope): adopt Apache-2.0, Kafka-required stream, single-dev 40-48 week plan</w:t>
+              <w:t>docs(repo): add GitHub publication guide and ignore local agent state</w:t>
             </w:r>
           </w:p>
         </w:tc>
@@ -2304,7 +2304,7 @@
                 <w:color w:val="242A33"/>
                 <w:sz w:val="16"/>
               </w:rPr>
-              <w:t>v0.1.1</w:t>
+              <w:t>v0.2.0</w:t>
             </w:r>
           </w:p>
         </w:tc>
@@ -2342,7 +2342,7 @@
                 <w:color w:val="242A33"/>
                 <w:sz w:val="16"/>
               </w:rPr>
-              <w:t>fix(repo): sanitize public export paths and checks</w:t>
+              <w:t>feat(scope): adopt Apache-2.0, Kafka-required stream, single-dev 40-48 week plan</w:t>
             </w:r>
           </w:p>
         </w:tc>
@@ -2421,6 +2421,126 @@
                 <w:color w:val="242A33"/>
                 <w:sz w:val="16"/>
               </w:rPr>
+              <w:t>v0.1.1</w:t>
+            </w:r>
+          </w:p>
+        </w:tc>
+        <w:tc>
+          <w:tcPr>
+            <w:tcW w:w="1928" w:type="dxa"/>
+            <w:shd w:val="clear" w:color="auto" w:fill="F5F7FA"/>
+          </w:tcPr>
+          <w:p>
+            <w:pPr>
+              <w:spacing w:before="20" w:after="20"/>
+            </w:pPr>
+            <w:r>
+              <w:rPr>
+                <w:rFonts w:ascii="微软雅黑" w:hAnsi="微软雅黑" w:eastAsia="微软雅黑"/>
+                <w:b w:val="0"/>
+                <w:color w:val="242A33"/>
+                <w:sz w:val="16"/>
+              </w:rPr>
+              <w:t>2026-10-22</w:t>
+            </w:r>
+          </w:p>
+        </w:tc>
+        <w:tc>
+          <w:tcPr>
+            <w:tcW w:w="1928" w:type="dxa"/>
+            <w:shd w:val="clear" w:color="auto" w:fill="F5F7FA"/>
+          </w:tcPr>
+          <w:p>
+            <w:pPr>
+              <w:spacing w:before="20" w:after="20"/>
+            </w:pPr>
+            <w:r>
+              <w:rPr>
+                <w:rFonts w:ascii="微软雅黑" w:hAnsi="微软雅黑" w:eastAsia="微软雅黑"/>
+                <w:b w:val="0"/>
+                <w:color w:val="242A33"/>
+                <w:sz w:val="16"/>
+              </w:rPr>
+              <w:t>fix(repo): sanitize public export paths and checks</w:t>
+            </w:r>
+          </w:p>
+        </w:tc>
+        <w:tc>
+          <w:tcPr>
+            <w:tcW w:w="1928" w:type="dxa"/>
+            <w:shd w:val="clear" w:color="auto" w:fill="F5F7FA"/>
+          </w:tcPr>
+          <w:p>
+            <w:pPr>
+              <w:spacing w:before="20" w:after="20"/>
+            </w:pPr>
+            <w:r>
+              <w:rPr>
+                <w:rFonts w:ascii="微软雅黑" w:hAnsi="微软雅黑" w:eastAsia="微软雅黑"/>
+                <w:b w:val="0"/>
+                <w:color w:val="242A33"/>
+                <w:sz w:val="16"/>
+              </w:rPr>
+              <w:t>ADVP 项目组</w:t>
+            </w:r>
+          </w:p>
+        </w:tc>
+        <w:tc>
+          <w:tcPr>
+            <w:tcW w:w="1928" w:type="dxa"/>
+            <w:shd w:val="clear" w:color="auto" w:fill="F5F7FA"/>
+          </w:tcPr>
+          <w:p>
+            <w:pPr>
+              <w:spacing w:before="20" w:after="20"/>
+            </w:pPr>
+            <w:r>
+              <w:rPr>
+                <w:rFonts w:ascii="微软雅黑" w:hAnsi="微软雅黑" w:eastAsia="微软雅黑"/>
+                <w:b w:val="0"/>
+                <w:color w:val="242A33"/>
+                <w:sz w:val="16"/>
+              </w:rPr>
+              <w:t>待确认</w:t>
+            </w:r>
+          </w:p>
+        </w:tc>
+      </w:tr>
+      <w:tr>
+        <w:tblPrEx>
+          <w:tblBorders>
+            <w:top w:val="single" w:color="auto" w:sz="4" w:space="0"/>
+            <w:left w:val="single" w:color="auto" w:sz="4" w:space="0"/>
+            <w:bottom w:val="single" w:color="auto" w:sz="4" w:space="0"/>
+            <w:right w:val="single" w:color="auto" w:sz="4" w:space="0"/>
+            <w:insideH w:val="single" w:color="auto" w:sz="4" w:space="0"/>
+            <w:insideV w:val="single" w:color="auto" w:sz="4" w:space="0"/>
+          </w:tblBorders>
+          <w:tblCellMar>
+            <w:top w:w="40" w:type="dxa"/>
+            <w:left w:w="70" w:type="dxa"/>
+            <w:bottom w:w="40" w:type="dxa"/>
+            <w:right w:w="70" w:type="dxa"/>
+          </w:tblCellMar>
+        </w:tblPrEx>
+        <w:trPr>
+          <w:jc w:val="center"/>
+        </w:trPr>
+        <w:tc>
+          <w:tcPr>
+            <w:tcW w:w="1928" w:type="dxa"/>
+          </w:tcPr>
+          <w:p>
+            <w:pPr>
+              <w:spacing w:before="20" w:after="20"/>
+            </w:pPr>
+            <w:r>
+              <w:rPr>
+                <w:rFonts w:ascii="微软雅黑" w:hAnsi="微软雅黑" w:eastAsia="微软雅黑"/>
+                <w:b w:val="0"/>
+                <w:color w:val="242A33"/>
+                <w:sz w:val="16"/>
+              </w:rPr>
               <w:t>v0.1.0</w:t>
             </w:r>
           </w:p>
@@ -2428,7 +2548,6 @@
         <w:tc>
           <w:tcPr>
             <w:tcW w:w="1928" w:type="dxa"/>
-            <w:shd w:val="clear" w:color="auto" w:fill="F5F7FA"/>
           </w:tcPr>
           <w:p>
             <w:pPr>
@@ -2448,7 +2567,6 @@
         <w:tc>
           <w:tcPr>
             <w:tcW w:w="1928" w:type="dxa"/>
-            <w:shd w:val="clear" w:color="auto" w:fill="F5F7FA"/>
           </w:tcPr>
           <w:p>
             <w:pPr>
@@ -2468,7 +2586,6 @@
         <w:tc>
           <w:tcPr>
             <w:tcW w:w="1928" w:type="dxa"/>
-            <w:shd w:val="clear" w:color="auto" w:fill="F5F7FA"/>
           </w:tcPr>
           <w:p>
             <w:pPr>
@@ -2488,7 +2605,6 @@
         <w:tc>
           <w:tcPr>
             <w:tcW w:w="1928" w:type="dxa"/>
-            <w:shd w:val="clear" w:color="auto" w:fill="F5F7FA"/>
           </w:tcPr>
           <w:p>
             <w:pPr>
@@ -2850,7 +2966,7 @@
         <w:keepNext/>
         <w:spacing w:before="240" w:after="100"/>
       </w:pPr>
-      <w:bookmarkStart w:id="1" w:name="_Toc11553"/>
+      <w:bookmarkStart w:id="1" w:name="_Toc22486"/>
       <w:r>
         <w:rPr>
           <w:rFonts w:ascii="微软雅黑" w:hAnsi="微软雅黑" w:eastAsia="微软雅黑"/>
@@ -3329,6 +3445,12 @@
             <w:insideH w:val="single" w:color="auto" w:sz="4" w:space="0"/>
             <w:insideV w:val="single" w:color="auto" w:sz="4" w:space="0"/>
           </w:tblBorders>
+          <w:tblCellMar>
+            <w:top w:w="40" w:type="dxa"/>
+            <w:left w:w="70" w:type="dxa"/>
+            <w:bottom w:w="40" w:type="dxa"/>
+            <w:right w:w="70" w:type="dxa"/>
+          </w:tblCellMar>
         </w:tblPrEx>
         <w:trPr>
           <w:tblHeader/>
@@ -4417,7 +4539,7 @@
         <w:keepNext/>
         <w:spacing w:before="240" w:after="100"/>
       </w:pPr>
-      <w:bookmarkStart w:id="2" w:name="_Toc19455"/>
+      <w:bookmarkStart w:id="2" w:name="_Toc22102"/>
       <w:r>
         <w:rPr>
           <w:rFonts w:ascii="微软雅黑" w:hAnsi="微软雅黑" w:eastAsia="微软雅黑"/>
@@ -6923,7 +7045,7 @@
         <w:keepNext/>
         <w:spacing w:before="240" w:after="100"/>
       </w:pPr>
-      <w:bookmarkStart w:id="3" w:name="_Toc26581"/>
+      <w:bookmarkStart w:id="3" w:name="_Toc15098"/>
       <w:r>
         <w:rPr>
           <w:rFonts w:ascii="微软雅黑" w:hAnsi="微软雅黑" w:eastAsia="微软雅黑"/>
@@ -7006,6 +7128,12 @@
             <w:insideH w:val="single" w:color="auto" w:sz="4" w:space="0"/>
             <w:insideV w:val="single" w:color="auto" w:sz="4" w:space="0"/>
           </w:tblBorders>
+          <w:tblCellMar>
+            <w:top w:w="40" w:type="dxa"/>
+            <w:left w:w="70" w:type="dxa"/>
+            <w:bottom w:w="40" w:type="dxa"/>
+            <w:right w:w="70" w:type="dxa"/>
+          </w:tblCellMar>
         </w:tblPrEx>
         <w:trPr>
           <w:tblHeader/>
@@ -20485,6 +20613,12 @@
             <w:insideH w:val="single" w:color="auto" w:sz="4" w:space="0"/>
             <w:insideV w:val="single" w:color="auto" w:sz="4" w:space="0"/>
           </w:tblBorders>
+          <w:tblCellMar>
+            <w:top w:w="40" w:type="dxa"/>
+            <w:left w:w="70" w:type="dxa"/>
+            <w:bottom w:w="40" w:type="dxa"/>
+            <w:right w:w="70" w:type="dxa"/>
+          </w:tblCellMar>
         </w:tblPrEx>
         <w:trPr>
           <w:tblHeader/>
@@ -22491,7 +22625,7 @@
         <w:keepNext/>
         <w:spacing w:before="240" w:after="100"/>
       </w:pPr>
-      <w:bookmarkStart w:id="4" w:name="_Toc14705"/>
+      <w:bookmarkStart w:id="4" w:name="_Toc29907"/>
       <w:r>
         <w:rPr>
           <w:rFonts w:ascii="微软雅黑" w:hAnsi="微软雅黑" w:eastAsia="微软雅黑"/>
@@ -26394,7 +26528,7 @@
         <w:keepNext/>
         <w:spacing w:before="240" w:after="100"/>
       </w:pPr>
-      <w:bookmarkStart w:id="5" w:name="_Toc27126"/>
+      <w:bookmarkStart w:id="5" w:name="_Toc14191"/>
       <w:r>
         <w:rPr>
           <w:rFonts w:ascii="微软雅黑" w:hAnsi="微软雅黑" w:eastAsia="微软雅黑"/>
@@ -26452,14 +26586,6 @@
       </w:tblGrid>
       <w:tr>
         <w:tblPrEx>
-          <w:tblBorders>
-            <w:top w:val="single" w:color="auto" w:sz="4" w:space="0"/>
-            <w:left w:val="single" w:color="auto" w:sz="4" w:space="0"/>
-            <w:bottom w:val="single" w:color="auto" w:sz="4" w:space="0"/>
-            <w:right w:val="single" w:color="auto" w:sz="4" w:space="0"/>
-            <w:insideH w:val="single" w:color="auto" w:sz="4" w:space="0"/>
-            <w:insideV w:val="single" w:color="auto" w:sz="4" w:space="0"/>
-          </w:tblBorders>
           <w:tblCellMar>
             <w:top w:w="40" w:type="dxa"/>
             <w:left w:w="70" w:type="dxa"/>
@@ -28840,7 +28966,7 @@
         <w:keepNext/>
         <w:spacing w:before="240" w:after="100"/>
       </w:pPr>
-      <w:bookmarkStart w:id="6" w:name="_Toc27216"/>
+      <w:bookmarkStart w:id="6" w:name="_Toc26837"/>
       <w:r>
         <w:rPr>
           <w:rFonts w:ascii="微软雅黑" w:hAnsi="微软雅黑" w:eastAsia="微软雅黑"/>
@@ -29539,7 +29665,7 @@
         <w:keepNext/>
         <w:spacing w:before="240" w:after="100"/>
       </w:pPr>
-      <w:bookmarkStart w:id="7" w:name="_Toc28087"/>
+      <w:bookmarkStart w:id="7" w:name="_Toc19424"/>
       <w:r>
         <w:rPr>
           <w:rFonts w:ascii="微软雅黑" w:hAnsi="微软雅黑" w:eastAsia="微软雅黑"/>
@@ -31614,7 +31740,7 @@
         <w:keepNext/>
         <w:spacing w:before="240" w:after="100"/>
       </w:pPr>
-      <w:bookmarkStart w:id="8" w:name="_Toc26512"/>
+      <w:bookmarkStart w:id="8" w:name="_Toc21563"/>
       <w:r>
         <w:rPr>
           <w:rFonts w:ascii="微软雅黑" w:hAnsi="微软雅黑" w:eastAsia="微软雅黑"/>
@@ -32783,7 +32909,7 @@
         <w:keepNext/>
         <w:spacing w:before="240" w:after="100"/>
       </w:pPr>
-      <w:bookmarkStart w:id="9" w:name="_Toc31112"/>
+      <w:bookmarkStart w:id="9" w:name="_Toc8487"/>
       <w:r>
         <w:rPr>
           <w:rFonts w:ascii="微软雅黑" w:hAnsi="微软雅黑" w:eastAsia="微软雅黑"/>
@@ -33311,7 +33437,7 @@
         <w:keepNext/>
         <w:spacing w:before="240" w:after="100"/>
       </w:pPr>
-      <w:bookmarkStart w:id="10" w:name="_Toc25095"/>
+      <w:bookmarkStart w:id="10" w:name="_Toc22812"/>
       <w:r>
         <w:rPr>
           <w:rFonts w:ascii="微软雅黑" w:hAnsi="微软雅黑" w:eastAsia="微软雅黑"/>
@@ -34202,7 +34328,7 @@
         <w:keepNext/>
         <w:spacing w:before="240" w:after="100"/>
       </w:pPr>
-      <w:bookmarkStart w:id="11" w:name="_Toc13953"/>
+      <w:bookmarkStart w:id="11" w:name="_Toc8957"/>
       <w:r>
         <w:rPr>
           <w:rFonts w:ascii="微软雅黑" w:hAnsi="微软雅黑" w:eastAsia="微软雅黑"/>
@@ -35569,7 +35695,7 @@
         <w:keepNext/>
         <w:spacing w:before="240" w:after="100"/>
       </w:pPr>
-      <w:bookmarkStart w:id="12" w:name="_Toc5025"/>
+      <w:bookmarkStart w:id="12" w:name="_Toc17995"/>
       <w:r>
         <w:rPr>
           <w:rFonts w:ascii="微软雅黑" w:hAnsi="微软雅黑" w:eastAsia="微软雅黑"/>
@@ -37525,7 +37651,7 @@
         <w:keepNext/>
         <w:spacing w:before="240" w:after="100"/>
       </w:pPr>
-      <w:bookmarkStart w:id="13" w:name="_Toc8009"/>
+      <w:bookmarkStart w:id="13" w:name="_Toc5888"/>
       <w:r>
         <w:rPr>
           <w:rFonts w:ascii="微软雅黑" w:hAnsi="微软雅黑" w:eastAsia="微软雅黑"/>
@@ -40118,12 +40244,6 @@
             <w:insideH w:val="single" w:color="auto" w:sz="4" w:space="0"/>
             <w:insideV w:val="single" w:color="auto" w:sz="4" w:space="0"/>
           </w:tblBorders>
-          <w:tblCellMar>
-            <w:top w:w="40" w:type="dxa"/>
-            <w:left w:w="70" w:type="dxa"/>
-            <w:bottom w:w="40" w:type="dxa"/>
-            <w:right w:w="70" w:type="dxa"/>
-          </w:tblCellMar>
         </w:tblPrEx>
         <w:trPr>
           <w:jc w:val="center"/>
@@ -41163,7 +41283,7 @@
         <w:keepNext/>
         <w:spacing w:before="240" w:after="100"/>
       </w:pPr>
-      <w:bookmarkStart w:id="14" w:name="_Toc15141"/>
+      <w:bookmarkStart w:id="14" w:name="_Toc31927"/>
       <w:r>
         <w:rPr>
           <w:rFonts w:ascii="微软雅黑" w:hAnsi="微软雅黑" w:eastAsia="微软雅黑"/>
@@ -42387,7 +42507,7 @@
         <w:keepNext/>
         <w:spacing w:before="240" w:after="100"/>
       </w:pPr>
-      <w:bookmarkStart w:id="15" w:name="_Toc29509"/>
+      <w:bookmarkStart w:id="15" w:name="_Toc27904"/>
       <w:r>
         <w:rPr>
           <w:rFonts w:ascii="微软雅黑" w:hAnsi="微软雅黑" w:eastAsia="微软雅黑"/>
@@ -42580,7 +42700,7 @@
         <w:keepNext/>
         <w:spacing w:before="240" w:after="100"/>
       </w:pPr>
-      <w:bookmarkStart w:id="16" w:name="_Toc3900"/>
+      <w:bookmarkStart w:id="16" w:name="_Toc32007"/>
       <w:r>
         <w:rPr>
           <w:rFonts w:ascii="微软雅黑" w:hAnsi="微软雅黑" w:eastAsia="微软雅黑"/>
@@ -42831,7 +42951,7 @@
         <w:color w:val="7A8492"/>
         <w:sz w:val="16"/>
       </w:rPr>
-      <w:t xml:space="preserve"> 页    ADVP-SRS-001 · v0.2.1</w:t>
+      <w:t xml:space="preserve"> 页    ADVP-SRS-001 · v0.2.2</w:t>
     </w:r>
   </w:p>
 </w:ftr>
@@ -42905,7 +43025,7 @@
         <w:color w:val="7A8492"/>
         <w:sz w:val="17"/>
       </w:rPr>
-      <w:t>ADVP-SRS-001 · v0.2.1</w:t>
+      <w:t>ADVP-SRS-001 · v0.2.2</w:t>
     </w:r>
   </w:p>
 </w:hdr>
@@ -43109,29 +43229,29 @@
     <w:lsdException w:uiPriority="99" w:name="table of authorities"/>
     <w:lsdException w:uiPriority="99" w:semiHidden="0" w:name="macro"/>
     <w:lsdException w:uiPriority="99" w:name="toa heading"/>
-    <w:lsdException w:qFormat="1" w:uiPriority="99" w:semiHidden="0" w:name="List"/>
-    <w:lsdException w:qFormat="1" w:uiPriority="99" w:semiHidden="0" w:name="List Bullet"/>
-    <w:lsdException w:qFormat="1" w:uiPriority="99" w:semiHidden="0" w:name="List Number"/>
-    <w:lsdException w:qFormat="1" w:uiPriority="99" w:semiHidden="0" w:name="List 2"/>
-    <w:lsdException w:qFormat="1" w:uiPriority="99" w:semiHidden="0" w:name="List 3"/>
+    <w:lsdException w:uiPriority="99" w:semiHidden="0" w:name="List"/>
+    <w:lsdException w:uiPriority="99" w:semiHidden="0" w:name="List Bullet"/>
+    <w:lsdException w:uiPriority="99" w:semiHidden="0" w:name="List Number"/>
+    <w:lsdException w:uiPriority="99" w:semiHidden="0" w:name="List 2"/>
+    <w:lsdException w:uiPriority="99" w:semiHidden="0" w:name="List 3"/>
     <w:lsdException w:uiPriority="99" w:name="List 4"/>
     <w:lsdException w:uiPriority="99" w:name="List 5"/>
-    <w:lsdException w:qFormat="1" w:uiPriority="99" w:semiHidden="0" w:name="List Bullet 2"/>
-    <w:lsdException w:qFormat="1" w:uiPriority="99" w:semiHidden="0" w:name="List Bullet 3"/>
+    <w:lsdException w:uiPriority="99" w:semiHidden="0" w:name="List Bullet 2"/>
+    <w:lsdException w:uiPriority="99" w:semiHidden="0" w:name="List Bullet 3"/>
     <w:lsdException w:uiPriority="99" w:name="List Bullet 4"/>
     <w:lsdException w:uiPriority="99" w:name="List Bullet 5"/>
-    <w:lsdException w:qFormat="1" w:uiPriority="99" w:semiHidden="0" w:name="List Number 2"/>
-    <w:lsdException w:qFormat="1" w:uiPriority="99" w:semiHidden="0" w:name="List Number 3"/>
+    <w:lsdException w:uiPriority="99" w:semiHidden="0" w:name="List Number 2"/>
+    <w:lsdException w:uiPriority="99" w:semiHidden="0" w:name="List Number 3"/>
     <w:lsdException w:uiPriority="99" w:name="List Number 4"/>
     <w:lsdException w:uiPriority="99" w:name="List Number 5"/>
     <w:lsdException w:qFormat="1" w:unhideWhenUsed="0" w:uiPriority="10" w:semiHidden="0" w:name="Title"/>
     <w:lsdException w:uiPriority="99" w:name="Closing"/>
     <w:lsdException w:uiPriority="99" w:name="Signature"/>
     <w:lsdException w:uiPriority="1" w:name="Default Paragraph Font"/>
-    <w:lsdException w:qFormat="1" w:uiPriority="99" w:semiHidden="0" w:name="Body Text"/>
+    <w:lsdException w:uiPriority="99" w:semiHidden="0" w:name="Body Text"/>
     <w:lsdException w:uiPriority="99" w:name="Body Text Indent"/>
-    <w:lsdException w:qFormat="1" w:uiPriority="99" w:semiHidden="0" w:name="List Continue"/>
-    <w:lsdException w:qFormat="1" w:uiPriority="99" w:semiHidden="0" w:name="List Continue 2"/>
+    <w:lsdException w:uiPriority="99" w:semiHidden="0" w:name="List Continue"/>
+    <w:lsdException w:uiPriority="99" w:semiHidden="0" w:name="List Continue 2"/>
     <w:lsdException w:uiPriority="99" w:semiHidden="0" w:name="List Continue 3"/>
     <w:lsdException w:uiPriority="99" w:name="List Continue 4"/>
     <w:lsdException w:uiPriority="99" w:name="List Continue 5"/>
@@ -43142,8 +43262,8 @@
     <w:lsdException w:uiPriority="99" w:name="Body Text First Indent"/>
     <w:lsdException w:uiPriority="99" w:name="Body Text First Indent 2"/>
     <w:lsdException w:uiPriority="99" w:name="Note Heading"/>
-    <w:lsdException w:qFormat="1" w:uiPriority="99" w:semiHidden="0" w:name="Body Text 2"/>
-    <w:lsdException w:qFormat="1" w:uiPriority="99" w:semiHidden="0" w:name="Body Text 3"/>
+    <w:lsdException w:uiPriority="99" w:semiHidden="0" w:name="Body Text 2"/>
+    <w:lsdException w:uiPriority="99" w:semiHidden="0" w:name="Body Text 3"/>
     <w:lsdException w:uiPriority="99" w:name="Body Text Indent 2"/>
     <w:lsdException w:uiPriority="99" w:name="Body Text Indent 3"/>
     <w:lsdException w:uiPriority="99" w:name="Block Text"/>
@@ -43165,7 +43285,7 @@
     <w:lsdException w:uiPriority="99" w:name="HTML Sample"/>
     <w:lsdException w:uiPriority="99" w:name="HTML Typewriter"/>
     <w:lsdException w:uiPriority="99" w:name="HTML Variable"/>
-    <w:lsdException w:qFormat="1" w:uiPriority="99" w:name="Normal Table"/>
+    <w:lsdException w:uiPriority="99" w:name="Normal Table"/>
     <w:lsdException w:uiPriority="99" w:name="annotation subject"/>
     <w:lsdException w:uiPriority="99" w:name="Table Simple 1"/>
     <w:lsdException w:uiPriority="99" w:name="Table Simple 2"/>
@@ -43297,7 +43417,7 @@
     <w:lsdException w:unhideWhenUsed="0" w:uiPriority="68" w:semiHidden="0" w:name="Medium Grid 2 Accent 5"/>
     <w:lsdException w:unhideWhenUsed="0" w:uiPriority="69" w:semiHidden="0" w:name="Medium Grid 3 Accent 5"/>
     <w:lsdException w:unhideWhenUsed="0" w:uiPriority="70" w:semiHidden="0" w:name="Dark List Accent 5"/>
-    <w:lsdException w:qFormat="1" w:unhideWhenUsed="0" w:uiPriority="71" w:semiHidden="0" w:name="Colorful Shading Accent 5"/>
+    <w:lsdException w:unhideWhenUsed="0" w:uiPriority="71" w:semiHidden="0" w:name="Colorful Shading Accent 5"/>
     <w:lsdException w:unhideWhenUsed="0" w:uiPriority="72" w:semiHidden="0" w:name="Colorful List Accent 5"/>
     <w:lsdException w:unhideWhenUsed="0" w:uiPriority="73" w:semiHidden="0" w:name="Colorful Grid Accent 5"/>
     <w:lsdException w:unhideWhenUsed="0" w:uiPriority="60" w:semiHidden="0" w:name="Light Shading Accent 6"/>
@@ -43562,7 +43682,6 @@
     <w:name w:val="Normal Table"/>
     <w:semiHidden/>
     <w:unhideWhenUsed/>
-    <w:qFormat/>
     <w:uiPriority w:val="99"/>
     <w:tblPr>
       <w:tblCellMar>
@@ -43601,7 +43720,6 @@
     <w:name w:val="List 3"/>
     <w:basedOn w:val="1"/>
     <w:unhideWhenUsed/>
-    <w:qFormat/>
     <w:uiPriority w:val="99"/>
     <w:pPr>
       <w:ind w:left="1080" w:hanging="360"/>
@@ -43612,7 +43730,6 @@
     <w:name w:val="List Number 2"/>
     <w:basedOn w:val="1"/>
     <w:unhideWhenUsed/>
-    <w:qFormat/>
     <w:uiPriority w:val="99"/>
     <w:pPr>
       <w:numPr>
@@ -43626,7 +43743,6 @@
     <w:name w:val="List Number"/>
     <w:basedOn w:val="1"/>
     <w:unhideWhenUsed/>
-    <w:qFormat/>
     <w:uiPriority w:val="99"/>
     <w:pPr>
       <w:numPr>
@@ -43664,7 +43780,6 @@
     <w:name w:val="List Bullet"/>
     <w:basedOn w:val="1"/>
     <w:unhideWhenUsed/>
-    <w:qFormat/>
     <w:uiPriority w:val="99"/>
     <w:pPr>
       <w:numPr>
@@ -43679,7 +43794,6 @@
     <w:basedOn w:val="1"/>
     <w:link w:val="147"/>
     <w:unhideWhenUsed/>
-    <w:qFormat/>
     <w:uiPriority w:val="99"/>
     <w:pPr>
       <w:spacing w:after="120"/>
@@ -43693,7 +43807,6 @@
     <w:name w:val="List Bullet 3"/>
     <w:basedOn w:val="1"/>
     <w:unhideWhenUsed/>
-    <w:qFormat/>
     <w:uiPriority w:val="99"/>
     <w:pPr>
       <w:numPr>
@@ -43708,7 +43821,6 @@
     <w:basedOn w:val="1"/>
     <w:link w:val="145"/>
     <w:unhideWhenUsed/>
-    <w:qFormat/>
     <w:uiPriority w:val="99"/>
     <w:pPr>
       <w:spacing w:after="120"/>
@@ -43718,7 +43830,6 @@
     <w:name w:val="List Number 3"/>
     <w:basedOn w:val="1"/>
     <w:unhideWhenUsed/>
-    <w:qFormat/>
     <w:uiPriority w:val="99"/>
     <w:pPr>
       <w:numPr>
@@ -43732,7 +43843,6 @@
     <w:name w:val="List 2"/>
     <w:basedOn w:val="1"/>
     <w:unhideWhenUsed/>
-    <w:qFormat/>
     <w:uiPriority w:val="99"/>
     <w:pPr>
       <w:ind w:left="720" w:hanging="360"/>
@@ -43743,7 +43853,6 @@
     <w:name w:val="List Continue"/>
     <w:basedOn w:val="1"/>
     <w:unhideWhenUsed/>
-    <w:qFormat/>
     <w:uiPriority w:val="99"/>
     <w:pPr>
       <w:spacing w:after="120"/>
@@ -43755,7 +43864,6 @@
     <w:name w:val="List Bullet 2"/>
     <w:basedOn w:val="1"/>
     <w:unhideWhenUsed/>
-    <w:qFormat/>
     <w:uiPriority w:val="99"/>
     <w:pPr>
       <w:numPr>
@@ -43819,7 +43927,6 @@
     <w:name w:val="List"/>
     <w:basedOn w:val="1"/>
     <w:unhideWhenUsed/>
-    <w:qFormat/>
     <w:uiPriority w:val="99"/>
     <w:pPr>
       <w:ind w:left="360" w:hanging="360"/>
@@ -43842,7 +43949,6 @@
     <w:basedOn w:val="1"/>
     <w:link w:val="146"/>
     <w:unhideWhenUsed/>
-    <w:qFormat/>
     <w:uiPriority w:val="99"/>
     <w:pPr>
       <w:spacing w:after="120" w:line="480" w:lineRule="auto"/>
@@ -43852,7 +43958,6 @@
     <w:name w:val="List Continue 2"/>
     <w:basedOn w:val="1"/>
     <w:unhideWhenUsed/>
-    <w:qFormat/>
     <w:uiPriority w:val="99"/>
     <w:pPr>
       <w:spacing w:after="120"/>
@@ -53713,7 +53818,6 @@
   <w:style w:type="table" w:styleId="117">
     <w:name w:val="Colorful Shading Accent 5"/>
     <w:basedOn w:val="33"/>
-    <w:qFormat/>
     <w:uiPriority w:val="71"/>
     <w:pPr>
       <w:spacing w:after="0" w:line="240" w:lineRule="auto"/>
@@ -55373,7 +55477,6 @@
     <w:name w:val="Heading 1 Char"/>
     <w:basedOn w:val="133"/>
     <w:link w:val="3"/>
-    <w:qFormat/>
     <w:uiPriority w:val="9"/>
     <w:rPr>
       <w:rFonts w:asciiTheme="majorHAnsi" w:hAnsiTheme="majorHAnsi" w:eastAsiaTheme="majorEastAsia" w:cstheme="majorBidi"/>
@@ -55388,7 +55491,6 @@
     <w:name w:val="Heading 2 Char"/>
     <w:basedOn w:val="133"/>
     <w:link w:val="4"/>
-    <w:qFormat/>
     <w:uiPriority w:val="9"/>
     <w:rPr>
       <w:rFonts w:asciiTheme="majorHAnsi" w:hAnsiTheme="majorHAnsi" w:eastAsiaTheme="majorEastAsia" w:cstheme="majorBidi"/>
@@ -55408,7 +55510,6 @@
     <w:name w:val="Heading 3 Char"/>
     <w:basedOn w:val="133"/>
     <w:link w:val="5"/>
-    <w:qFormat/>
     <w:uiPriority w:val="9"/>
     <w:rPr>
       <w:rFonts w:asciiTheme="majorHAnsi" w:hAnsiTheme="majorHAnsi" w:eastAsiaTheme="majorEastAsia" w:cstheme="majorBidi"/>
@@ -55440,7 +55541,6 @@
     <w:name w:val="Subtitle Char"/>
     <w:basedOn w:val="133"/>
     <w:link w:val="26"/>
-    <w:qFormat/>
     <w:uiPriority w:val="11"/>
     <w:rPr>
       <w:rFonts w:asciiTheme="majorHAnsi" w:hAnsiTheme="majorHAnsi" w:eastAsiaTheme="majorEastAsia" w:cstheme="majorBidi"/>
@@ -55471,21 +55571,18 @@
     <w:name w:val="Body Text Char"/>
     <w:basedOn w:val="133"/>
     <w:link w:val="19"/>
-    <w:qFormat/>
     <w:uiPriority w:val="99"/>
   </w:style>
   <w:style w:type="character" w:customStyle="1" w:styleId="146">
     <w:name w:val="Body Text 2 Char"/>
     <w:basedOn w:val="133"/>
     <w:link w:val="29"/>
-    <w:qFormat/>
     <w:uiPriority w:val="99"/>
   </w:style>
   <w:style w:type="character" w:customStyle="1" w:styleId="147">
     <w:name w:val="Body Text 3 Char"/>
     <w:basedOn w:val="133"/>
     <w:link w:val="17"/>
-    <w:qFormat/>
     <w:uiPriority w:val="99"/>
     <w:rPr>
       <w:sz w:val="16"/>

</xml_diff>

<commit_message>
chore(release): public snapshot v0.2.3
</commit_message>
<xml_diff>
--- a/docs/需求说明书.docx
+++ b/docs/需求说明书.docx
@@ -69,7 +69,7 @@
           <w:color w:val="5A6370"/>
           <w:sz w:val="20"/>
         </w:rPr>
-        <w:t>文档编号  ADVP-SRS-001        版本  v0.2.2</w:t>
+        <w:t>文档编号  ADVP-SRS-001        版本  v0.2.3</w:t>
       </w:r>
     </w:p>
     <w:p>
@@ -173,7 +173,7 @@
         <w:rPr>
           <w:rFonts w:ascii="微软雅黑" w:hAnsi="微软雅黑" w:eastAsia="微软雅黑"/>
         </w:rPr>
-        <w:instrText xml:space="preserve"> HYPERLINK \l _Toc291 </w:instrText>
+        <w:instrText xml:space="preserve"> HYPERLINK \l _Toc8275 </w:instrText>
       </w:r>
       <w:r>
         <w:rPr>
@@ -194,7 +194,7 @@
         <w:fldChar w:fldCharType="begin"/>
       </w:r>
       <w:r>
-        <w:instrText xml:space="preserve"> PAGEREF _Toc291 \h </w:instrText>
+        <w:instrText xml:space="preserve"> PAGEREF _Toc8275 \h </w:instrText>
       </w:r>
       <w:r>
         <w:fldChar w:fldCharType="separate"/>
@@ -231,7 +231,7 @@
         <w:rPr>
           <w:rFonts w:ascii="微软雅黑" w:hAnsi="微软雅黑" w:eastAsia="微软雅黑"/>
         </w:rPr>
-        <w:instrText xml:space="preserve"> HYPERLINK \l _Toc22486 </w:instrText>
+        <w:instrText xml:space="preserve"> HYPERLINK \l _Toc9524 </w:instrText>
       </w:r>
       <w:r>
         <w:rPr>
@@ -252,7 +252,7 @@
         <w:fldChar w:fldCharType="begin"/>
       </w:r>
       <w:r>
-        <w:instrText xml:space="preserve"> PAGEREF _Toc22486 \h </w:instrText>
+        <w:instrText xml:space="preserve"> PAGEREF _Toc9524 \h </w:instrText>
       </w:r>
       <w:r>
         <w:fldChar w:fldCharType="separate"/>
@@ -289,7 +289,7 @@
         <w:rPr>
           <w:rFonts w:ascii="微软雅黑" w:hAnsi="微软雅黑" w:eastAsia="微软雅黑"/>
         </w:rPr>
-        <w:instrText xml:space="preserve"> HYPERLINK \l _Toc22102 </w:instrText>
+        <w:instrText xml:space="preserve"> HYPERLINK \l _Toc24266 </w:instrText>
       </w:r>
       <w:r>
         <w:rPr>
@@ -310,7 +310,7 @@
         <w:fldChar w:fldCharType="begin"/>
       </w:r>
       <w:r>
-        <w:instrText xml:space="preserve"> PAGEREF _Toc22102 \h </w:instrText>
+        <w:instrText xml:space="preserve"> PAGEREF _Toc24266 \h </w:instrText>
       </w:r>
       <w:r>
         <w:fldChar w:fldCharType="separate"/>
@@ -347,7 +347,7 @@
         <w:rPr>
           <w:rFonts w:ascii="微软雅黑" w:hAnsi="微软雅黑" w:eastAsia="微软雅黑"/>
         </w:rPr>
-        <w:instrText xml:space="preserve"> HYPERLINK \l _Toc15098 </w:instrText>
+        <w:instrText xml:space="preserve"> HYPERLINK \l _Toc15373 </w:instrText>
       </w:r>
       <w:r>
         <w:rPr>
@@ -368,7 +368,7 @@
         <w:fldChar w:fldCharType="begin"/>
       </w:r>
       <w:r>
-        <w:instrText xml:space="preserve"> PAGEREF _Toc15098 \h </w:instrText>
+        <w:instrText xml:space="preserve"> PAGEREF _Toc15373 \h </w:instrText>
       </w:r>
       <w:r>
         <w:fldChar w:fldCharType="separate"/>
@@ -405,7 +405,7 @@
         <w:rPr>
           <w:rFonts w:ascii="微软雅黑" w:hAnsi="微软雅黑" w:eastAsia="微软雅黑"/>
         </w:rPr>
-        <w:instrText xml:space="preserve"> HYPERLINK \l _Toc29907 </w:instrText>
+        <w:instrText xml:space="preserve"> HYPERLINK \l _Toc7715 </w:instrText>
       </w:r>
       <w:r>
         <w:rPr>
@@ -426,7 +426,7 @@
         <w:fldChar w:fldCharType="begin"/>
       </w:r>
       <w:r>
-        <w:instrText xml:space="preserve"> PAGEREF _Toc29907 \h </w:instrText>
+        <w:instrText xml:space="preserve"> PAGEREF _Toc7715 \h </w:instrText>
       </w:r>
       <w:r>
         <w:fldChar w:fldCharType="separate"/>
@@ -463,7 +463,7 @@
         <w:rPr>
           <w:rFonts w:ascii="微软雅黑" w:hAnsi="微软雅黑" w:eastAsia="微软雅黑"/>
         </w:rPr>
-        <w:instrText xml:space="preserve"> HYPERLINK \l _Toc14191 </w:instrText>
+        <w:instrText xml:space="preserve"> HYPERLINK \l _Toc625 </w:instrText>
       </w:r>
       <w:r>
         <w:rPr>
@@ -484,7 +484,7 @@
         <w:fldChar w:fldCharType="begin"/>
       </w:r>
       <w:r>
-        <w:instrText xml:space="preserve"> PAGEREF _Toc14191 \h </w:instrText>
+        <w:instrText xml:space="preserve"> PAGEREF _Toc625 \h </w:instrText>
       </w:r>
       <w:r>
         <w:fldChar w:fldCharType="separate"/>
@@ -521,7 +521,7 @@
         <w:rPr>
           <w:rFonts w:ascii="微软雅黑" w:hAnsi="微软雅黑" w:eastAsia="微软雅黑"/>
         </w:rPr>
-        <w:instrText xml:space="preserve"> HYPERLINK \l _Toc26837 </w:instrText>
+        <w:instrText xml:space="preserve"> HYPERLINK \l _Toc3402 </w:instrText>
       </w:r>
       <w:r>
         <w:rPr>
@@ -542,7 +542,7 @@
         <w:fldChar w:fldCharType="begin"/>
       </w:r>
       <w:r>
-        <w:instrText xml:space="preserve"> PAGEREF _Toc26837 \h </w:instrText>
+        <w:instrText xml:space="preserve"> PAGEREF _Toc3402 \h </w:instrText>
       </w:r>
       <w:r>
         <w:fldChar w:fldCharType="separate"/>
@@ -579,7 +579,7 @@
         <w:rPr>
           <w:rFonts w:ascii="微软雅黑" w:hAnsi="微软雅黑" w:eastAsia="微软雅黑"/>
         </w:rPr>
-        <w:instrText xml:space="preserve"> HYPERLINK \l _Toc19424 </w:instrText>
+        <w:instrText xml:space="preserve"> HYPERLINK \l _Toc32550 </w:instrText>
       </w:r>
       <w:r>
         <w:rPr>
@@ -600,7 +600,7 @@
         <w:fldChar w:fldCharType="begin"/>
       </w:r>
       <w:r>
-        <w:instrText xml:space="preserve"> PAGEREF _Toc19424 \h </w:instrText>
+        <w:instrText xml:space="preserve"> PAGEREF _Toc32550 \h </w:instrText>
       </w:r>
       <w:r>
         <w:fldChar w:fldCharType="separate"/>
@@ -637,7 +637,7 @@
         <w:rPr>
           <w:rFonts w:ascii="微软雅黑" w:hAnsi="微软雅黑" w:eastAsia="微软雅黑"/>
         </w:rPr>
-        <w:instrText xml:space="preserve"> HYPERLINK \l _Toc21563 </w:instrText>
+        <w:instrText xml:space="preserve"> HYPERLINK \l _Toc1353 </w:instrText>
       </w:r>
       <w:r>
         <w:rPr>
@@ -658,7 +658,7 @@
         <w:fldChar w:fldCharType="begin"/>
       </w:r>
       <w:r>
-        <w:instrText xml:space="preserve"> PAGEREF _Toc21563 \h </w:instrText>
+        <w:instrText xml:space="preserve"> PAGEREF _Toc1353 \h </w:instrText>
       </w:r>
       <w:r>
         <w:fldChar w:fldCharType="separate"/>
@@ -695,7 +695,7 @@
         <w:rPr>
           <w:rFonts w:ascii="微软雅黑" w:hAnsi="微软雅黑" w:eastAsia="微软雅黑"/>
         </w:rPr>
-        <w:instrText xml:space="preserve"> HYPERLINK \l _Toc8487 </w:instrText>
+        <w:instrText xml:space="preserve"> HYPERLINK \l _Toc26346 </w:instrText>
       </w:r>
       <w:r>
         <w:rPr>
@@ -716,7 +716,7 @@
         <w:fldChar w:fldCharType="begin"/>
       </w:r>
       <w:r>
-        <w:instrText xml:space="preserve"> PAGEREF _Toc8487 \h </w:instrText>
+        <w:instrText xml:space="preserve"> PAGEREF _Toc26346 \h </w:instrText>
       </w:r>
       <w:r>
         <w:fldChar w:fldCharType="separate"/>
@@ -753,7 +753,7 @@
         <w:rPr>
           <w:rFonts w:ascii="微软雅黑" w:hAnsi="微软雅黑" w:eastAsia="微软雅黑"/>
         </w:rPr>
-        <w:instrText xml:space="preserve"> HYPERLINK \l _Toc22812 </w:instrText>
+        <w:instrText xml:space="preserve"> HYPERLINK \l _Toc4191 </w:instrText>
       </w:r>
       <w:r>
         <w:rPr>
@@ -774,7 +774,7 @@
         <w:fldChar w:fldCharType="begin"/>
       </w:r>
       <w:r>
-        <w:instrText xml:space="preserve"> PAGEREF _Toc22812 \h </w:instrText>
+        <w:instrText xml:space="preserve"> PAGEREF _Toc4191 \h </w:instrText>
       </w:r>
       <w:r>
         <w:fldChar w:fldCharType="separate"/>
@@ -811,7 +811,7 @@
         <w:rPr>
           <w:rFonts w:ascii="微软雅黑" w:hAnsi="微软雅黑" w:eastAsia="微软雅黑"/>
         </w:rPr>
-        <w:instrText xml:space="preserve"> HYPERLINK \l _Toc8957 </w:instrText>
+        <w:instrText xml:space="preserve"> HYPERLINK \l _Toc27046 </w:instrText>
       </w:r>
       <w:r>
         <w:rPr>
@@ -832,7 +832,7 @@
         <w:fldChar w:fldCharType="begin"/>
       </w:r>
       <w:r>
-        <w:instrText xml:space="preserve"> PAGEREF _Toc8957 \h </w:instrText>
+        <w:instrText xml:space="preserve"> PAGEREF _Toc27046 \h </w:instrText>
       </w:r>
       <w:r>
         <w:fldChar w:fldCharType="separate"/>
@@ -869,7 +869,7 @@
         <w:rPr>
           <w:rFonts w:ascii="微软雅黑" w:hAnsi="微软雅黑" w:eastAsia="微软雅黑"/>
         </w:rPr>
-        <w:instrText xml:space="preserve"> HYPERLINK \l _Toc17995 </w:instrText>
+        <w:instrText xml:space="preserve"> HYPERLINK \l _Toc23246 </w:instrText>
       </w:r>
       <w:r>
         <w:rPr>
@@ -890,7 +890,7 @@
         <w:fldChar w:fldCharType="begin"/>
       </w:r>
       <w:r>
-        <w:instrText xml:space="preserve"> PAGEREF _Toc17995 \h </w:instrText>
+        <w:instrText xml:space="preserve"> PAGEREF _Toc23246 \h </w:instrText>
       </w:r>
       <w:r>
         <w:fldChar w:fldCharType="separate"/>
@@ -927,7 +927,7 @@
         <w:rPr>
           <w:rFonts w:ascii="微软雅黑" w:hAnsi="微软雅黑" w:eastAsia="微软雅黑"/>
         </w:rPr>
-        <w:instrText xml:space="preserve"> HYPERLINK \l _Toc5888 </w:instrText>
+        <w:instrText xml:space="preserve"> HYPERLINK \l _Toc22162 </w:instrText>
       </w:r>
       <w:r>
         <w:rPr>
@@ -948,7 +948,7 @@
         <w:fldChar w:fldCharType="begin"/>
       </w:r>
       <w:r>
-        <w:instrText xml:space="preserve"> PAGEREF _Toc5888 \h </w:instrText>
+        <w:instrText xml:space="preserve"> PAGEREF _Toc22162 \h </w:instrText>
       </w:r>
       <w:r>
         <w:fldChar w:fldCharType="separate"/>
@@ -985,7 +985,7 @@
         <w:rPr>
           <w:rFonts w:ascii="微软雅黑" w:hAnsi="微软雅黑" w:eastAsia="微软雅黑"/>
         </w:rPr>
-        <w:instrText xml:space="preserve"> HYPERLINK \l _Toc31927 </w:instrText>
+        <w:instrText xml:space="preserve"> HYPERLINK \l _Toc25343 </w:instrText>
       </w:r>
       <w:r>
         <w:rPr>
@@ -1006,7 +1006,7 @@
         <w:fldChar w:fldCharType="begin"/>
       </w:r>
       <w:r>
-        <w:instrText xml:space="preserve"> PAGEREF _Toc31927 \h </w:instrText>
+        <w:instrText xml:space="preserve"> PAGEREF _Toc25343 \h </w:instrText>
       </w:r>
       <w:r>
         <w:fldChar w:fldCharType="separate"/>
@@ -1043,7 +1043,7 @@
         <w:rPr>
           <w:rFonts w:ascii="微软雅黑" w:hAnsi="微软雅黑" w:eastAsia="微软雅黑"/>
         </w:rPr>
-        <w:instrText xml:space="preserve"> HYPERLINK \l _Toc27904 </w:instrText>
+        <w:instrText xml:space="preserve"> HYPERLINK \l _Toc13882 </w:instrText>
       </w:r>
       <w:r>
         <w:rPr>
@@ -1064,7 +1064,7 @@
         <w:fldChar w:fldCharType="begin"/>
       </w:r>
       <w:r>
-        <w:instrText xml:space="preserve"> PAGEREF _Toc27904 \h </w:instrText>
+        <w:instrText xml:space="preserve"> PAGEREF _Toc13882 \h </w:instrText>
       </w:r>
       <w:r>
         <w:fldChar w:fldCharType="separate"/>
@@ -1101,7 +1101,7 @@
         <w:rPr>
           <w:rFonts w:ascii="微软雅黑" w:hAnsi="微软雅黑" w:eastAsia="微软雅黑"/>
         </w:rPr>
-        <w:instrText xml:space="preserve"> HYPERLINK \l _Toc32007 </w:instrText>
+        <w:instrText xml:space="preserve"> HYPERLINK \l _Toc11253 </w:instrText>
       </w:r>
       <w:r>
         <w:rPr>
@@ -1122,7 +1122,7 @@
         <w:fldChar w:fldCharType="begin"/>
       </w:r>
       <w:r>
-        <w:instrText xml:space="preserve"> PAGEREF _Toc32007 \h </w:instrText>
+        <w:instrText xml:space="preserve"> PAGEREF _Toc11253 \h </w:instrText>
       </w:r>
       <w:r>
         <w:fldChar w:fldCharType="separate"/>
@@ -1161,7 +1161,7 @@
         <w:keepNext/>
         <w:spacing w:before="240" w:after="100"/>
       </w:pPr>
-      <w:bookmarkStart w:id="0" w:name="_Toc291"/>
+      <w:bookmarkStart w:id="0" w:name="_Toc8275"/>
       <w:r>
         <w:rPr>
           <w:rFonts w:ascii="微软雅黑" w:hAnsi="微软雅黑" w:eastAsia="微软雅黑"/>
@@ -1434,7 +1434,7 @@
                 <w:color w:val="242A33"/>
                 <w:sz w:val="16"/>
               </w:rPr>
-              <w:t>v0.2.2</w:t>
+              <w:t>v0.2.3</w:t>
             </w:r>
           </w:p>
         </w:tc>
@@ -2067,7 +2067,7 @@
                 <w:color w:val="242A33"/>
                 <w:sz w:val="16"/>
               </w:rPr>
-              <w:t>v0.2.2</w:t>
+              <w:t>v0.2.3</w:t>
             </w:r>
           </w:p>
         </w:tc>
@@ -2105,7 +2105,7 @@
                 <w:color w:val="242A33"/>
                 <w:sz w:val="16"/>
               </w:rPr>
-              <w:t>fix(ci): correct frontend working-directory and document private protection limit</w:t>
+              <w:t>fix(ci): replace Windows-incompatible lychee action with local link checker</w:t>
             </w:r>
           </w:p>
         </w:tc>
@@ -2184,7 +2184,7 @@
                 <w:color w:val="242A33"/>
                 <w:sz w:val="16"/>
               </w:rPr>
-              <w:t>v0.2.1</w:t>
+              <w:t>v0.2.2</w:t>
             </w:r>
           </w:p>
         </w:tc>
@@ -2204,7 +2204,7 @@
                 <w:color w:val="242A33"/>
                 <w:sz w:val="16"/>
               </w:rPr>
-              <w:t>2026-10-22</w:t>
+              <w:t>2026-10-23</w:t>
             </w:r>
           </w:p>
         </w:tc>
@@ -2224,7 +2224,7 @@
                 <w:color w:val="242A33"/>
                 <w:sz w:val="16"/>
               </w:rPr>
-              <w:t>docs(repo): add GitHub publication guide and ignore local agent state</w:t>
+              <w:t>fix(ci): correct frontend working-directory and document private protection limit</w:t>
             </w:r>
           </w:p>
         </w:tc>
@@ -2304,7 +2304,7 @@
                 <w:color w:val="242A33"/>
                 <w:sz w:val="16"/>
               </w:rPr>
-              <w:t>v0.2.0</w:t>
+              <w:t>v0.2.1</w:t>
             </w:r>
           </w:p>
         </w:tc>
@@ -2342,7 +2342,7 @@
                 <w:color w:val="242A33"/>
                 <w:sz w:val="16"/>
               </w:rPr>
-              <w:t>feat(scope): adopt Apache-2.0, Kafka-required stream, single-dev 40-48 week plan</w:t>
+              <w:t>docs(repo): add GitHub publication guide and ignore local agent state</w:t>
             </w:r>
           </w:p>
         </w:tc>
@@ -2421,7 +2421,7 @@
                 <w:color w:val="242A33"/>
                 <w:sz w:val="16"/>
               </w:rPr>
-              <w:t>v0.1.1</w:t>
+              <w:t>v0.2.0</w:t>
             </w:r>
           </w:p>
         </w:tc>
@@ -2461,7 +2461,7 @@
                 <w:color w:val="242A33"/>
                 <w:sz w:val="16"/>
               </w:rPr>
-              <w:t>fix(repo): sanitize public export paths and checks</w:t>
+              <w:t>feat(scope): adopt Apache-2.0, Kafka-required stream, single-dev 40-48 week plan</w:t>
             </w:r>
           </w:p>
         </w:tc>
@@ -2541,6 +2541,123 @@
                 <w:color w:val="242A33"/>
                 <w:sz w:val="16"/>
               </w:rPr>
+              <w:t>v0.1.1</w:t>
+            </w:r>
+          </w:p>
+        </w:tc>
+        <w:tc>
+          <w:tcPr>
+            <w:tcW w:w="1928" w:type="dxa"/>
+          </w:tcPr>
+          <w:p>
+            <w:pPr>
+              <w:spacing w:before="20" w:after="20"/>
+            </w:pPr>
+            <w:r>
+              <w:rPr>
+                <w:rFonts w:ascii="微软雅黑" w:hAnsi="微软雅黑" w:eastAsia="微软雅黑"/>
+                <w:b w:val="0"/>
+                <w:color w:val="242A33"/>
+                <w:sz w:val="16"/>
+              </w:rPr>
+              <w:t>2026-10-22</w:t>
+            </w:r>
+          </w:p>
+        </w:tc>
+        <w:tc>
+          <w:tcPr>
+            <w:tcW w:w="1928" w:type="dxa"/>
+          </w:tcPr>
+          <w:p>
+            <w:pPr>
+              <w:spacing w:before="20" w:after="20"/>
+            </w:pPr>
+            <w:r>
+              <w:rPr>
+                <w:rFonts w:ascii="微软雅黑" w:hAnsi="微软雅黑" w:eastAsia="微软雅黑"/>
+                <w:b w:val="0"/>
+                <w:color w:val="242A33"/>
+                <w:sz w:val="16"/>
+              </w:rPr>
+              <w:t>fix(repo): sanitize public export paths and checks</w:t>
+            </w:r>
+          </w:p>
+        </w:tc>
+        <w:tc>
+          <w:tcPr>
+            <w:tcW w:w="1928" w:type="dxa"/>
+          </w:tcPr>
+          <w:p>
+            <w:pPr>
+              <w:spacing w:before="20" w:after="20"/>
+            </w:pPr>
+            <w:r>
+              <w:rPr>
+                <w:rFonts w:ascii="微软雅黑" w:hAnsi="微软雅黑" w:eastAsia="微软雅黑"/>
+                <w:b w:val="0"/>
+                <w:color w:val="242A33"/>
+                <w:sz w:val="16"/>
+              </w:rPr>
+              <w:t>ADVP 项目组</w:t>
+            </w:r>
+          </w:p>
+        </w:tc>
+        <w:tc>
+          <w:tcPr>
+            <w:tcW w:w="1928" w:type="dxa"/>
+          </w:tcPr>
+          <w:p>
+            <w:pPr>
+              <w:spacing w:before="20" w:after="20"/>
+            </w:pPr>
+            <w:r>
+              <w:rPr>
+                <w:rFonts w:ascii="微软雅黑" w:hAnsi="微软雅黑" w:eastAsia="微软雅黑"/>
+                <w:b w:val="0"/>
+                <w:color w:val="242A33"/>
+                <w:sz w:val="16"/>
+              </w:rPr>
+              <w:t>待确认</w:t>
+            </w:r>
+          </w:p>
+        </w:tc>
+      </w:tr>
+      <w:tr>
+        <w:tblPrEx>
+          <w:tblBorders>
+            <w:top w:val="single" w:color="auto" w:sz="4" w:space="0"/>
+            <w:left w:val="single" w:color="auto" w:sz="4" w:space="0"/>
+            <w:bottom w:val="single" w:color="auto" w:sz="4" w:space="0"/>
+            <w:right w:val="single" w:color="auto" w:sz="4" w:space="0"/>
+            <w:insideH w:val="single" w:color="auto" w:sz="4" w:space="0"/>
+            <w:insideV w:val="single" w:color="auto" w:sz="4" w:space="0"/>
+          </w:tblBorders>
+          <w:tblCellMar>
+            <w:top w:w="40" w:type="dxa"/>
+            <w:left w:w="70" w:type="dxa"/>
+            <w:bottom w:w="40" w:type="dxa"/>
+            <w:right w:w="70" w:type="dxa"/>
+          </w:tblCellMar>
+        </w:tblPrEx>
+        <w:trPr>
+          <w:jc w:val="center"/>
+        </w:trPr>
+        <w:tc>
+          <w:tcPr>
+            <w:tcW w:w="1928" w:type="dxa"/>
+            <w:shd w:val="clear" w:color="auto" w:fill="F5F7FA"/>
+          </w:tcPr>
+          <w:p>
+            <w:pPr>
+              <w:spacing w:before="20" w:after="20"/>
+            </w:pPr>
+            <w:r>
+              <w:rPr>
+                <w:rFonts w:ascii="微软雅黑" w:hAnsi="微软雅黑" w:eastAsia="微软雅黑"/>
+                <w:b w:val="0"/>
+                <w:color w:val="242A33"/>
+                <w:sz w:val="16"/>
+              </w:rPr>
               <w:t>v0.1.0</w:t>
             </w:r>
           </w:p>
@@ -2548,6 +2665,7 @@
         <w:tc>
           <w:tcPr>
             <w:tcW w:w="1928" w:type="dxa"/>
+            <w:shd w:val="clear" w:color="auto" w:fill="F5F7FA"/>
           </w:tcPr>
           <w:p>
             <w:pPr>
@@ -2567,6 +2685,7 @@
         <w:tc>
           <w:tcPr>
             <w:tcW w:w="1928" w:type="dxa"/>
+            <w:shd w:val="clear" w:color="auto" w:fill="F5F7FA"/>
           </w:tcPr>
           <w:p>
             <w:pPr>
@@ -2586,6 +2705,7 @@
         <w:tc>
           <w:tcPr>
             <w:tcW w:w="1928" w:type="dxa"/>
+            <w:shd w:val="clear" w:color="auto" w:fill="F5F7FA"/>
           </w:tcPr>
           <w:p>
             <w:pPr>
@@ -2605,6 +2725,7 @@
         <w:tc>
           <w:tcPr>
             <w:tcW w:w="1928" w:type="dxa"/>
+            <w:shd w:val="clear" w:color="auto" w:fill="F5F7FA"/>
           </w:tcPr>
           <w:p>
             <w:pPr>
@@ -2966,7 +3087,7 @@
         <w:keepNext/>
         <w:spacing w:before="240" w:after="100"/>
       </w:pPr>
-      <w:bookmarkStart w:id="1" w:name="_Toc22486"/>
+      <w:bookmarkStart w:id="1" w:name="_Toc9524"/>
       <w:r>
         <w:rPr>
           <w:rFonts w:ascii="微软雅黑" w:hAnsi="微软雅黑" w:eastAsia="微软雅黑"/>
@@ -3507,12 +3628,6 @@
             <w:insideH w:val="single" w:color="auto" w:sz="4" w:space="0"/>
             <w:insideV w:val="single" w:color="auto" w:sz="4" w:space="0"/>
           </w:tblBorders>
-          <w:tblCellMar>
-            <w:top w:w="40" w:type="dxa"/>
-            <w:left w:w="70" w:type="dxa"/>
-            <w:bottom w:w="40" w:type="dxa"/>
-            <w:right w:w="70" w:type="dxa"/>
-          </w:tblCellMar>
         </w:tblPrEx>
         <w:trPr>
           <w:jc w:val="center"/>
@@ -4539,7 +4654,7 @@
         <w:keepNext/>
         <w:spacing w:before="240" w:after="100"/>
       </w:pPr>
-      <w:bookmarkStart w:id="2" w:name="_Toc22102"/>
+      <w:bookmarkStart w:id="2" w:name="_Toc24266"/>
       <w:r>
         <w:rPr>
           <w:rFonts w:ascii="微软雅黑" w:hAnsi="微软雅黑" w:eastAsia="微软雅黑"/>
@@ -7045,7 +7160,7 @@
         <w:keepNext/>
         <w:spacing w:before="240" w:after="100"/>
       </w:pPr>
-      <w:bookmarkStart w:id="3" w:name="_Toc15098"/>
+      <w:bookmarkStart w:id="3" w:name="_Toc15373"/>
       <w:r>
         <w:rPr>
           <w:rFonts w:ascii="微软雅黑" w:hAnsi="微软雅黑" w:eastAsia="微软雅黑"/>
@@ -22219,12 +22334,6 @@
             <w:insideH w:val="single" w:color="auto" w:sz="4" w:space="0"/>
             <w:insideV w:val="single" w:color="auto" w:sz="4" w:space="0"/>
           </w:tblBorders>
-          <w:tblCellMar>
-            <w:top w:w="40" w:type="dxa"/>
-            <w:left w:w="70" w:type="dxa"/>
-            <w:bottom w:w="40" w:type="dxa"/>
-            <w:right w:w="70" w:type="dxa"/>
-          </w:tblCellMar>
         </w:tblPrEx>
         <w:trPr>
           <w:jc w:val="center"/>
@@ -22625,7 +22734,7 @@
         <w:keepNext/>
         <w:spacing w:before="240" w:after="100"/>
       </w:pPr>
-      <w:bookmarkStart w:id="4" w:name="_Toc29907"/>
+      <w:bookmarkStart w:id="4" w:name="_Toc7715"/>
       <w:r>
         <w:rPr>
           <w:rFonts w:ascii="微软雅黑" w:hAnsi="微软雅黑" w:eastAsia="微软雅黑"/>
@@ -24078,12 +24187,6 @@
             <w:insideH w:val="single" w:color="auto" w:sz="4" w:space="0"/>
             <w:insideV w:val="single" w:color="auto" w:sz="4" w:space="0"/>
           </w:tblBorders>
-          <w:tblCellMar>
-            <w:top w:w="40" w:type="dxa"/>
-            <w:left w:w="70" w:type="dxa"/>
-            <w:bottom w:w="40" w:type="dxa"/>
-            <w:right w:w="70" w:type="dxa"/>
-          </w:tblCellMar>
         </w:tblPrEx>
         <w:trPr>
           <w:tblHeader/>
@@ -26528,7 +26631,7 @@
         <w:keepNext/>
         <w:spacing w:before="240" w:after="100"/>
       </w:pPr>
-      <w:bookmarkStart w:id="5" w:name="_Toc14191"/>
+      <w:bookmarkStart w:id="5" w:name="_Toc625"/>
       <w:r>
         <w:rPr>
           <w:rFonts w:ascii="微软雅黑" w:hAnsi="微软雅黑" w:eastAsia="微软雅黑"/>
@@ -26586,6 +26689,14 @@
       </w:tblGrid>
       <w:tr>
         <w:tblPrEx>
+          <w:tblBorders>
+            <w:top w:val="single" w:color="auto" w:sz="4" w:space="0"/>
+            <w:left w:val="single" w:color="auto" w:sz="4" w:space="0"/>
+            <w:bottom w:val="single" w:color="auto" w:sz="4" w:space="0"/>
+            <w:right w:val="single" w:color="auto" w:sz="4" w:space="0"/>
+            <w:insideH w:val="single" w:color="auto" w:sz="4" w:space="0"/>
+            <w:insideV w:val="single" w:color="auto" w:sz="4" w:space="0"/>
+          </w:tblBorders>
           <w:tblCellMar>
             <w:top w:w="40" w:type="dxa"/>
             <w:left w:w="70" w:type="dxa"/>
@@ -28966,7 +29077,7 @@
         <w:keepNext/>
         <w:spacing w:before="240" w:after="100"/>
       </w:pPr>
-      <w:bookmarkStart w:id="6" w:name="_Toc26837"/>
+      <w:bookmarkStart w:id="6" w:name="_Toc3402"/>
       <w:r>
         <w:rPr>
           <w:rFonts w:ascii="微软雅黑" w:hAnsi="微软雅黑" w:eastAsia="微软雅黑"/>
@@ -29665,7 +29776,7 @@
         <w:keepNext/>
         <w:spacing w:before="240" w:after="100"/>
       </w:pPr>
-      <w:bookmarkStart w:id="7" w:name="_Toc19424"/>
+      <w:bookmarkStart w:id="7" w:name="_Toc32550"/>
       <w:r>
         <w:rPr>
           <w:rFonts w:ascii="微软雅黑" w:hAnsi="微软雅黑" w:eastAsia="微软雅黑"/>
@@ -31740,7 +31851,7 @@
         <w:keepNext/>
         <w:spacing w:before="240" w:after="100"/>
       </w:pPr>
-      <w:bookmarkStart w:id="8" w:name="_Toc21563"/>
+      <w:bookmarkStart w:id="8" w:name="_Toc1353"/>
       <w:r>
         <w:rPr>
           <w:rFonts w:ascii="微软雅黑" w:hAnsi="微软雅黑" w:eastAsia="微软雅黑"/>
@@ -32909,7 +33020,7 @@
         <w:keepNext/>
         <w:spacing w:before="240" w:after="100"/>
       </w:pPr>
-      <w:bookmarkStart w:id="9" w:name="_Toc8487"/>
+      <w:bookmarkStart w:id="9" w:name="_Toc26346"/>
       <w:r>
         <w:rPr>
           <w:rFonts w:ascii="微软雅黑" w:hAnsi="微软雅黑" w:eastAsia="微软雅黑"/>
@@ -33437,7 +33548,7 @@
         <w:keepNext/>
         <w:spacing w:before="240" w:after="100"/>
       </w:pPr>
-      <w:bookmarkStart w:id="10" w:name="_Toc22812"/>
+      <w:bookmarkStart w:id="10" w:name="_Toc4191"/>
       <w:r>
         <w:rPr>
           <w:rFonts w:ascii="微软雅黑" w:hAnsi="微软雅黑" w:eastAsia="微软雅黑"/>
@@ -34328,7 +34439,7 @@
         <w:keepNext/>
         <w:spacing w:before="240" w:after="100"/>
       </w:pPr>
-      <w:bookmarkStart w:id="11" w:name="_Toc8957"/>
+      <w:bookmarkStart w:id="11" w:name="_Toc27046"/>
       <w:r>
         <w:rPr>
           <w:rFonts w:ascii="微软雅黑" w:hAnsi="微软雅黑" w:eastAsia="微软雅黑"/>
@@ -35695,7 +35806,7 @@
         <w:keepNext/>
         <w:spacing w:before="240" w:after="100"/>
       </w:pPr>
-      <w:bookmarkStart w:id="12" w:name="_Toc17995"/>
+      <w:bookmarkStart w:id="12" w:name="_Toc23246"/>
       <w:r>
         <w:rPr>
           <w:rFonts w:ascii="微软雅黑" w:hAnsi="微软雅黑" w:eastAsia="微软雅黑"/>
@@ -37651,7 +37762,7 @@
         <w:keepNext/>
         <w:spacing w:before="240" w:after="100"/>
       </w:pPr>
-      <w:bookmarkStart w:id="13" w:name="_Toc5888"/>
+      <w:bookmarkStart w:id="13" w:name="_Toc22162"/>
       <w:r>
         <w:rPr>
           <w:rFonts w:ascii="微软雅黑" w:hAnsi="微软雅黑" w:eastAsia="微软雅黑"/>
@@ -40244,6 +40355,12 @@
             <w:insideH w:val="single" w:color="auto" w:sz="4" w:space="0"/>
             <w:insideV w:val="single" w:color="auto" w:sz="4" w:space="0"/>
           </w:tblBorders>
+          <w:tblCellMar>
+            <w:top w:w="40" w:type="dxa"/>
+            <w:left w:w="70" w:type="dxa"/>
+            <w:bottom w:w="40" w:type="dxa"/>
+            <w:right w:w="70" w:type="dxa"/>
+          </w:tblCellMar>
         </w:tblPrEx>
         <w:trPr>
           <w:jc w:val="center"/>
@@ -41283,7 +41400,7 @@
         <w:keepNext/>
         <w:spacing w:before="240" w:after="100"/>
       </w:pPr>
-      <w:bookmarkStart w:id="14" w:name="_Toc31927"/>
+      <w:bookmarkStart w:id="14" w:name="_Toc25343"/>
       <w:r>
         <w:rPr>
           <w:rFonts w:ascii="微软雅黑" w:hAnsi="微软雅黑" w:eastAsia="微软雅黑"/>
@@ -42507,7 +42624,7 @@
         <w:keepNext/>
         <w:spacing w:before="240" w:after="100"/>
       </w:pPr>
-      <w:bookmarkStart w:id="15" w:name="_Toc27904"/>
+      <w:bookmarkStart w:id="15" w:name="_Toc13882"/>
       <w:r>
         <w:rPr>
           <w:rFonts w:ascii="微软雅黑" w:hAnsi="微软雅黑" w:eastAsia="微软雅黑"/>
@@ -42700,7 +42817,7 @@
         <w:keepNext/>
         <w:spacing w:before="240" w:after="100"/>
       </w:pPr>
-      <w:bookmarkStart w:id="16" w:name="_Toc32007"/>
+      <w:bookmarkStart w:id="16" w:name="_Toc11253"/>
       <w:r>
         <w:rPr>
           <w:rFonts w:ascii="微软雅黑" w:hAnsi="微软雅黑" w:eastAsia="微软雅黑"/>
@@ -42951,7 +43068,7 @@
         <w:color w:val="7A8492"/>
         <w:sz w:val="16"/>
       </w:rPr>
-      <w:t xml:space="preserve"> 页    ADVP-SRS-001 · v0.2.2</w:t>
+      <w:t xml:space="preserve"> 页    ADVP-SRS-001 · v0.2.3</w:t>
     </w:r>
   </w:p>
 </w:ftr>
@@ -43025,7 +43142,7 @@
         <w:color w:val="7A8492"/>
         <w:sz w:val="17"/>
       </w:rPr>
-      <w:t>ADVP-SRS-001 · v0.2.2</w:t>
+      <w:t>ADVP-SRS-001 · v0.2.3</w:t>
     </w:r>
   </w:p>
 </w:hdr>
@@ -43339,7 +43456,7 @@
     <w:lsdException w:unhideWhenUsed="0" w:uiPriority="63" w:semiHidden="0" w:name="Medium Shading 1"/>
     <w:lsdException w:unhideWhenUsed="0" w:uiPriority="64" w:semiHidden="0" w:name="Medium Shading 2"/>
     <w:lsdException w:unhideWhenUsed="0" w:uiPriority="65" w:semiHidden="0" w:name="Medium List 1"/>
-    <w:lsdException w:unhideWhenUsed="0" w:uiPriority="66" w:semiHidden="0" w:name="Medium List 2"/>
+    <w:lsdException w:qFormat="1" w:unhideWhenUsed="0" w:uiPriority="66" w:semiHidden="0" w:name="Medium List 2"/>
     <w:lsdException w:unhideWhenUsed="0" w:uiPriority="67" w:semiHidden="0" w:name="Medium Grid 1"/>
     <w:lsdException w:unhideWhenUsed="0" w:uiPriority="68" w:semiHidden="0" w:name="Medium Grid 2"/>
     <w:lsdException w:unhideWhenUsed="0" w:uiPriority="69" w:semiHidden="0" w:name="Medium Grid 3"/>
@@ -43348,7 +43465,7 @@
     <w:lsdException w:unhideWhenUsed="0" w:uiPriority="72" w:semiHidden="0" w:name="Colorful List"/>
     <w:lsdException w:unhideWhenUsed="0" w:uiPriority="73" w:semiHidden="0" w:name="Colorful Grid"/>
     <w:lsdException w:unhideWhenUsed="0" w:uiPriority="60" w:semiHidden="0" w:name="Light Shading Accent 1"/>
-    <w:lsdException w:unhideWhenUsed="0" w:uiPriority="61" w:semiHidden="0" w:name="Light List Accent 1"/>
+    <w:lsdException w:qFormat="1" w:unhideWhenUsed="0" w:uiPriority="61" w:semiHidden="0" w:name="Light List Accent 1"/>
     <w:lsdException w:unhideWhenUsed="0" w:uiPriority="62" w:semiHidden="0" w:name="Light Grid Accent 1"/>
     <w:lsdException w:unhideWhenUsed="0" w:uiPriority="63" w:semiHidden="0" w:name="Medium Shading 1 Accent 1"/>
     <w:lsdException w:unhideWhenUsed="0" w:uiPriority="64" w:semiHidden="0" w:name="Medium Shading 2 Accent 1"/>
@@ -43372,7 +43489,7 @@
     <w:lsdException w:unhideWhenUsed="0" w:uiPriority="65" w:semiHidden="0" w:name="Medium List 1 Accent 2"/>
     <w:lsdException w:unhideWhenUsed="0" w:uiPriority="66" w:semiHidden="0" w:name="Medium List 2 Accent 2"/>
     <w:lsdException w:unhideWhenUsed="0" w:uiPriority="67" w:semiHidden="0" w:name="Medium Grid 1 Accent 2"/>
-    <w:lsdException w:unhideWhenUsed="0" w:uiPriority="68" w:semiHidden="0" w:name="Medium Grid 2 Accent 2"/>
+    <w:lsdException w:qFormat="1" w:unhideWhenUsed="0" w:uiPriority="68" w:semiHidden="0" w:name="Medium Grid 2 Accent 2"/>
     <w:lsdException w:unhideWhenUsed="0" w:uiPriority="69" w:semiHidden="0" w:name="Medium Grid 3 Accent 2"/>
     <w:lsdException w:unhideWhenUsed="0" w:uiPriority="70" w:semiHidden="0" w:name="Dark List Accent 2"/>
     <w:lsdException w:unhideWhenUsed="0" w:uiPriority="71" w:semiHidden="0" w:name="Colorful Shading Accent 2"/>
@@ -43384,7 +43501,7 @@
     <w:lsdException w:unhideWhenUsed="0" w:uiPriority="63" w:semiHidden="0" w:name="Medium Shading 1 Accent 3"/>
     <w:lsdException w:unhideWhenUsed="0" w:uiPriority="64" w:semiHidden="0" w:name="Medium Shading 2 Accent 3"/>
     <w:lsdException w:unhideWhenUsed="0" w:uiPriority="65" w:semiHidden="0" w:name="Medium List 1 Accent 3"/>
-    <w:lsdException w:unhideWhenUsed="0" w:uiPriority="66" w:semiHidden="0" w:name="Medium List 2 Accent 3"/>
+    <w:lsdException w:qFormat="1" w:unhideWhenUsed="0" w:uiPriority="66" w:semiHidden="0" w:name="Medium List 2 Accent 3"/>
     <w:lsdException w:unhideWhenUsed="0" w:uiPriority="67" w:semiHidden="0" w:name="Medium Grid 1 Accent 3"/>
     <w:lsdException w:unhideWhenUsed="0" w:uiPriority="68" w:semiHidden="0" w:name="Medium Grid 2 Accent 3"/>
     <w:lsdException w:unhideWhenUsed="0" w:uiPriority="69" w:semiHidden="0" w:name="Medium Grid 3 Accent 3"/>
@@ -44812,6 +44929,7 @@
   <w:style w:type="table" w:styleId="43">
     <w:name w:val="Light List Accent 1"/>
     <w:basedOn w:val="33"/>
+    <w:qFormat/>
     <w:uiPriority w:val="61"/>
     <w:pPr>
       <w:spacing w:after="0" w:line="240" w:lineRule="auto"/>
@@ -48786,6 +48904,7 @@
   <w:style w:type="table" w:styleId="77">
     <w:name w:val="Medium List 2"/>
     <w:basedOn w:val="33"/>
+    <w:qFormat/>
     <w:uiPriority w:val="66"/>
     <w:pPr>
       <w:spacing w:after="0" w:line="240" w:lineRule="auto"/>
@@ -49173,6 +49292,7 @@
   <w:style w:type="table" w:styleId="80">
     <w:name w:val="Medium List 2 Accent 3"/>
     <w:basedOn w:val="33"/>
+    <w:qFormat/>
     <w:uiPriority w:val="66"/>
     <w:pPr>
       <w:spacing w:after="0" w:line="240" w:lineRule="auto"/>
@@ -50464,6 +50584,7 @@
   <w:style w:type="table" w:styleId="93">
     <w:name w:val="Medium Grid 2 Accent 2"/>
     <w:basedOn w:val="33"/>
+    <w:qFormat/>
     <w:uiPriority w:val="68"/>
     <w:pPr>
       <w:spacing w:after="0" w:line="240" w:lineRule="auto"/>

</xml_diff>

<commit_message>
chore(release): public snapshot v0.2.4
</commit_message>
<xml_diff>
--- a/docs/需求说明书.docx
+++ b/docs/需求说明书.docx
@@ -69,7 +69,7 @@
           <w:color w:val="5A6370"/>
           <w:sz w:val="20"/>
         </w:rPr>
-        <w:t>文档编号  ADVP-SRS-001        版本  v0.2.3</w:t>
+        <w:t>文档编号  ADVP-SRS-001        版本  v0.2.4</w:t>
       </w:r>
     </w:p>
     <w:p>
@@ -173,7 +173,7 @@
         <w:rPr>
           <w:rFonts w:ascii="微软雅黑" w:hAnsi="微软雅黑" w:eastAsia="微软雅黑"/>
         </w:rPr>
-        <w:instrText xml:space="preserve"> HYPERLINK \l _Toc8275 </w:instrText>
+        <w:instrText xml:space="preserve"> HYPERLINK \l _Toc29481 </w:instrText>
       </w:r>
       <w:r>
         <w:rPr>
@@ -194,7 +194,7 @@
         <w:fldChar w:fldCharType="begin"/>
       </w:r>
       <w:r>
-        <w:instrText xml:space="preserve"> PAGEREF _Toc8275 \h </w:instrText>
+        <w:instrText xml:space="preserve"> PAGEREF _Toc29481 \h </w:instrText>
       </w:r>
       <w:r>
         <w:fldChar w:fldCharType="separate"/>
@@ -231,7 +231,7 @@
         <w:rPr>
           <w:rFonts w:ascii="微软雅黑" w:hAnsi="微软雅黑" w:eastAsia="微软雅黑"/>
         </w:rPr>
-        <w:instrText xml:space="preserve"> HYPERLINK \l _Toc9524 </w:instrText>
+        <w:instrText xml:space="preserve"> HYPERLINK \l _Toc6066 </w:instrText>
       </w:r>
       <w:r>
         <w:rPr>
@@ -252,7 +252,7 @@
         <w:fldChar w:fldCharType="begin"/>
       </w:r>
       <w:r>
-        <w:instrText xml:space="preserve"> PAGEREF _Toc9524 \h </w:instrText>
+        <w:instrText xml:space="preserve"> PAGEREF _Toc6066 \h </w:instrText>
       </w:r>
       <w:r>
         <w:fldChar w:fldCharType="separate"/>
@@ -289,7 +289,7 @@
         <w:rPr>
           <w:rFonts w:ascii="微软雅黑" w:hAnsi="微软雅黑" w:eastAsia="微软雅黑"/>
         </w:rPr>
-        <w:instrText xml:space="preserve"> HYPERLINK \l _Toc24266 </w:instrText>
+        <w:instrText xml:space="preserve"> HYPERLINK \l _Toc24056 </w:instrText>
       </w:r>
       <w:r>
         <w:rPr>
@@ -310,7 +310,7 @@
         <w:fldChar w:fldCharType="begin"/>
       </w:r>
       <w:r>
-        <w:instrText xml:space="preserve"> PAGEREF _Toc24266 \h </w:instrText>
+        <w:instrText xml:space="preserve"> PAGEREF _Toc24056 \h </w:instrText>
       </w:r>
       <w:r>
         <w:fldChar w:fldCharType="separate"/>
@@ -347,7 +347,7 @@
         <w:rPr>
           <w:rFonts w:ascii="微软雅黑" w:hAnsi="微软雅黑" w:eastAsia="微软雅黑"/>
         </w:rPr>
-        <w:instrText xml:space="preserve"> HYPERLINK \l _Toc15373 </w:instrText>
+        <w:instrText xml:space="preserve"> HYPERLINK \l _Toc13173 </w:instrText>
       </w:r>
       <w:r>
         <w:rPr>
@@ -368,7 +368,7 @@
         <w:fldChar w:fldCharType="begin"/>
       </w:r>
       <w:r>
-        <w:instrText xml:space="preserve"> PAGEREF _Toc15373 \h </w:instrText>
+        <w:instrText xml:space="preserve"> PAGEREF _Toc13173 \h </w:instrText>
       </w:r>
       <w:r>
         <w:fldChar w:fldCharType="separate"/>
@@ -405,7 +405,7 @@
         <w:rPr>
           <w:rFonts w:ascii="微软雅黑" w:hAnsi="微软雅黑" w:eastAsia="微软雅黑"/>
         </w:rPr>
-        <w:instrText xml:space="preserve"> HYPERLINK \l _Toc7715 </w:instrText>
+        <w:instrText xml:space="preserve"> HYPERLINK \l _Toc11842 </w:instrText>
       </w:r>
       <w:r>
         <w:rPr>
@@ -426,7 +426,7 @@
         <w:fldChar w:fldCharType="begin"/>
       </w:r>
       <w:r>
-        <w:instrText xml:space="preserve"> PAGEREF _Toc7715 \h </w:instrText>
+        <w:instrText xml:space="preserve"> PAGEREF _Toc11842 \h </w:instrText>
       </w:r>
       <w:r>
         <w:fldChar w:fldCharType="separate"/>
@@ -463,7 +463,7 @@
         <w:rPr>
           <w:rFonts w:ascii="微软雅黑" w:hAnsi="微软雅黑" w:eastAsia="微软雅黑"/>
         </w:rPr>
-        <w:instrText xml:space="preserve"> HYPERLINK \l _Toc625 </w:instrText>
+        <w:instrText xml:space="preserve"> HYPERLINK \l _Toc12164 </w:instrText>
       </w:r>
       <w:r>
         <w:rPr>
@@ -484,7 +484,7 @@
         <w:fldChar w:fldCharType="begin"/>
       </w:r>
       <w:r>
-        <w:instrText xml:space="preserve"> PAGEREF _Toc625 \h </w:instrText>
+        <w:instrText xml:space="preserve"> PAGEREF _Toc12164 \h </w:instrText>
       </w:r>
       <w:r>
         <w:fldChar w:fldCharType="separate"/>
@@ -521,7 +521,7 @@
         <w:rPr>
           <w:rFonts w:ascii="微软雅黑" w:hAnsi="微软雅黑" w:eastAsia="微软雅黑"/>
         </w:rPr>
-        <w:instrText xml:space="preserve"> HYPERLINK \l _Toc3402 </w:instrText>
+        <w:instrText xml:space="preserve"> HYPERLINK \l _Toc27760 </w:instrText>
       </w:r>
       <w:r>
         <w:rPr>
@@ -542,7 +542,7 @@
         <w:fldChar w:fldCharType="begin"/>
       </w:r>
       <w:r>
-        <w:instrText xml:space="preserve"> PAGEREF _Toc3402 \h </w:instrText>
+        <w:instrText xml:space="preserve"> PAGEREF _Toc27760 \h </w:instrText>
       </w:r>
       <w:r>
         <w:fldChar w:fldCharType="separate"/>
@@ -579,7 +579,7 @@
         <w:rPr>
           <w:rFonts w:ascii="微软雅黑" w:hAnsi="微软雅黑" w:eastAsia="微软雅黑"/>
         </w:rPr>
-        <w:instrText xml:space="preserve"> HYPERLINK \l _Toc32550 </w:instrText>
+        <w:instrText xml:space="preserve"> HYPERLINK \l _Toc29314 </w:instrText>
       </w:r>
       <w:r>
         <w:rPr>
@@ -600,7 +600,7 @@
         <w:fldChar w:fldCharType="begin"/>
       </w:r>
       <w:r>
-        <w:instrText xml:space="preserve"> PAGEREF _Toc32550 \h </w:instrText>
+        <w:instrText xml:space="preserve"> PAGEREF _Toc29314 \h </w:instrText>
       </w:r>
       <w:r>
         <w:fldChar w:fldCharType="separate"/>
@@ -637,7 +637,7 @@
         <w:rPr>
           <w:rFonts w:ascii="微软雅黑" w:hAnsi="微软雅黑" w:eastAsia="微软雅黑"/>
         </w:rPr>
-        <w:instrText xml:space="preserve"> HYPERLINK \l _Toc1353 </w:instrText>
+        <w:instrText xml:space="preserve"> HYPERLINK \l _Toc27895 </w:instrText>
       </w:r>
       <w:r>
         <w:rPr>
@@ -658,7 +658,7 @@
         <w:fldChar w:fldCharType="begin"/>
       </w:r>
       <w:r>
-        <w:instrText xml:space="preserve"> PAGEREF _Toc1353 \h </w:instrText>
+        <w:instrText xml:space="preserve"> PAGEREF _Toc27895 \h </w:instrText>
       </w:r>
       <w:r>
         <w:fldChar w:fldCharType="separate"/>
@@ -695,7 +695,7 @@
         <w:rPr>
           <w:rFonts w:ascii="微软雅黑" w:hAnsi="微软雅黑" w:eastAsia="微软雅黑"/>
         </w:rPr>
-        <w:instrText xml:space="preserve"> HYPERLINK \l _Toc26346 </w:instrText>
+        <w:instrText xml:space="preserve"> HYPERLINK \l _Toc19977 </w:instrText>
       </w:r>
       <w:r>
         <w:rPr>
@@ -716,7 +716,7 @@
         <w:fldChar w:fldCharType="begin"/>
       </w:r>
       <w:r>
-        <w:instrText xml:space="preserve"> PAGEREF _Toc26346 \h </w:instrText>
+        <w:instrText xml:space="preserve"> PAGEREF _Toc19977 \h </w:instrText>
       </w:r>
       <w:r>
         <w:fldChar w:fldCharType="separate"/>
@@ -753,7 +753,7 @@
         <w:rPr>
           <w:rFonts w:ascii="微软雅黑" w:hAnsi="微软雅黑" w:eastAsia="微软雅黑"/>
         </w:rPr>
-        <w:instrText xml:space="preserve"> HYPERLINK \l _Toc4191 </w:instrText>
+        <w:instrText xml:space="preserve"> HYPERLINK \l _Toc5686 </w:instrText>
       </w:r>
       <w:r>
         <w:rPr>
@@ -774,7 +774,7 @@
         <w:fldChar w:fldCharType="begin"/>
       </w:r>
       <w:r>
-        <w:instrText xml:space="preserve"> PAGEREF _Toc4191 \h </w:instrText>
+        <w:instrText xml:space="preserve"> PAGEREF _Toc5686 \h </w:instrText>
       </w:r>
       <w:r>
         <w:fldChar w:fldCharType="separate"/>
@@ -811,7 +811,7 @@
         <w:rPr>
           <w:rFonts w:ascii="微软雅黑" w:hAnsi="微软雅黑" w:eastAsia="微软雅黑"/>
         </w:rPr>
-        <w:instrText xml:space="preserve"> HYPERLINK \l _Toc27046 </w:instrText>
+        <w:instrText xml:space="preserve"> HYPERLINK \l _Toc9593 </w:instrText>
       </w:r>
       <w:r>
         <w:rPr>
@@ -832,7 +832,7 @@
         <w:fldChar w:fldCharType="begin"/>
       </w:r>
       <w:r>
-        <w:instrText xml:space="preserve"> PAGEREF _Toc27046 \h </w:instrText>
+        <w:instrText xml:space="preserve"> PAGEREF _Toc9593 \h </w:instrText>
       </w:r>
       <w:r>
         <w:fldChar w:fldCharType="separate"/>
@@ -869,7 +869,7 @@
         <w:rPr>
           <w:rFonts w:ascii="微软雅黑" w:hAnsi="微软雅黑" w:eastAsia="微软雅黑"/>
         </w:rPr>
-        <w:instrText xml:space="preserve"> HYPERLINK \l _Toc23246 </w:instrText>
+        <w:instrText xml:space="preserve"> HYPERLINK \l _Toc637 </w:instrText>
       </w:r>
       <w:r>
         <w:rPr>
@@ -890,7 +890,7 @@
         <w:fldChar w:fldCharType="begin"/>
       </w:r>
       <w:r>
-        <w:instrText xml:space="preserve"> PAGEREF _Toc23246 \h </w:instrText>
+        <w:instrText xml:space="preserve"> PAGEREF _Toc637 \h </w:instrText>
       </w:r>
       <w:r>
         <w:fldChar w:fldCharType="separate"/>
@@ -927,7 +927,7 @@
         <w:rPr>
           <w:rFonts w:ascii="微软雅黑" w:hAnsi="微软雅黑" w:eastAsia="微软雅黑"/>
         </w:rPr>
-        <w:instrText xml:space="preserve"> HYPERLINK \l _Toc22162 </w:instrText>
+        <w:instrText xml:space="preserve"> HYPERLINK \l _Toc17522 </w:instrText>
       </w:r>
       <w:r>
         <w:rPr>
@@ -948,7 +948,7 @@
         <w:fldChar w:fldCharType="begin"/>
       </w:r>
       <w:r>
-        <w:instrText xml:space="preserve"> PAGEREF _Toc22162 \h </w:instrText>
+        <w:instrText xml:space="preserve"> PAGEREF _Toc17522 \h </w:instrText>
       </w:r>
       <w:r>
         <w:fldChar w:fldCharType="separate"/>
@@ -985,7 +985,7 @@
         <w:rPr>
           <w:rFonts w:ascii="微软雅黑" w:hAnsi="微软雅黑" w:eastAsia="微软雅黑"/>
         </w:rPr>
-        <w:instrText xml:space="preserve"> HYPERLINK \l _Toc25343 </w:instrText>
+        <w:instrText xml:space="preserve"> HYPERLINK \l _Toc18240 </w:instrText>
       </w:r>
       <w:r>
         <w:rPr>
@@ -1006,7 +1006,7 @@
         <w:fldChar w:fldCharType="begin"/>
       </w:r>
       <w:r>
-        <w:instrText xml:space="preserve"> PAGEREF _Toc25343 \h </w:instrText>
+        <w:instrText xml:space="preserve"> PAGEREF _Toc18240 \h </w:instrText>
       </w:r>
       <w:r>
         <w:fldChar w:fldCharType="separate"/>
@@ -1043,7 +1043,7 @@
         <w:rPr>
           <w:rFonts w:ascii="微软雅黑" w:hAnsi="微软雅黑" w:eastAsia="微软雅黑"/>
         </w:rPr>
-        <w:instrText xml:space="preserve"> HYPERLINK \l _Toc13882 </w:instrText>
+        <w:instrText xml:space="preserve"> HYPERLINK \l _Toc10689 </w:instrText>
       </w:r>
       <w:r>
         <w:rPr>
@@ -1064,7 +1064,7 @@
         <w:fldChar w:fldCharType="begin"/>
       </w:r>
       <w:r>
-        <w:instrText xml:space="preserve"> PAGEREF _Toc13882 \h </w:instrText>
+        <w:instrText xml:space="preserve"> PAGEREF _Toc10689 \h </w:instrText>
       </w:r>
       <w:r>
         <w:fldChar w:fldCharType="separate"/>
@@ -1101,7 +1101,7 @@
         <w:rPr>
           <w:rFonts w:ascii="微软雅黑" w:hAnsi="微软雅黑" w:eastAsia="微软雅黑"/>
         </w:rPr>
-        <w:instrText xml:space="preserve"> HYPERLINK \l _Toc11253 </w:instrText>
+        <w:instrText xml:space="preserve"> HYPERLINK \l _Toc12974 </w:instrText>
       </w:r>
       <w:r>
         <w:rPr>
@@ -1122,7 +1122,7 @@
         <w:fldChar w:fldCharType="begin"/>
       </w:r>
       <w:r>
-        <w:instrText xml:space="preserve"> PAGEREF _Toc11253 \h </w:instrText>
+        <w:instrText xml:space="preserve"> PAGEREF _Toc12974 \h </w:instrText>
       </w:r>
       <w:r>
         <w:fldChar w:fldCharType="separate"/>
@@ -1161,7 +1161,7 @@
         <w:keepNext/>
         <w:spacing w:before="240" w:after="100"/>
       </w:pPr>
-      <w:bookmarkStart w:id="0" w:name="_Toc8275"/>
+      <w:bookmarkStart w:id="0" w:name="_Toc29481"/>
       <w:r>
         <w:rPr>
           <w:rFonts w:ascii="微软雅黑" w:hAnsi="微软雅黑" w:eastAsia="微软雅黑"/>
@@ -1434,7 +1434,7 @@
                 <w:color w:val="242A33"/>
                 <w:sz w:val="16"/>
               </w:rPr>
-              <w:t>v0.2.3</w:t>
+              <w:t>v0.2.4</w:t>
             </w:r>
           </w:p>
         </w:tc>
@@ -2067,7 +2067,7 @@
                 <w:color w:val="242A33"/>
                 <w:sz w:val="16"/>
               </w:rPr>
-              <w:t>v0.2.3</w:t>
+              <w:t>v0.2.4</w:t>
             </w:r>
           </w:p>
         </w:tc>
@@ -2105,7 +2105,7 @@
                 <w:color w:val="242A33"/>
                 <w:sz w:val="16"/>
               </w:rPr>
-              <w:t>fix(ci): replace Windows-incompatible lychee action with local link checker</w:t>
+              <w:t>fix(ci): force UTF-8 Python output on Windows runners</w:t>
             </w:r>
           </w:p>
         </w:tc>
@@ -2184,7 +2184,7 @@
                 <w:color w:val="242A33"/>
                 <w:sz w:val="16"/>
               </w:rPr>
-              <w:t>v0.2.2</w:t>
+              <w:t>v0.2.3</w:t>
             </w:r>
           </w:p>
         </w:tc>
@@ -2224,7 +2224,7 @@
                 <w:color w:val="242A33"/>
                 <w:sz w:val="16"/>
               </w:rPr>
-              <w:t>fix(ci): correct frontend working-directory and document private protection limit</w:t>
+              <w:t>fix(ci): replace Windows-incompatible lychee action with local link checker</w:t>
             </w:r>
           </w:p>
         </w:tc>
@@ -2304,7 +2304,7 @@
                 <w:color w:val="242A33"/>
                 <w:sz w:val="16"/>
               </w:rPr>
-              <w:t>v0.2.1</w:t>
+              <w:t>v0.2.2</w:t>
             </w:r>
           </w:p>
         </w:tc>
@@ -2323,7 +2323,7 @@
                 <w:color w:val="242A33"/>
                 <w:sz w:val="16"/>
               </w:rPr>
-              <w:t>2026-10-22</w:t>
+              <w:t>2026-10-23</w:t>
             </w:r>
           </w:p>
         </w:tc>
@@ -2342,7 +2342,7 @@
                 <w:color w:val="242A33"/>
                 <w:sz w:val="16"/>
               </w:rPr>
-              <w:t>docs(repo): add GitHub publication guide and ignore local agent state</w:t>
+              <w:t>fix(ci): correct frontend working-directory and document private protection limit</w:t>
             </w:r>
           </w:p>
         </w:tc>
@@ -2421,7 +2421,7 @@
                 <w:color w:val="242A33"/>
                 <w:sz w:val="16"/>
               </w:rPr>
-              <w:t>v0.2.0</w:t>
+              <w:t>v0.2.1</w:t>
             </w:r>
           </w:p>
         </w:tc>
@@ -2461,7 +2461,7 @@
                 <w:color w:val="242A33"/>
                 <w:sz w:val="16"/>
               </w:rPr>
-              <w:t>feat(scope): adopt Apache-2.0, Kafka-required stream, single-dev 40-48 week plan</w:t>
+              <w:t>docs(repo): add GitHub publication guide and ignore local agent state</w:t>
             </w:r>
           </w:p>
         </w:tc>
@@ -2541,7 +2541,7 @@
                 <w:color w:val="242A33"/>
                 <w:sz w:val="16"/>
               </w:rPr>
-              <w:t>v0.1.1</w:t>
+              <w:t>v0.2.0</w:t>
             </w:r>
           </w:p>
         </w:tc>
@@ -2579,7 +2579,7 @@
                 <w:color w:val="242A33"/>
                 <w:sz w:val="16"/>
               </w:rPr>
-              <w:t>fix(repo): sanitize public export paths and checks</w:t>
+              <w:t>feat(scope): adopt Apache-2.0, Kafka-required stream, single-dev 40-48 week plan</w:t>
             </w:r>
           </w:p>
         </w:tc>
@@ -2658,6 +2658,126 @@
                 <w:color w:val="242A33"/>
                 <w:sz w:val="16"/>
               </w:rPr>
+              <w:t>v0.1.1</w:t>
+            </w:r>
+          </w:p>
+        </w:tc>
+        <w:tc>
+          <w:tcPr>
+            <w:tcW w:w="1928" w:type="dxa"/>
+            <w:shd w:val="clear" w:color="auto" w:fill="F5F7FA"/>
+          </w:tcPr>
+          <w:p>
+            <w:pPr>
+              <w:spacing w:before="20" w:after="20"/>
+            </w:pPr>
+            <w:r>
+              <w:rPr>
+                <w:rFonts w:ascii="微软雅黑" w:hAnsi="微软雅黑" w:eastAsia="微软雅黑"/>
+                <w:b w:val="0"/>
+                <w:color w:val="242A33"/>
+                <w:sz w:val="16"/>
+              </w:rPr>
+              <w:t>2026-10-22</w:t>
+            </w:r>
+          </w:p>
+        </w:tc>
+        <w:tc>
+          <w:tcPr>
+            <w:tcW w:w="1928" w:type="dxa"/>
+            <w:shd w:val="clear" w:color="auto" w:fill="F5F7FA"/>
+          </w:tcPr>
+          <w:p>
+            <w:pPr>
+              <w:spacing w:before="20" w:after="20"/>
+            </w:pPr>
+            <w:r>
+              <w:rPr>
+                <w:rFonts w:ascii="微软雅黑" w:hAnsi="微软雅黑" w:eastAsia="微软雅黑"/>
+                <w:b w:val="0"/>
+                <w:color w:val="242A33"/>
+                <w:sz w:val="16"/>
+              </w:rPr>
+              <w:t>fix(repo): sanitize public export paths and checks</w:t>
+            </w:r>
+          </w:p>
+        </w:tc>
+        <w:tc>
+          <w:tcPr>
+            <w:tcW w:w="1928" w:type="dxa"/>
+            <w:shd w:val="clear" w:color="auto" w:fill="F5F7FA"/>
+          </w:tcPr>
+          <w:p>
+            <w:pPr>
+              <w:spacing w:before="20" w:after="20"/>
+            </w:pPr>
+            <w:r>
+              <w:rPr>
+                <w:rFonts w:ascii="微软雅黑" w:hAnsi="微软雅黑" w:eastAsia="微软雅黑"/>
+                <w:b w:val="0"/>
+                <w:color w:val="242A33"/>
+                <w:sz w:val="16"/>
+              </w:rPr>
+              <w:t>ADVP 项目组</w:t>
+            </w:r>
+          </w:p>
+        </w:tc>
+        <w:tc>
+          <w:tcPr>
+            <w:tcW w:w="1928" w:type="dxa"/>
+            <w:shd w:val="clear" w:color="auto" w:fill="F5F7FA"/>
+          </w:tcPr>
+          <w:p>
+            <w:pPr>
+              <w:spacing w:before="20" w:after="20"/>
+            </w:pPr>
+            <w:r>
+              <w:rPr>
+                <w:rFonts w:ascii="微软雅黑" w:hAnsi="微软雅黑" w:eastAsia="微软雅黑"/>
+                <w:b w:val="0"/>
+                <w:color w:val="242A33"/>
+                <w:sz w:val="16"/>
+              </w:rPr>
+              <w:t>待确认</w:t>
+            </w:r>
+          </w:p>
+        </w:tc>
+      </w:tr>
+      <w:tr>
+        <w:tblPrEx>
+          <w:tblBorders>
+            <w:top w:val="single" w:color="auto" w:sz="4" w:space="0"/>
+            <w:left w:val="single" w:color="auto" w:sz="4" w:space="0"/>
+            <w:bottom w:val="single" w:color="auto" w:sz="4" w:space="0"/>
+            <w:right w:val="single" w:color="auto" w:sz="4" w:space="0"/>
+            <w:insideH w:val="single" w:color="auto" w:sz="4" w:space="0"/>
+            <w:insideV w:val="single" w:color="auto" w:sz="4" w:space="0"/>
+          </w:tblBorders>
+          <w:tblCellMar>
+            <w:top w:w="40" w:type="dxa"/>
+            <w:left w:w="70" w:type="dxa"/>
+            <w:bottom w:w="40" w:type="dxa"/>
+            <w:right w:w="70" w:type="dxa"/>
+          </w:tblCellMar>
+        </w:tblPrEx>
+        <w:trPr>
+          <w:jc w:val="center"/>
+        </w:trPr>
+        <w:tc>
+          <w:tcPr>
+            <w:tcW w:w="1928" w:type="dxa"/>
+          </w:tcPr>
+          <w:p>
+            <w:pPr>
+              <w:spacing w:before="20" w:after="20"/>
+            </w:pPr>
+            <w:r>
+              <w:rPr>
+                <w:rFonts w:ascii="微软雅黑" w:hAnsi="微软雅黑" w:eastAsia="微软雅黑"/>
+                <w:b w:val="0"/>
+                <w:color w:val="242A33"/>
+                <w:sz w:val="16"/>
+              </w:rPr>
               <w:t>v0.1.0</w:t>
             </w:r>
           </w:p>
@@ -2665,7 +2785,6 @@
         <w:tc>
           <w:tcPr>
             <w:tcW w:w="1928" w:type="dxa"/>
-            <w:shd w:val="clear" w:color="auto" w:fill="F5F7FA"/>
           </w:tcPr>
           <w:p>
             <w:pPr>
@@ -2685,7 +2804,6 @@
         <w:tc>
           <w:tcPr>
             <w:tcW w:w="1928" w:type="dxa"/>
-            <w:shd w:val="clear" w:color="auto" w:fill="F5F7FA"/>
           </w:tcPr>
           <w:p>
             <w:pPr>
@@ -2705,7 +2823,6 @@
         <w:tc>
           <w:tcPr>
             <w:tcW w:w="1928" w:type="dxa"/>
-            <w:shd w:val="clear" w:color="auto" w:fill="F5F7FA"/>
           </w:tcPr>
           <w:p>
             <w:pPr>
@@ -2725,7 +2842,6 @@
         <w:tc>
           <w:tcPr>
             <w:tcW w:w="1928" w:type="dxa"/>
-            <w:shd w:val="clear" w:color="auto" w:fill="F5F7FA"/>
           </w:tcPr>
           <w:p>
             <w:pPr>
@@ -3087,7 +3203,7 @@
         <w:keepNext/>
         <w:spacing w:before="240" w:after="100"/>
       </w:pPr>
-      <w:bookmarkStart w:id="1" w:name="_Toc9524"/>
+      <w:bookmarkStart w:id="1" w:name="_Toc6066"/>
       <w:r>
         <w:rPr>
           <w:rFonts w:ascii="微软雅黑" w:hAnsi="微软雅黑" w:eastAsia="微软雅黑"/>
@@ -3628,6 +3744,12 @@
             <w:insideH w:val="single" w:color="auto" w:sz="4" w:space="0"/>
             <w:insideV w:val="single" w:color="auto" w:sz="4" w:space="0"/>
           </w:tblBorders>
+          <w:tblCellMar>
+            <w:top w:w="40" w:type="dxa"/>
+            <w:left w:w="70" w:type="dxa"/>
+            <w:bottom w:w="40" w:type="dxa"/>
+            <w:right w:w="70" w:type="dxa"/>
+          </w:tblCellMar>
         </w:tblPrEx>
         <w:trPr>
           <w:jc w:val="center"/>
@@ -4654,7 +4776,7 @@
         <w:keepNext/>
         <w:spacing w:before="240" w:after="100"/>
       </w:pPr>
-      <w:bookmarkStart w:id="2" w:name="_Toc24266"/>
+      <w:bookmarkStart w:id="2" w:name="_Toc24056"/>
       <w:r>
         <w:rPr>
           <w:rFonts w:ascii="微软雅黑" w:hAnsi="微软雅黑" w:eastAsia="微软雅黑"/>
@@ -7160,7 +7282,7 @@
         <w:keepNext/>
         <w:spacing w:before="240" w:after="100"/>
       </w:pPr>
-      <w:bookmarkStart w:id="3" w:name="_Toc15373"/>
+      <w:bookmarkStart w:id="3" w:name="_Toc13173"/>
       <w:r>
         <w:rPr>
           <w:rFonts w:ascii="微软雅黑" w:hAnsi="微软雅黑" w:eastAsia="微软雅黑"/>
@@ -21372,12 +21494,6 @@
             <w:insideH w:val="single" w:color="auto" w:sz="4" w:space="0"/>
             <w:insideV w:val="single" w:color="auto" w:sz="4" w:space="0"/>
           </w:tblBorders>
-          <w:tblCellMar>
-            <w:top w:w="40" w:type="dxa"/>
-            <w:left w:w="70" w:type="dxa"/>
-            <w:bottom w:w="40" w:type="dxa"/>
-            <w:right w:w="70" w:type="dxa"/>
-          </w:tblCellMar>
         </w:tblPrEx>
         <w:trPr>
           <w:tblHeader/>
@@ -22334,6 +22450,12 @@
             <w:insideH w:val="single" w:color="auto" w:sz="4" w:space="0"/>
             <w:insideV w:val="single" w:color="auto" w:sz="4" w:space="0"/>
           </w:tblBorders>
+          <w:tblCellMar>
+            <w:top w:w="40" w:type="dxa"/>
+            <w:left w:w="70" w:type="dxa"/>
+            <w:bottom w:w="40" w:type="dxa"/>
+            <w:right w:w="70" w:type="dxa"/>
+          </w:tblCellMar>
         </w:tblPrEx>
         <w:trPr>
           <w:jc w:val="center"/>
@@ -22734,7 +22856,7 @@
         <w:keepNext/>
         <w:spacing w:before="240" w:after="100"/>
       </w:pPr>
-      <w:bookmarkStart w:id="4" w:name="_Toc7715"/>
+      <w:bookmarkStart w:id="4" w:name="_Toc11842"/>
       <w:r>
         <w:rPr>
           <w:rFonts w:ascii="微软雅黑" w:hAnsi="微软雅黑" w:eastAsia="微软雅黑"/>
@@ -24187,6 +24309,12 @@
             <w:insideH w:val="single" w:color="auto" w:sz="4" w:space="0"/>
             <w:insideV w:val="single" w:color="auto" w:sz="4" w:space="0"/>
           </w:tblBorders>
+          <w:tblCellMar>
+            <w:top w:w="40" w:type="dxa"/>
+            <w:left w:w="70" w:type="dxa"/>
+            <w:bottom w:w="40" w:type="dxa"/>
+            <w:right w:w="70" w:type="dxa"/>
+          </w:tblCellMar>
         </w:tblPrEx>
         <w:trPr>
           <w:tblHeader/>
@@ -26631,7 +26759,7 @@
         <w:keepNext/>
         <w:spacing w:before="240" w:after="100"/>
       </w:pPr>
-      <w:bookmarkStart w:id="5" w:name="_Toc625"/>
+      <w:bookmarkStart w:id="5" w:name="_Toc12164"/>
       <w:r>
         <w:rPr>
           <w:rFonts w:ascii="微软雅黑" w:hAnsi="微软雅黑" w:eastAsia="微软雅黑"/>
@@ -29077,7 +29205,7 @@
         <w:keepNext/>
         <w:spacing w:before="240" w:after="100"/>
       </w:pPr>
-      <w:bookmarkStart w:id="6" w:name="_Toc3402"/>
+      <w:bookmarkStart w:id="6" w:name="_Toc27760"/>
       <w:r>
         <w:rPr>
           <w:rFonts w:ascii="微软雅黑" w:hAnsi="微软雅黑" w:eastAsia="微软雅黑"/>
@@ -29776,7 +29904,7 @@
         <w:keepNext/>
         <w:spacing w:before="240" w:after="100"/>
       </w:pPr>
-      <w:bookmarkStart w:id="7" w:name="_Toc32550"/>
+      <w:bookmarkStart w:id="7" w:name="_Toc29314"/>
       <w:r>
         <w:rPr>
           <w:rFonts w:ascii="微软雅黑" w:hAnsi="微软雅黑" w:eastAsia="微软雅黑"/>
@@ -31851,7 +31979,7 @@
         <w:keepNext/>
         <w:spacing w:before="240" w:after="100"/>
       </w:pPr>
-      <w:bookmarkStart w:id="8" w:name="_Toc1353"/>
+      <w:bookmarkStart w:id="8" w:name="_Toc27895"/>
       <w:r>
         <w:rPr>
           <w:rFonts w:ascii="微软雅黑" w:hAnsi="微软雅黑" w:eastAsia="微软雅黑"/>
@@ -33020,7 +33148,7 @@
         <w:keepNext/>
         <w:spacing w:before="240" w:after="100"/>
       </w:pPr>
-      <w:bookmarkStart w:id="9" w:name="_Toc26346"/>
+      <w:bookmarkStart w:id="9" w:name="_Toc19977"/>
       <w:r>
         <w:rPr>
           <w:rFonts w:ascii="微软雅黑" w:hAnsi="微软雅黑" w:eastAsia="微软雅黑"/>
@@ -33548,7 +33676,7 @@
         <w:keepNext/>
         <w:spacing w:before="240" w:after="100"/>
       </w:pPr>
-      <w:bookmarkStart w:id="10" w:name="_Toc4191"/>
+      <w:bookmarkStart w:id="10" w:name="_Toc5686"/>
       <w:r>
         <w:rPr>
           <w:rFonts w:ascii="微软雅黑" w:hAnsi="微软雅黑" w:eastAsia="微软雅黑"/>
@@ -34439,7 +34567,7 @@
         <w:keepNext/>
         <w:spacing w:before="240" w:after="100"/>
       </w:pPr>
-      <w:bookmarkStart w:id="11" w:name="_Toc27046"/>
+      <w:bookmarkStart w:id="11" w:name="_Toc9593"/>
       <w:r>
         <w:rPr>
           <w:rFonts w:ascii="微软雅黑" w:hAnsi="微软雅黑" w:eastAsia="微软雅黑"/>
@@ -35806,7 +35934,7 @@
         <w:keepNext/>
         <w:spacing w:before="240" w:after="100"/>
       </w:pPr>
-      <w:bookmarkStart w:id="12" w:name="_Toc23246"/>
+      <w:bookmarkStart w:id="12" w:name="_Toc637"/>
       <w:r>
         <w:rPr>
           <w:rFonts w:ascii="微软雅黑" w:hAnsi="微软雅黑" w:eastAsia="微软雅黑"/>
@@ -37762,7 +37890,7 @@
         <w:keepNext/>
         <w:spacing w:before="240" w:after="100"/>
       </w:pPr>
-      <w:bookmarkStart w:id="13" w:name="_Toc22162"/>
+      <w:bookmarkStart w:id="13" w:name="_Toc17522"/>
       <w:r>
         <w:rPr>
           <w:rFonts w:ascii="微软雅黑" w:hAnsi="微软雅黑" w:eastAsia="微软雅黑"/>
@@ -41400,7 +41528,7 @@
         <w:keepNext/>
         <w:spacing w:before="240" w:after="100"/>
       </w:pPr>
-      <w:bookmarkStart w:id="14" w:name="_Toc25343"/>
+      <w:bookmarkStart w:id="14" w:name="_Toc18240"/>
       <w:r>
         <w:rPr>
           <w:rFonts w:ascii="微软雅黑" w:hAnsi="微软雅黑" w:eastAsia="微软雅黑"/>
@@ -42624,7 +42752,7 @@
         <w:keepNext/>
         <w:spacing w:before="240" w:after="100"/>
       </w:pPr>
-      <w:bookmarkStart w:id="15" w:name="_Toc13882"/>
+      <w:bookmarkStart w:id="15" w:name="_Toc10689"/>
       <w:r>
         <w:rPr>
           <w:rFonts w:ascii="微软雅黑" w:hAnsi="微软雅黑" w:eastAsia="微软雅黑"/>
@@ -42817,7 +42945,7 @@
         <w:keepNext/>
         <w:spacing w:before="240" w:after="100"/>
       </w:pPr>
-      <w:bookmarkStart w:id="16" w:name="_Toc11253"/>
+      <w:bookmarkStart w:id="16" w:name="_Toc12974"/>
       <w:r>
         <w:rPr>
           <w:rFonts w:ascii="微软雅黑" w:hAnsi="微软雅黑" w:eastAsia="微软雅黑"/>
@@ -43068,7 +43196,7 @@
         <w:color w:val="7A8492"/>
         <w:sz w:val="16"/>
       </w:rPr>
-      <w:t xml:space="preserve"> 页    ADVP-SRS-001 · v0.2.3</w:t>
+      <w:t xml:space="preserve"> 页    ADVP-SRS-001 · v0.2.4</w:t>
     </w:r>
   </w:p>
 </w:ftr>
@@ -43142,7 +43270,7 @@
         <w:color w:val="7A8492"/>
         <w:sz w:val="17"/>
       </w:rPr>
-      <w:t>ADVP-SRS-001 · v0.2.3</w:t>
+      <w:t>ADVP-SRS-001 · v0.2.4</w:t>
     </w:r>
   </w:p>
 </w:hdr>
@@ -43447,7 +43575,7 @@
     <w:lsdException w:uiPriority="99" w:name="Table Web 2"/>
     <w:lsdException w:uiPriority="99" w:name="Table Web 3"/>
     <w:lsdException w:uiPriority="99" w:name="Balloon Text"/>
-    <w:lsdException w:unhideWhenUsed="0" w:uiPriority="59" w:semiHidden="0" w:name="Table Grid"/>
+    <w:lsdException w:qFormat="1" w:unhideWhenUsed="0" w:uiPriority="59" w:semiHidden="0" w:name="Table Grid"/>
     <w:lsdException w:uiPriority="99" w:name="Table Theme"/>
     <w:lsdException w:qFormat="1" w:unhideWhenUsed="0" w:uiPriority="1" w:semiHidden="0" w:name="No Spacing"/>
     <w:lsdException w:unhideWhenUsed="0" w:uiPriority="60" w:semiHidden="0" w:name="Light Shading"/>
@@ -43456,7 +43584,7 @@
     <w:lsdException w:unhideWhenUsed="0" w:uiPriority="63" w:semiHidden="0" w:name="Medium Shading 1"/>
     <w:lsdException w:unhideWhenUsed="0" w:uiPriority="64" w:semiHidden="0" w:name="Medium Shading 2"/>
     <w:lsdException w:unhideWhenUsed="0" w:uiPriority="65" w:semiHidden="0" w:name="Medium List 1"/>
-    <w:lsdException w:qFormat="1" w:unhideWhenUsed="0" w:uiPriority="66" w:semiHidden="0" w:name="Medium List 2"/>
+    <w:lsdException w:unhideWhenUsed="0" w:uiPriority="66" w:semiHidden="0" w:name="Medium List 2"/>
     <w:lsdException w:unhideWhenUsed="0" w:uiPriority="67" w:semiHidden="0" w:name="Medium Grid 1"/>
     <w:lsdException w:unhideWhenUsed="0" w:uiPriority="68" w:semiHidden="0" w:name="Medium Grid 2"/>
     <w:lsdException w:unhideWhenUsed="0" w:uiPriority="69" w:semiHidden="0" w:name="Medium Grid 3"/>
@@ -43465,9 +43593,9 @@
     <w:lsdException w:unhideWhenUsed="0" w:uiPriority="72" w:semiHidden="0" w:name="Colorful List"/>
     <w:lsdException w:unhideWhenUsed="0" w:uiPriority="73" w:semiHidden="0" w:name="Colorful Grid"/>
     <w:lsdException w:unhideWhenUsed="0" w:uiPriority="60" w:semiHidden="0" w:name="Light Shading Accent 1"/>
-    <w:lsdException w:qFormat="1" w:unhideWhenUsed="0" w:uiPriority="61" w:semiHidden="0" w:name="Light List Accent 1"/>
+    <w:lsdException w:unhideWhenUsed="0" w:uiPriority="61" w:semiHidden="0" w:name="Light List Accent 1"/>
     <w:lsdException w:unhideWhenUsed="0" w:uiPriority="62" w:semiHidden="0" w:name="Light Grid Accent 1"/>
-    <w:lsdException w:unhideWhenUsed="0" w:uiPriority="63" w:semiHidden="0" w:name="Medium Shading 1 Accent 1"/>
+    <w:lsdException w:qFormat="1" w:unhideWhenUsed="0" w:uiPriority="63" w:semiHidden="0" w:name="Medium Shading 1 Accent 1"/>
     <w:lsdException w:unhideWhenUsed="0" w:uiPriority="64" w:semiHidden="0" w:name="Medium Shading 2 Accent 1"/>
     <w:lsdException w:unhideWhenUsed="0" w:uiPriority="65" w:semiHidden="0" w:name="Medium List 1 Accent 1"/>
     <w:lsdException w:qFormat="1" w:unhideWhenUsed="0" w:uiPriority="34" w:semiHidden="0" w:name="List Paragraph"/>
@@ -43489,7 +43617,7 @@
     <w:lsdException w:unhideWhenUsed="0" w:uiPriority="65" w:semiHidden="0" w:name="Medium List 1 Accent 2"/>
     <w:lsdException w:unhideWhenUsed="0" w:uiPriority="66" w:semiHidden="0" w:name="Medium List 2 Accent 2"/>
     <w:lsdException w:unhideWhenUsed="0" w:uiPriority="67" w:semiHidden="0" w:name="Medium Grid 1 Accent 2"/>
-    <w:lsdException w:qFormat="1" w:unhideWhenUsed="0" w:uiPriority="68" w:semiHidden="0" w:name="Medium Grid 2 Accent 2"/>
+    <w:lsdException w:unhideWhenUsed="0" w:uiPriority="68" w:semiHidden="0" w:name="Medium Grid 2 Accent 2"/>
     <w:lsdException w:unhideWhenUsed="0" w:uiPriority="69" w:semiHidden="0" w:name="Medium Grid 3 Accent 2"/>
     <w:lsdException w:unhideWhenUsed="0" w:uiPriority="70" w:semiHidden="0" w:name="Dark List Accent 2"/>
     <w:lsdException w:unhideWhenUsed="0" w:uiPriority="71" w:semiHidden="0" w:name="Colorful Shading Accent 2"/>
@@ -43501,7 +43629,7 @@
     <w:lsdException w:unhideWhenUsed="0" w:uiPriority="63" w:semiHidden="0" w:name="Medium Shading 1 Accent 3"/>
     <w:lsdException w:unhideWhenUsed="0" w:uiPriority="64" w:semiHidden="0" w:name="Medium Shading 2 Accent 3"/>
     <w:lsdException w:unhideWhenUsed="0" w:uiPriority="65" w:semiHidden="0" w:name="Medium List 1 Accent 3"/>
-    <w:lsdException w:qFormat="1" w:unhideWhenUsed="0" w:uiPriority="66" w:semiHidden="0" w:name="Medium List 2 Accent 3"/>
+    <w:lsdException w:unhideWhenUsed="0" w:uiPriority="66" w:semiHidden="0" w:name="Medium List 2 Accent 3"/>
     <w:lsdException w:unhideWhenUsed="0" w:uiPriority="67" w:semiHidden="0" w:name="Medium Grid 1 Accent 3"/>
     <w:lsdException w:unhideWhenUsed="0" w:uiPriority="68" w:semiHidden="0" w:name="Medium Grid 2 Accent 3"/>
     <w:lsdException w:unhideWhenUsed="0" w:uiPriority="69" w:semiHidden="0" w:name="Medium Grid 3 Accent 3"/>
@@ -44119,6 +44247,7 @@
   <w:style w:type="table" w:styleId="34">
     <w:name w:val="Table Grid"/>
     <w:basedOn w:val="33"/>
+    <w:qFormat/>
     <w:uiPriority w:val="59"/>
     <w:pPr>
       <w:spacing w:after="0" w:line="240" w:lineRule="auto"/>
@@ -44929,7 +45058,6 @@
   <w:style w:type="table" w:styleId="43">
     <w:name w:val="Light List Accent 1"/>
     <w:basedOn w:val="33"/>
-    <w:qFormat/>
     <w:uiPriority w:val="61"/>
     <w:pPr>
       <w:spacing w:after="0" w:line="240" w:lineRule="auto"/>
@@ -46477,6 +46605,7 @@
   <w:style w:type="table" w:styleId="57">
     <w:name w:val="Medium Shading 1 Accent 1"/>
     <w:basedOn w:val="33"/>
+    <w:qFormat/>
     <w:uiPriority w:val="63"/>
     <w:pPr>
       <w:spacing w:after="0" w:line="240" w:lineRule="auto"/>
@@ -48904,7 +49033,6 @@
   <w:style w:type="table" w:styleId="77">
     <w:name w:val="Medium List 2"/>
     <w:basedOn w:val="33"/>
-    <w:qFormat/>
     <w:uiPriority w:val="66"/>
     <w:pPr>
       <w:spacing w:after="0" w:line="240" w:lineRule="auto"/>
@@ -49292,7 +49420,6 @@
   <w:style w:type="table" w:styleId="80">
     <w:name w:val="Medium List 2 Accent 3"/>
     <w:basedOn w:val="33"/>
-    <w:qFormat/>
     <w:uiPriority w:val="66"/>
     <w:pPr>
       <w:spacing w:after="0" w:line="240" w:lineRule="auto"/>
@@ -50584,7 +50711,6 @@
   <w:style w:type="table" w:styleId="93">
     <w:name w:val="Medium Grid 2 Accent 2"/>
     <w:basedOn w:val="33"/>
-    <w:qFormat/>
     <w:uiPriority w:val="68"/>
     <w:pPr>
       <w:spacing w:after="0" w:line="240" w:lineRule="auto"/>
@@ -55714,6 +55840,7 @@
     <w:name w:val="Macro Text Char"/>
     <w:basedOn w:val="133"/>
     <w:link w:val="2"/>
+    <w:qFormat/>
     <w:uiPriority w:val="99"/>
     <w:rPr>
       <w:rFonts w:ascii="Courier" w:hAnsi="Courier"/>
@@ -55743,6 +55870,7 @@
     <w:name w:val="Quote Char"/>
     <w:basedOn w:val="133"/>
     <w:link w:val="149"/>
+    <w:qFormat/>
     <w:uiPriority w:val="29"/>
     <w:rPr>
       <w:i/>
@@ -55760,6 +55888,7 @@
     <w:basedOn w:val="133"/>
     <w:link w:val="6"/>
     <w:semiHidden/>
+    <w:qFormat/>
     <w:uiPriority w:val="9"/>
     <w:rPr>
       <w:rFonts w:asciiTheme="majorHAnsi" w:hAnsiTheme="majorHAnsi" w:eastAsiaTheme="majorEastAsia" w:cstheme="majorBidi"/>
@@ -55780,6 +55909,7 @@
     <w:basedOn w:val="133"/>
     <w:link w:val="7"/>
     <w:semiHidden/>
+    <w:qFormat/>
     <w:uiPriority w:val="9"/>
     <w:rPr>
       <w:rFonts w:asciiTheme="majorHAnsi" w:hAnsiTheme="majorHAnsi" w:eastAsiaTheme="majorEastAsia" w:cstheme="majorBidi"/>
@@ -55791,6 +55921,7 @@
     <w:basedOn w:val="133"/>
     <w:link w:val="8"/>
     <w:semiHidden/>
+    <w:qFormat/>
     <w:uiPriority w:val="9"/>
     <w:rPr>
       <w:rFonts w:asciiTheme="majorHAnsi" w:hAnsiTheme="majorHAnsi" w:eastAsiaTheme="majorEastAsia" w:cstheme="majorBidi"/>
@@ -55892,6 +56023,7 @@
     <w:name w:val="Intense Quote Char"/>
     <w:basedOn w:val="133"/>
     <w:link w:val="157"/>
+    <w:qFormat/>
     <w:uiPriority w:val="30"/>
     <w:rPr>
       <w:b/>

</xml_diff>

<commit_message>
chore(release): public snapshot v0.2.4 (#1)
* chore(release): public snapshot v0.2.2

* chore(release): public snapshot v0.2.3

* chore(release): public snapshot v0.2.4

---------

Co-authored-by: AngelinatheMellowWish <311235986+AngelinatheMellowWish@users.noreply.github.com>
</commit_message>
<xml_diff>
--- a/docs/需求说明书.docx
+++ b/docs/需求说明书.docx
@@ -69,7 +69,7 @@
           <w:color w:val="5A6370"/>
           <w:sz w:val="20"/>
         </w:rPr>
-        <w:t>文档编号  ADVP-SRS-001        版本  v0.2.1</w:t>
+        <w:t>文档编号  ADVP-SRS-001        版本  v0.2.4</w:t>
       </w:r>
     </w:p>
     <w:p>
@@ -173,7 +173,7 @@
         <w:rPr>
           <w:rFonts w:ascii="微软雅黑" w:hAnsi="微软雅黑" w:eastAsia="微软雅黑"/>
         </w:rPr>
-        <w:instrText xml:space="preserve"> HYPERLINK \l _Toc26852 </w:instrText>
+        <w:instrText xml:space="preserve"> HYPERLINK \l _Toc29481 </w:instrText>
       </w:r>
       <w:r>
         <w:rPr>
@@ -194,7 +194,7 @@
         <w:fldChar w:fldCharType="begin"/>
       </w:r>
       <w:r>
-        <w:instrText xml:space="preserve"> PAGEREF _Toc26852 \h </w:instrText>
+        <w:instrText xml:space="preserve"> PAGEREF _Toc29481 \h </w:instrText>
       </w:r>
       <w:r>
         <w:fldChar w:fldCharType="separate"/>
@@ -231,7 +231,7 @@
         <w:rPr>
           <w:rFonts w:ascii="微软雅黑" w:hAnsi="微软雅黑" w:eastAsia="微软雅黑"/>
         </w:rPr>
-        <w:instrText xml:space="preserve"> HYPERLINK \l _Toc11553 </w:instrText>
+        <w:instrText xml:space="preserve"> HYPERLINK \l _Toc6066 </w:instrText>
       </w:r>
       <w:r>
         <w:rPr>
@@ -252,7 +252,7 @@
         <w:fldChar w:fldCharType="begin"/>
       </w:r>
       <w:r>
-        <w:instrText xml:space="preserve"> PAGEREF _Toc11553 \h </w:instrText>
+        <w:instrText xml:space="preserve"> PAGEREF _Toc6066 \h </w:instrText>
       </w:r>
       <w:r>
         <w:fldChar w:fldCharType="separate"/>
@@ -289,7 +289,7 @@
         <w:rPr>
           <w:rFonts w:ascii="微软雅黑" w:hAnsi="微软雅黑" w:eastAsia="微软雅黑"/>
         </w:rPr>
-        <w:instrText xml:space="preserve"> HYPERLINK \l _Toc19455 </w:instrText>
+        <w:instrText xml:space="preserve"> HYPERLINK \l _Toc24056 </w:instrText>
       </w:r>
       <w:r>
         <w:rPr>
@@ -310,7 +310,7 @@
         <w:fldChar w:fldCharType="begin"/>
       </w:r>
       <w:r>
-        <w:instrText xml:space="preserve"> PAGEREF _Toc19455 \h </w:instrText>
+        <w:instrText xml:space="preserve"> PAGEREF _Toc24056 \h </w:instrText>
       </w:r>
       <w:r>
         <w:fldChar w:fldCharType="separate"/>
@@ -347,7 +347,7 @@
         <w:rPr>
           <w:rFonts w:ascii="微软雅黑" w:hAnsi="微软雅黑" w:eastAsia="微软雅黑"/>
         </w:rPr>
-        <w:instrText xml:space="preserve"> HYPERLINK \l _Toc26581 </w:instrText>
+        <w:instrText xml:space="preserve"> HYPERLINK \l _Toc13173 </w:instrText>
       </w:r>
       <w:r>
         <w:rPr>
@@ -368,7 +368,7 @@
         <w:fldChar w:fldCharType="begin"/>
       </w:r>
       <w:r>
-        <w:instrText xml:space="preserve"> PAGEREF _Toc26581 \h </w:instrText>
+        <w:instrText xml:space="preserve"> PAGEREF _Toc13173 \h </w:instrText>
       </w:r>
       <w:r>
         <w:fldChar w:fldCharType="separate"/>
@@ -405,7 +405,7 @@
         <w:rPr>
           <w:rFonts w:ascii="微软雅黑" w:hAnsi="微软雅黑" w:eastAsia="微软雅黑"/>
         </w:rPr>
-        <w:instrText xml:space="preserve"> HYPERLINK \l _Toc14705 </w:instrText>
+        <w:instrText xml:space="preserve"> HYPERLINK \l _Toc11842 </w:instrText>
       </w:r>
       <w:r>
         <w:rPr>
@@ -426,7 +426,7 @@
         <w:fldChar w:fldCharType="begin"/>
       </w:r>
       <w:r>
-        <w:instrText xml:space="preserve"> PAGEREF _Toc14705 \h </w:instrText>
+        <w:instrText xml:space="preserve"> PAGEREF _Toc11842 \h </w:instrText>
       </w:r>
       <w:r>
         <w:fldChar w:fldCharType="separate"/>
@@ -463,7 +463,7 @@
         <w:rPr>
           <w:rFonts w:ascii="微软雅黑" w:hAnsi="微软雅黑" w:eastAsia="微软雅黑"/>
         </w:rPr>
-        <w:instrText xml:space="preserve"> HYPERLINK \l _Toc27126 </w:instrText>
+        <w:instrText xml:space="preserve"> HYPERLINK \l _Toc12164 </w:instrText>
       </w:r>
       <w:r>
         <w:rPr>
@@ -484,13 +484,13 @@
         <w:fldChar w:fldCharType="begin"/>
       </w:r>
       <w:r>
-        <w:instrText xml:space="preserve"> PAGEREF _Toc27126 \h </w:instrText>
+        <w:instrText xml:space="preserve"> PAGEREF _Toc12164 \h </w:instrText>
       </w:r>
       <w:r>
         <w:fldChar w:fldCharType="separate"/>
       </w:r>
       <w:r>
-        <w:t>28</w:t>
+        <w:t>29</w:t>
       </w:r>
       <w:r>
         <w:fldChar w:fldCharType="end"/>
@@ -521,7 +521,7 @@
         <w:rPr>
           <w:rFonts w:ascii="微软雅黑" w:hAnsi="微软雅黑" w:eastAsia="微软雅黑"/>
         </w:rPr>
-        <w:instrText xml:space="preserve"> HYPERLINK \l _Toc27216 </w:instrText>
+        <w:instrText xml:space="preserve"> HYPERLINK \l _Toc27760 </w:instrText>
       </w:r>
       <w:r>
         <w:rPr>
@@ -542,7 +542,7 @@
         <w:fldChar w:fldCharType="begin"/>
       </w:r>
       <w:r>
-        <w:instrText xml:space="preserve"> PAGEREF _Toc27216 \h </w:instrText>
+        <w:instrText xml:space="preserve"> PAGEREF _Toc27760 \h </w:instrText>
       </w:r>
       <w:r>
         <w:fldChar w:fldCharType="separate"/>
@@ -579,7 +579,7 @@
         <w:rPr>
           <w:rFonts w:ascii="微软雅黑" w:hAnsi="微软雅黑" w:eastAsia="微软雅黑"/>
         </w:rPr>
-        <w:instrText xml:space="preserve"> HYPERLINK \l _Toc28087 </w:instrText>
+        <w:instrText xml:space="preserve"> HYPERLINK \l _Toc29314 </w:instrText>
       </w:r>
       <w:r>
         <w:rPr>
@@ -600,7 +600,7 @@
         <w:fldChar w:fldCharType="begin"/>
       </w:r>
       <w:r>
-        <w:instrText xml:space="preserve"> PAGEREF _Toc28087 \h </w:instrText>
+        <w:instrText xml:space="preserve"> PAGEREF _Toc29314 \h </w:instrText>
       </w:r>
       <w:r>
         <w:fldChar w:fldCharType="separate"/>
@@ -637,7 +637,7 @@
         <w:rPr>
           <w:rFonts w:ascii="微软雅黑" w:hAnsi="微软雅黑" w:eastAsia="微软雅黑"/>
         </w:rPr>
-        <w:instrText xml:space="preserve"> HYPERLINK \l _Toc26512 </w:instrText>
+        <w:instrText xml:space="preserve"> HYPERLINK \l _Toc27895 </w:instrText>
       </w:r>
       <w:r>
         <w:rPr>
@@ -658,7 +658,7 @@
         <w:fldChar w:fldCharType="begin"/>
       </w:r>
       <w:r>
-        <w:instrText xml:space="preserve"> PAGEREF _Toc26512 \h </w:instrText>
+        <w:instrText xml:space="preserve"> PAGEREF _Toc27895 \h </w:instrText>
       </w:r>
       <w:r>
         <w:fldChar w:fldCharType="separate"/>
@@ -695,7 +695,7 @@
         <w:rPr>
           <w:rFonts w:ascii="微软雅黑" w:hAnsi="微软雅黑" w:eastAsia="微软雅黑"/>
         </w:rPr>
-        <w:instrText xml:space="preserve"> HYPERLINK \l _Toc31112 </w:instrText>
+        <w:instrText xml:space="preserve"> HYPERLINK \l _Toc19977 </w:instrText>
       </w:r>
       <w:r>
         <w:rPr>
@@ -716,13 +716,13 @@
         <w:fldChar w:fldCharType="begin"/>
       </w:r>
       <w:r>
-        <w:instrText xml:space="preserve"> PAGEREF _Toc31112 \h </w:instrText>
+        <w:instrText xml:space="preserve"> PAGEREF _Toc19977 \h </w:instrText>
       </w:r>
       <w:r>
         <w:fldChar w:fldCharType="separate"/>
       </w:r>
       <w:r>
-        <w:t>34</w:t>
+        <w:t>35</w:t>
       </w:r>
       <w:r>
         <w:fldChar w:fldCharType="end"/>
@@ -753,7 +753,7 @@
         <w:rPr>
           <w:rFonts w:ascii="微软雅黑" w:hAnsi="微软雅黑" w:eastAsia="微软雅黑"/>
         </w:rPr>
-        <w:instrText xml:space="preserve"> HYPERLINK \l _Toc25095 </w:instrText>
+        <w:instrText xml:space="preserve"> HYPERLINK \l _Toc5686 </w:instrText>
       </w:r>
       <w:r>
         <w:rPr>
@@ -774,7 +774,7 @@
         <w:fldChar w:fldCharType="begin"/>
       </w:r>
       <w:r>
-        <w:instrText xml:space="preserve"> PAGEREF _Toc25095 \h </w:instrText>
+        <w:instrText xml:space="preserve"> PAGEREF _Toc5686 \h </w:instrText>
       </w:r>
       <w:r>
         <w:fldChar w:fldCharType="separate"/>
@@ -811,7 +811,7 @@
         <w:rPr>
           <w:rFonts w:ascii="微软雅黑" w:hAnsi="微软雅黑" w:eastAsia="微软雅黑"/>
         </w:rPr>
-        <w:instrText xml:space="preserve"> HYPERLINK \l _Toc13953 </w:instrText>
+        <w:instrText xml:space="preserve"> HYPERLINK \l _Toc9593 </w:instrText>
       </w:r>
       <w:r>
         <w:rPr>
@@ -832,65 +832,7 @@
         <w:fldChar w:fldCharType="begin"/>
       </w:r>
       <w:r>
-        <w:instrText xml:space="preserve"> PAGEREF _Toc13953 \h </w:instrText>
-      </w:r>
-      <w:r>
-        <w:fldChar w:fldCharType="separate"/>
-      </w:r>
-      <w:r>
-        <w:t>36</w:t>
-      </w:r>
-      <w:r>
-        <w:fldChar w:fldCharType="end"/>
-      </w:r>
-      <w:r>
-        <w:rPr>
-          <w:rFonts w:ascii="微软雅黑" w:hAnsi="微软雅黑" w:eastAsia="微软雅黑"/>
-          <w:color w:val="5A6370"/>
-        </w:rPr>
-        <w:fldChar w:fldCharType="end"/>
-      </w:r>
-    </w:p>
-    <w:p>
-      <w:pPr>
-        <w:pStyle w:val="28"/>
-        <w:tabs>
-          <w:tab w:val="right" w:leader="dot" w:pos="9638"/>
-        </w:tabs>
-      </w:pPr>
-      <w:r>
-        <w:rPr>
-          <w:rFonts w:ascii="微软雅黑" w:hAnsi="微软雅黑" w:eastAsia="微软雅黑"/>
-          <w:color w:val="5A6370"/>
-        </w:rPr>
-        <w:fldChar w:fldCharType="begin"/>
-      </w:r>
-      <w:r>
-        <w:rPr>
-          <w:rFonts w:ascii="微软雅黑" w:hAnsi="微软雅黑" w:eastAsia="微软雅黑"/>
-        </w:rPr>
-        <w:instrText xml:space="preserve"> HYPERLINK \l _Toc5025 </w:instrText>
-      </w:r>
-      <w:r>
-        <w:rPr>
-          <w:rFonts w:ascii="微软雅黑" w:hAnsi="微软雅黑" w:eastAsia="微软雅黑"/>
-        </w:rPr>
-        <w:fldChar w:fldCharType="separate"/>
-      </w:r>
-      <w:r>
-        <w:rPr>
-          <w:rFonts w:ascii="微软雅黑" w:hAnsi="微软雅黑" w:eastAsia="微软雅黑"/>
-        </w:rPr>
-        <w:t>12. 默认参数与已确认项</w:t>
-      </w:r>
-      <w:r>
-        <w:tab/>
-      </w:r>
-      <w:r>
-        <w:fldChar w:fldCharType="begin"/>
-      </w:r>
-      <w:r>
-        <w:instrText xml:space="preserve"> PAGEREF _Toc5025 \h </w:instrText>
+        <w:instrText xml:space="preserve"> PAGEREF _Toc9593 \h </w:instrText>
       </w:r>
       <w:r>
         <w:fldChar w:fldCharType="separate"/>
@@ -927,7 +869,7 @@
         <w:rPr>
           <w:rFonts w:ascii="微软雅黑" w:hAnsi="微软雅黑" w:eastAsia="微软雅黑"/>
         </w:rPr>
-        <w:instrText xml:space="preserve"> HYPERLINK \l _Toc8009 </w:instrText>
+        <w:instrText xml:space="preserve"> HYPERLINK \l _Toc637 </w:instrText>
       </w:r>
       <w:r>
         <w:rPr>
@@ -939,7 +881,7 @@
         <w:rPr>
           <w:rFonts w:ascii="微软雅黑" w:hAnsi="微软雅黑" w:eastAsia="微软雅黑"/>
         </w:rPr>
-        <w:t>13. 需求追溯矩阵</w:t>
+        <w:t>12. 默认参数与已确认项</w:t>
       </w:r>
       <w:r>
         <w:tab/>
@@ -948,7 +890,7 @@
         <w:fldChar w:fldCharType="begin"/>
       </w:r>
       <w:r>
-        <w:instrText xml:space="preserve"> PAGEREF _Toc8009 \h </w:instrText>
+        <w:instrText xml:space="preserve"> PAGEREF _Toc637 \h </w:instrText>
       </w:r>
       <w:r>
         <w:fldChar w:fldCharType="separate"/>
@@ -985,7 +927,7 @@
         <w:rPr>
           <w:rFonts w:ascii="微软雅黑" w:hAnsi="微软雅黑" w:eastAsia="微软雅黑"/>
         </w:rPr>
-        <w:instrText xml:space="preserve"> HYPERLINK \l _Toc15141 </w:instrText>
+        <w:instrText xml:space="preserve"> HYPERLINK \l _Toc17522 </w:instrText>
       </w:r>
       <w:r>
         <w:rPr>
@@ -997,7 +939,7 @@
         <w:rPr>
           <w:rFonts w:ascii="微软雅黑" w:hAnsi="微软雅黑" w:eastAsia="微软雅黑"/>
         </w:rPr>
-        <w:t>附录 A：交付物清单</w:t>
+        <w:t>13. 需求追溯矩阵</w:t>
       </w:r>
       <w:r>
         <w:tab/>
@@ -1006,13 +948,13 @@
         <w:fldChar w:fldCharType="begin"/>
       </w:r>
       <w:r>
-        <w:instrText xml:space="preserve"> PAGEREF _Toc15141 \h </w:instrText>
+        <w:instrText xml:space="preserve"> PAGEREF _Toc17522 \h </w:instrText>
       </w:r>
       <w:r>
         <w:fldChar w:fldCharType="separate"/>
       </w:r>
       <w:r>
-        <w:t>40</w:t>
+        <w:t>39</w:t>
       </w:r>
       <w:r>
         <w:fldChar w:fldCharType="end"/>
@@ -1043,7 +985,7 @@
         <w:rPr>
           <w:rFonts w:ascii="微软雅黑" w:hAnsi="微软雅黑" w:eastAsia="微软雅黑"/>
         </w:rPr>
-        <w:instrText xml:space="preserve"> HYPERLINK \l _Toc29509 </w:instrText>
+        <w:instrText xml:space="preserve"> HYPERLINK \l _Toc18240 </w:instrText>
       </w:r>
       <w:r>
         <w:rPr>
@@ -1055,7 +997,7 @@
         <w:rPr>
           <w:rFonts w:ascii="微软雅黑" w:hAnsi="微软雅黑" w:eastAsia="微软雅黑"/>
         </w:rPr>
-        <w:t>附录 B：安全与仓库操作约定</w:t>
+        <w:t>附录 A：交付物清单</w:t>
       </w:r>
       <w:r>
         <w:tab/>
@@ -1064,7 +1006,7 @@
         <w:fldChar w:fldCharType="begin"/>
       </w:r>
       <w:r>
-        <w:instrText xml:space="preserve"> PAGEREF _Toc29509 \h </w:instrText>
+        <w:instrText xml:space="preserve"> PAGEREF _Toc18240 \h </w:instrText>
       </w:r>
       <w:r>
         <w:fldChar w:fldCharType="separate"/>
@@ -1101,7 +1043,65 @@
         <w:rPr>
           <w:rFonts w:ascii="微软雅黑" w:hAnsi="微软雅黑" w:eastAsia="微软雅黑"/>
         </w:rPr>
-        <w:instrText xml:space="preserve"> HYPERLINK \l _Toc3900 </w:instrText>
+        <w:instrText xml:space="preserve"> HYPERLINK \l _Toc10689 </w:instrText>
+      </w:r>
+      <w:r>
+        <w:rPr>
+          <w:rFonts w:ascii="微软雅黑" w:hAnsi="微软雅黑" w:eastAsia="微软雅黑"/>
+        </w:rPr>
+        <w:fldChar w:fldCharType="separate"/>
+      </w:r>
+      <w:r>
+        <w:rPr>
+          <w:rFonts w:ascii="微软雅黑" w:hAnsi="微软雅黑" w:eastAsia="微软雅黑"/>
+        </w:rPr>
+        <w:t>附录 B：安全与仓库操作约定</w:t>
+      </w:r>
+      <w:r>
+        <w:tab/>
+      </w:r>
+      <w:r>
+        <w:fldChar w:fldCharType="begin"/>
+      </w:r>
+      <w:r>
+        <w:instrText xml:space="preserve"> PAGEREF _Toc10689 \h </w:instrText>
+      </w:r>
+      <w:r>
+        <w:fldChar w:fldCharType="separate"/>
+      </w:r>
+      <w:r>
+        <w:t>41</w:t>
+      </w:r>
+      <w:r>
+        <w:fldChar w:fldCharType="end"/>
+      </w:r>
+      <w:r>
+        <w:rPr>
+          <w:rFonts w:ascii="微软雅黑" w:hAnsi="微软雅黑" w:eastAsia="微软雅黑"/>
+          <w:color w:val="5A6370"/>
+        </w:rPr>
+        <w:fldChar w:fldCharType="end"/>
+      </w:r>
+    </w:p>
+    <w:p>
+      <w:pPr>
+        <w:pStyle w:val="28"/>
+        <w:tabs>
+          <w:tab w:val="right" w:leader="dot" w:pos="9638"/>
+        </w:tabs>
+      </w:pPr>
+      <w:r>
+        <w:rPr>
+          <w:rFonts w:ascii="微软雅黑" w:hAnsi="微软雅黑" w:eastAsia="微软雅黑"/>
+          <w:color w:val="5A6370"/>
+        </w:rPr>
+        <w:fldChar w:fldCharType="begin"/>
+      </w:r>
+      <w:r>
+        <w:rPr>
+          <w:rFonts w:ascii="微软雅黑" w:hAnsi="微软雅黑" w:eastAsia="微软雅黑"/>
+        </w:rPr>
+        <w:instrText xml:space="preserve"> HYPERLINK \l _Toc12974 </w:instrText>
       </w:r>
       <w:r>
         <w:rPr>
@@ -1122,13 +1122,13 @@
         <w:fldChar w:fldCharType="begin"/>
       </w:r>
       <w:r>
-        <w:instrText xml:space="preserve"> PAGEREF _Toc3900 \h </w:instrText>
+        <w:instrText xml:space="preserve"> PAGEREF _Toc12974 \h </w:instrText>
       </w:r>
       <w:r>
         <w:fldChar w:fldCharType="separate"/>
       </w:r>
       <w:r>
-        <w:t>41</w:t>
+        <w:t>42</w:t>
       </w:r>
       <w:r>
         <w:fldChar w:fldCharType="end"/>
@@ -1161,7 +1161,7 @@
         <w:keepNext/>
         <w:spacing w:before="240" w:after="100"/>
       </w:pPr>
-      <w:bookmarkStart w:id="0" w:name="_Toc26852"/>
+      <w:bookmarkStart w:id="0" w:name="_Toc29481"/>
       <w:r>
         <w:rPr>
           <w:rFonts w:ascii="微软雅黑" w:hAnsi="微软雅黑" w:eastAsia="微软雅黑"/>
@@ -1434,7 +1434,7 @@
                 <w:color w:val="242A33"/>
                 <w:sz w:val="16"/>
               </w:rPr>
-              <w:t>v0.2.1</w:t>
+              <w:t>v0.2.4</w:t>
             </w:r>
           </w:p>
         </w:tc>
@@ -2067,7 +2067,7 @@
                 <w:color w:val="242A33"/>
                 <w:sz w:val="16"/>
               </w:rPr>
-              <w:t>v0.2.1</w:t>
+              <w:t>v0.2.4</w:t>
             </w:r>
           </w:p>
         </w:tc>
@@ -2086,7 +2086,7 @@
                 <w:color w:val="242A33"/>
                 <w:sz w:val="16"/>
               </w:rPr>
-              <w:t>2026-10-22</w:t>
+              <w:t>2026-10-23</w:t>
             </w:r>
           </w:p>
         </w:tc>
@@ -2105,7 +2105,7 @@
                 <w:color w:val="242A33"/>
                 <w:sz w:val="16"/>
               </w:rPr>
-              <w:t>docs(repo): add GitHub publication guide and ignore local agent state</w:t>
+              <w:t>fix(ci): force UTF-8 Python output on Windows runners</w:t>
             </w:r>
           </w:p>
         </w:tc>
@@ -2184,7 +2184,7 @@
                 <w:color w:val="242A33"/>
                 <w:sz w:val="16"/>
               </w:rPr>
-              <w:t>v0.2.0</w:t>
+              <w:t>v0.2.3</w:t>
             </w:r>
           </w:p>
         </w:tc>
@@ -2204,7 +2204,7 @@
                 <w:color w:val="242A33"/>
                 <w:sz w:val="16"/>
               </w:rPr>
-              <w:t>2026-10-22</w:t>
+              <w:t>2026-10-23</w:t>
             </w:r>
           </w:p>
         </w:tc>
@@ -2224,7 +2224,7 @@
                 <w:color w:val="242A33"/>
                 <w:sz w:val="16"/>
               </w:rPr>
-              <w:t>feat(scope): adopt Apache-2.0, Kafka-required stream, single-dev 40-48 week plan</w:t>
+              <w:t>fix(ci): replace Windows-incompatible lychee action with local link checker</w:t>
             </w:r>
           </w:p>
         </w:tc>
@@ -2304,7 +2304,7 @@
                 <w:color w:val="242A33"/>
                 <w:sz w:val="16"/>
               </w:rPr>
-              <w:t>v0.1.1</w:t>
+              <w:t>v0.2.2</w:t>
             </w:r>
           </w:p>
         </w:tc>
@@ -2323,7 +2323,7 @@
                 <w:color w:val="242A33"/>
                 <w:sz w:val="16"/>
               </w:rPr>
-              <w:t>2026-10-22</w:t>
+              <w:t>2026-10-23</w:t>
             </w:r>
           </w:p>
         </w:tc>
@@ -2342,7 +2342,7 @@
                 <w:color w:val="242A33"/>
                 <w:sz w:val="16"/>
               </w:rPr>
-              <w:t>fix(repo): sanitize public export paths and checks</w:t>
+              <w:t>fix(ci): correct frontend working-directory and document private protection limit</w:t>
             </w:r>
           </w:p>
         </w:tc>
@@ -2421,6 +2421,363 @@
                 <w:color w:val="242A33"/>
                 <w:sz w:val="16"/>
               </w:rPr>
+              <w:t>v0.2.1</w:t>
+            </w:r>
+          </w:p>
+        </w:tc>
+        <w:tc>
+          <w:tcPr>
+            <w:tcW w:w="1928" w:type="dxa"/>
+            <w:shd w:val="clear" w:color="auto" w:fill="F5F7FA"/>
+          </w:tcPr>
+          <w:p>
+            <w:pPr>
+              <w:spacing w:before="20" w:after="20"/>
+            </w:pPr>
+            <w:r>
+              <w:rPr>
+                <w:rFonts w:ascii="微软雅黑" w:hAnsi="微软雅黑" w:eastAsia="微软雅黑"/>
+                <w:b w:val="0"/>
+                <w:color w:val="242A33"/>
+                <w:sz w:val="16"/>
+              </w:rPr>
+              <w:t>2026-10-22</w:t>
+            </w:r>
+          </w:p>
+        </w:tc>
+        <w:tc>
+          <w:tcPr>
+            <w:tcW w:w="1928" w:type="dxa"/>
+            <w:shd w:val="clear" w:color="auto" w:fill="F5F7FA"/>
+          </w:tcPr>
+          <w:p>
+            <w:pPr>
+              <w:spacing w:before="20" w:after="20"/>
+            </w:pPr>
+            <w:r>
+              <w:rPr>
+                <w:rFonts w:ascii="微软雅黑" w:hAnsi="微软雅黑" w:eastAsia="微软雅黑"/>
+                <w:b w:val="0"/>
+                <w:color w:val="242A33"/>
+                <w:sz w:val="16"/>
+              </w:rPr>
+              <w:t>docs(repo): add GitHub publication guide and ignore local agent state</w:t>
+            </w:r>
+          </w:p>
+        </w:tc>
+        <w:tc>
+          <w:tcPr>
+            <w:tcW w:w="1928" w:type="dxa"/>
+            <w:shd w:val="clear" w:color="auto" w:fill="F5F7FA"/>
+          </w:tcPr>
+          <w:p>
+            <w:pPr>
+              <w:spacing w:before="20" w:after="20"/>
+            </w:pPr>
+            <w:r>
+              <w:rPr>
+                <w:rFonts w:ascii="微软雅黑" w:hAnsi="微软雅黑" w:eastAsia="微软雅黑"/>
+                <w:b w:val="0"/>
+                <w:color w:val="242A33"/>
+                <w:sz w:val="16"/>
+              </w:rPr>
+              <w:t>ADVP 项目组</w:t>
+            </w:r>
+          </w:p>
+        </w:tc>
+        <w:tc>
+          <w:tcPr>
+            <w:tcW w:w="1928" w:type="dxa"/>
+            <w:shd w:val="clear" w:color="auto" w:fill="F5F7FA"/>
+          </w:tcPr>
+          <w:p>
+            <w:pPr>
+              <w:spacing w:before="20" w:after="20"/>
+            </w:pPr>
+            <w:r>
+              <w:rPr>
+                <w:rFonts w:ascii="微软雅黑" w:hAnsi="微软雅黑" w:eastAsia="微软雅黑"/>
+                <w:b w:val="0"/>
+                <w:color w:val="242A33"/>
+                <w:sz w:val="16"/>
+              </w:rPr>
+              <w:t>待确认</w:t>
+            </w:r>
+          </w:p>
+        </w:tc>
+      </w:tr>
+      <w:tr>
+        <w:tblPrEx>
+          <w:tblBorders>
+            <w:top w:val="single" w:color="auto" w:sz="4" w:space="0"/>
+            <w:left w:val="single" w:color="auto" w:sz="4" w:space="0"/>
+            <w:bottom w:val="single" w:color="auto" w:sz="4" w:space="0"/>
+            <w:right w:val="single" w:color="auto" w:sz="4" w:space="0"/>
+            <w:insideH w:val="single" w:color="auto" w:sz="4" w:space="0"/>
+            <w:insideV w:val="single" w:color="auto" w:sz="4" w:space="0"/>
+          </w:tblBorders>
+          <w:tblCellMar>
+            <w:top w:w="40" w:type="dxa"/>
+            <w:left w:w="70" w:type="dxa"/>
+            <w:bottom w:w="40" w:type="dxa"/>
+            <w:right w:w="70" w:type="dxa"/>
+          </w:tblCellMar>
+        </w:tblPrEx>
+        <w:trPr>
+          <w:jc w:val="center"/>
+        </w:trPr>
+        <w:tc>
+          <w:tcPr>
+            <w:tcW w:w="1928" w:type="dxa"/>
+          </w:tcPr>
+          <w:p>
+            <w:pPr>
+              <w:spacing w:before="20" w:after="20"/>
+            </w:pPr>
+            <w:r>
+              <w:rPr>
+                <w:rFonts w:ascii="微软雅黑" w:hAnsi="微软雅黑" w:eastAsia="微软雅黑"/>
+                <w:b w:val="0"/>
+                <w:color w:val="242A33"/>
+                <w:sz w:val="16"/>
+              </w:rPr>
+              <w:t>v0.2.0</w:t>
+            </w:r>
+          </w:p>
+        </w:tc>
+        <w:tc>
+          <w:tcPr>
+            <w:tcW w:w="1928" w:type="dxa"/>
+          </w:tcPr>
+          <w:p>
+            <w:pPr>
+              <w:spacing w:before="20" w:after="20"/>
+            </w:pPr>
+            <w:r>
+              <w:rPr>
+                <w:rFonts w:ascii="微软雅黑" w:hAnsi="微软雅黑" w:eastAsia="微软雅黑"/>
+                <w:b w:val="0"/>
+                <w:color w:val="242A33"/>
+                <w:sz w:val="16"/>
+              </w:rPr>
+              <w:t>2026-10-22</w:t>
+            </w:r>
+          </w:p>
+        </w:tc>
+        <w:tc>
+          <w:tcPr>
+            <w:tcW w:w="1928" w:type="dxa"/>
+          </w:tcPr>
+          <w:p>
+            <w:pPr>
+              <w:spacing w:before="20" w:after="20"/>
+            </w:pPr>
+            <w:r>
+              <w:rPr>
+                <w:rFonts w:ascii="微软雅黑" w:hAnsi="微软雅黑" w:eastAsia="微软雅黑"/>
+                <w:b w:val="0"/>
+                <w:color w:val="242A33"/>
+                <w:sz w:val="16"/>
+              </w:rPr>
+              <w:t>feat(scope): adopt Apache-2.0, Kafka-required stream, single-dev 40-48 week plan</w:t>
+            </w:r>
+          </w:p>
+        </w:tc>
+        <w:tc>
+          <w:tcPr>
+            <w:tcW w:w="1928" w:type="dxa"/>
+          </w:tcPr>
+          <w:p>
+            <w:pPr>
+              <w:spacing w:before="20" w:after="20"/>
+            </w:pPr>
+            <w:r>
+              <w:rPr>
+                <w:rFonts w:ascii="微软雅黑" w:hAnsi="微软雅黑" w:eastAsia="微软雅黑"/>
+                <w:b w:val="0"/>
+                <w:color w:val="242A33"/>
+                <w:sz w:val="16"/>
+              </w:rPr>
+              <w:t>ADVP 项目组</w:t>
+            </w:r>
+          </w:p>
+        </w:tc>
+        <w:tc>
+          <w:tcPr>
+            <w:tcW w:w="1928" w:type="dxa"/>
+          </w:tcPr>
+          <w:p>
+            <w:pPr>
+              <w:spacing w:before="20" w:after="20"/>
+            </w:pPr>
+            <w:r>
+              <w:rPr>
+                <w:rFonts w:ascii="微软雅黑" w:hAnsi="微软雅黑" w:eastAsia="微软雅黑"/>
+                <w:b w:val="0"/>
+                <w:color w:val="242A33"/>
+                <w:sz w:val="16"/>
+              </w:rPr>
+              <w:t>待确认</w:t>
+            </w:r>
+          </w:p>
+        </w:tc>
+      </w:tr>
+      <w:tr>
+        <w:tblPrEx>
+          <w:tblBorders>
+            <w:top w:val="single" w:color="auto" w:sz="4" w:space="0"/>
+            <w:left w:val="single" w:color="auto" w:sz="4" w:space="0"/>
+            <w:bottom w:val="single" w:color="auto" w:sz="4" w:space="0"/>
+            <w:right w:val="single" w:color="auto" w:sz="4" w:space="0"/>
+            <w:insideH w:val="single" w:color="auto" w:sz="4" w:space="0"/>
+            <w:insideV w:val="single" w:color="auto" w:sz="4" w:space="0"/>
+          </w:tblBorders>
+          <w:tblCellMar>
+            <w:top w:w="40" w:type="dxa"/>
+            <w:left w:w="70" w:type="dxa"/>
+            <w:bottom w:w="40" w:type="dxa"/>
+            <w:right w:w="70" w:type="dxa"/>
+          </w:tblCellMar>
+        </w:tblPrEx>
+        <w:trPr>
+          <w:jc w:val="center"/>
+        </w:trPr>
+        <w:tc>
+          <w:tcPr>
+            <w:tcW w:w="1928" w:type="dxa"/>
+            <w:shd w:val="clear" w:color="auto" w:fill="F5F7FA"/>
+          </w:tcPr>
+          <w:p>
+            <w:pPr>
+              <w:spacing w:before="20" w:after="20"/>
+            </w:pPr>
+            <w:r>
+              <w:rPr>
+                <w:rFonts w:ascii="微软雅黑" w:hAnsi="微软雅黑" w:eastAsia="微软雅黑"/>
+                <w:b w:val="0"/>
+                <w:color w:val="242A33"/>
+                <w:sz w:val="16"/>
+              </w:rPr>
+              <w:t>v0.1.1</w:t>
+            </w:r>
+          </w:p>
+        </w:tc>
+        <w:tc>
+          <w:tcPr>
+            <w:tcW w:w="1928" w:type="dxa"/>
+            <w:shd w:val="clear" w:color="auto" w:fill="F5F7FA"/>
+          </w:tcPr>
+          <w:p>
+            <w:pPr>
+              <w:spacing w:before="20" w:after="20"/>
+            </w:pPr>
+            <w:r>
+              <w:rPr>
+                <w:rFonts w:ascii="微软雅黑" w:hAnsi="微软雅黑" w:eastAsia="微软雅黑"/>
+                <w:b w:val="0"/>
+                <w:color w:val="242A33"/>
+                <w:sz w:val="16"/>
+              </w:rPr>
+              <w:t>2026-10-22</w:t>
+            </w:r>
+          </w:p>
+        </w:tc>
+        <w:tc>
+          <w:tcPr>
+            <w:tcW w:w="1928" w:type="dxa"/>
+            <w:shd w:val="clear" w:color="auto" w:fill="F5F7FA"/>
+          </w:tcPr>
+          <w:p>
+            <w:pPr>
+              <w:spacing w:before="20" w:after="20"/>
+            </w:pPr>
+            <w:r>
+              <w:rPr>
+                <w:rFonts w:ascii="微软雅黑" w:hAnsi="微软雅黑" w:eastAsia="微软雅黑"/>
+                <w:b w:val="0"/>
+                <w:color w:val="242A33"/>
+                <w:sz w:val="16"/>
+              </w:rPr>
+              <w:t>fix(repo): sanitize public export paths and checks</w:t>
+            </w:r>
+          </w:p>
+        </w:tc>
+        <w:tc>
+          <w:tcPr>
+            <w:tcW w:w="1928" w:type="dxa"/>
+            <w:shd w:val="clear" w:color="auto" w:fill="F5F7FA"/>
+          </w:tcPr>
+          <w:p>
+            <w:pPr>
+              <w:spacing w:before="20" w:after="20"/>
+            </w:pPr>
+            <w:r>
+              <w:rPr>
+                <w:rFonts w:ascii="微软雅黑" w:hAnsi="微软雅黑" w:eastAsia="微软雅黑"/>
+                <w:b w:val="0"/>
+                <w:color w:val="242A33"/>
+                <w:sz w:val="16"/>
+              </w:rPr>
+              <w:t>ADVP 项目组</w:t>
+            </w:r>
+          </w:p>
+        </w:tc>
+        <w:tc>
+          <w:tcPr>
+            <w:tcW w:w="1928" w:type="dxa"/>
+            <w:shd w:val="clear" w:color="auto" w:fill="F5F7FA"/>
+          </w:tcPr>
+          <w:p>
+            <w:pPr>
+              <w:spacing w:before="20" w:after="20"/>
+            </w:pPr>
+            <w:r>
+              <w:rPr>
+                <w:rFonts w:ascii="微软雅黑" w:hAnsi="微软雅黑" w:eastAsia="微软雅黑"/>
+                <w:b w:val="0"/>
+                <w:color w:val="242A33"/>
+                <w:sz w:val="16"/>
+              </w:rPr>
+              <w:t>待确认</w:t>
+            </w:r>
+          </w:p>
+        </w:tc>
+      </w:tr>
+      <w:tr>
+        <w:tblPrEx>
+          <w:tblBorders>
+            <w:top w:val="single" w:color="auto" w:sz="4" w:space="0"/>
+            <w:left w:val="single" w:color="auto" w:sz="4" w:space="0"/>
+            <w:bottom w:val="single" w:color="auto" w:sz="4" w:space="0"/>
+            <w:right w:val="single" w:color="auto" w:sz="4" w:space="0"/>
+            <w:insideH w:val="single" w:color="auto" w:sz="4" w:space="0"/>
+            <w:insideV w:val="single" w:color="auto" w:sz="4" w:space="0"/>
+          </w:tblBorders>
+          <w:tblCellMar>
+            <w:top w:w="40" w:type="dxa"/>
+            <w:left w:w="70" w:type="dxa"/>
+            <w:bottom w:w="40" w:type="dxa"/>
+            <w:right w:w="70" w:type="dxa"/>
+          </w:tblCellMar>
+        </w:tblPrEx>
+        <w:trPr>
+          <w:jc w:val="center"/>
+        </w:trPr>
+        <w:tc>
+          <w:tcPr>
+            <w:tcW w:w="1928" w:type="dxa"/>
+          </w:tcPr>
+          <w:p>
+            <w:pPr>
+              <w:spacing w:before="20" w:after="20"/>
+            </w:pPr>
+            <w:r>
+              <w:rPr>
+                <w:rFonts w:ascii="微软雅黑" w:hAnsi="微软雅黑" w:eastAsia="微软雅黑"/>
+                <w:b w:val="0"/>
+                <w:color w:val="242A33"/>
+                <w:sz w:val="16"/>
+              </w:rPr>
               <w:t>v0.1.0</w:t>
             </w:r>
           </w:p>
@@ -2428,7 +2785,6 @@
         <w:tc>
           <w:tcPr>
             <w:tcW w:w="1928" w:type="dxa"/>
-            <w:shd w:val="clear" w:color="auto" w:fill="F5F7FA"/>
           </w:tcPr>
           <w:p>
             <w:pPr>
@@ -2448,7 +2804,6 @@
         <w:tc>
           <w:tcPr>
             <w:tcW w:w="1928" w:type="dxa"/>
-            <w:shd w:val="clear" w:color="auto" w:fill="F5F7FA"/>
           </w:tcPr>
           <w:p>
             <w:pPr>
@@ -2468,7 +2823,6 @@
         <w:tc>
           <w:tcPr>
             <w:tcW w:w="1928" w:type="dxa"/>
-            <w:shd w:val="clear" w:color="auto" w:fill="F5F7FA"/>
           </w:tcPr>
           <w:p>
             <w:pPr>
@@ -2488,7 +2842,6 @@
         <w:tc>
           <w:tcPr>
             <w:tcW w:w="1928" w:type="dxa"/>
-            <w:shd w:val="clear" w:color="auto" w:fill="F5F7FA"/>
           </w:tcPr>
           <w:p>
             <w:pPr>
@@ -2850,7 +3203,7 @@
         <w:keepNext/>
         <w:spacing w:before="240" w:after="100"/>
       </w:pPr>
-      <w:bookmarkStart w:id="1" w:name="_Toc11553"/>
+      <w:bookmarkStart w:id="1" w:name="_Toc6066"/>
       <w:r>
         <w:rPr>
           <w:rFonts w:ascii="微软雅黑" w:hAnsi="微软雅黑" w:eastAsia="微软雅黑"/>
@@ -3329,6 +3682,12 @@
             <w:insideH w:val="single" w:color="auto" w:sz="4" w:space="0"/>
             <w:insideV w:val="single" w:color="auto" w:sz="4" w:space="0"/>
           </w:tblBorders>
+          <w:tblCellMar>
+            <w:top w:w="40" w:type="dxa"/>
+            <w:left w:w="70" w:type="dxa"/>
+            <w:bottom w:w="40" w:type="dxa"/>
+            <w:right w:w="70" w:type="dxa"/>
+          </w:tblCellMar>
         </w:tblPrEx>
         <w:trPr>
           <w:tblHeader/>
@@ -4417,7 +4776,7 @@
         <w:keepNext/>
         <w:spacing w:before="240" w:after="100"/>
       </w:pPr>
-      <w:bookmarkStart w:id="2" w:name="_Toc19455"/>
+      <w:bookmarkStart w:id="2" w:name="_Toc24056"/>
       <w:r>
         <w:rPr>
           <w:rFonts w:ascii="微软雅黑" w:hAnsi="微软雅黑" w:eastAsia="微软雅黑"/>
@@ -6923,7 +7282,7 @@
         <w:keepNext/>
         <w:spacing w:before="240" w:after="100"/>
       </w:pPr>
-      <w:bookmarkStart w:id="3" w:name="_Toc26581"/>
+      <w:bookmarkStart w:id="3" w:name="_Toc13173"/>
       <w:r>
         <w:rPr>
           <w:rFonts w:ascii="微软雅黑" w:hAnsi="微软雅黑" w:eastAsia="微软雅黑"/>
@@ -7006,6 +7365,12 @@
             <w:insideH w:val="single" w:color="auto" w:sz="4" w:space="0"/>
             <w:insideV w:val="single" w:color="auto" w:sz="4" w:space="0"/>
           </w:tblBorders>
+          <w:tblCellMar>
+            <w:top w:w="40" w:type="dxa"/>
+            <w:left w:w="70" w:type="dxa"/>
+            <w:bottom w:w="40" w:type="dxa"/>
+            <w:right w:w="70" w:type="dxa"/>
+          </w:tblCellMar>
         </w:tblPrEx>
         <w:trPr>
           <w:tblHeader/>
@@ -20485,6 +20850,12 @@
             <w:insideH w:val="single" w:color="auto" w:sz="4" w:space="0"/>
             <w:insideV w:val="single" w:color="auto" w:sz="4" w:space="0"/>
           </w:tblBorders>
+          <w:tblCellMar>
+            <w:top w:w="40" w:type="dxa"/>
+            <w:left w:w="70" w:type="dxa"/>
+            <w:bottom w:w="40" w:type="dxa"/>
+            <w:right w:w="70" w:type="dxa"/>
+          </w:tblCellMar>
         </w:tblPrEx>
         <w:trPr>
           <w:tblHeader/>
@@ -21123,12 +21494,6 @@
             <w:insideH w:val="single" w:color="auto" w:sz="4" w:space="0"/>
             <w:insideV w:val="single" w:color="auto" w:sz="4" w:space="0"/>
           </w:tblBorders>
-          <w:tblCellMar>
-            <w:top w:w="40" w:type="dxa"/>
-            <w:left w:w="70" w:type="dxa"/>
-            <w:bottom w:w="40" w:type="dxa"/>
-            <w:right w:w="70" w:type="dxa"/>
-          </w:tblCellMar>
         </w:tblPrEx>
         <w:trPr>
           <w:tblHeader/>
@@ -22491,7 +22856,7 @@
         <w:keepNext/>
         <w:spacing w:before="240" w:after="100"/>
       </w:pPr>
-      <w:bookmarkStart w:id="4" w:name="_Toc14705"/>
+      <w:bookmarkStart w:id="4" w:name="_Toc11842"/>
       <w:r>
         <w:rPr>
           <w:rFonts w:ascii="微软雅黑" w:hAnsi="微软雅黑" w:eastAsia="微软雅黑"/>
@@ -26394,7 +26759,7 @@
         <w:keepNext/>
         <w:spacing w:before="240" w:after="100"/>
       </w:pPr>
-      <w:bookmarkStart w:id="5" w:name="_Toc27126"/>
+      <w:bookmarkStart w:id="5" w:name="_Toc12164"/>
       <w:r>
         <w:rPr>
           <w:rFonts w:ascii="微软雅黑" w:hAnsi="微软雅黑" w:eastAsia="微软雅黑"/>
@@ -28840,7 +29205,7 @@
         <w:keepNext/>
         <w:spacing w:before="240" w:after="100"/>
       </w:pPr>
-      <w:bookmarkStart w:id="6" w:name="_Toc27216"/>
+      <w:bookmarkStart w:id="6" w:name="_Toc27760"/>
       <w:r>
         <w:rPr>
           <w:rFonts w:ascii="微软雅黑" w:hAnsi="微软雅黑" w:eastAsia="微软雅黑"/>
@@ -29539,7 +29904,7 @@
         <w:keepNext/>
         <w:spacing w:before="240" w:after="100"/>
       </w:pPr>
-      <w:bookmarkStart w:id="7" w:name="_Toc28087"/>
+      <w:bookmarkStart w:id="7" w:name="_Toc29314"/>
       <w:r>
         <w:rPr>
           <w:rFonts w:ascii="微软雅黑" w:hAnsi="微软雅黑" w:eastAsia="微软雅黑"/>
@@ -31614,7 +31979,7 @@
         <w:keepNext/>
         <w:spacing w:before="240" w:after="100"/>
       </w:pPr>
-      <w:bookmarkStart w:id="8" w:name="_Toc26512"/>
+      <w:bookmarkStart w:id="8" w:name="_Toc27895"/>
       <w:r>
         <w:rPr>
           <w:rFonts w:ascii="微软雅黑" w:hAnsi="微软雅黑" w:eastAsia="微软雅黑"/>
@@ -32783,7 +33148,7 @@
         <w:keepNext/>
         <w:spacing w:before="240" w:after="100"/>
       </w:pPr>
-      <w:bookmarkStart w:id="9" w:name="_Toc31112"/>
+      <w:bookmarkStart w:id="9" w:name="_Toc19977"/>
       <w:r>
         <w:rPr>
           <w:rFonts w:ascii="微软雅黑" w:hAnsi="微软雅黑" w:eastAsia="微软雅黑"/>
@@ -33311,7 +33676,7 @@
         <w:keepNext/>
         <w:spacing w:before="240" w:after="100"/>
       </w:pPr>
-      <w:bookmarkStart w:id="10" w:name="_Toc25095"/>
+      <w:bookmarkStart w:id="10" w:name="_Toc5686"/>
       <w:r>
         <w:rPr>
           <w:rFonts w:ascii="微软雅黑" w:hAnsi="微软雅黑" w:eastAsia="微软雅黑"/>
@@ -34202,7 +34567,7 @@
         <w:keepNext/>
         <w:spacing w:before="240" w:after="100"/>
       </w:pPr>
-      <w:bookmarkStart w:id="11" w:name="_Toc13953"/>
+      <w:bookmarkStart w:id="11" w:name="_Toc9593"/>
       <w:r>
         <w:rPr>
           <w:rFonts w:ascii="微软雅黑" w:hAnsi="微软雅黑" w:eastAsia="微软雅黑"/>
@@ -35569,7 +35934,7 @@
         <w:keepNext/>
         <w:spacing w:before="240" w:after="100"/>
       </w:pPr>
-      <w:bookmarkStart w:id="12" w:name="_Toc5025"/>
+      <w:bookmarkStart w:id="12" w:name="_Toc637"/>
       <w:r>
         <w:rPr>
           <w:rFonts w:ascii="微软雅黑" w:hAnsi="微软雅黑" w:eastAsia="微软雅黑"/>
@@ -37525,7 +37890,7 @@
         <w:keepNext/>
         <w:spacing w:before="240" w:after="100"/>
       </w:pPr>
-      <w:bookmarkStart w:id="13" w:name="_Toc8009"/>
+      <w:bookmarkStart w:id="13" w:name="_Toc17522"/>
       <w:r>
         <w:rPr>
           <w:rFonts w:ascii="微软雅黑" w:hAnsi="微软雅黑" w:eastAsia="微软雅黑"/>
@@ -41163,7 +41528,7 @@
         <w:keepNext/>
         <w:spacing w:before="240" w:after="100"/>
       </w:pPr>
-      <w:bookmarkStart w:id="14" w:name="_Toc15141"/>
+      <w:bookmarkStart w:id="14" w:name="_Toc18240"/>
       <w:r>
         <w:rPr>
           <w:rFonts w:ascii="微软雅黑" w:hAnsi="微软雅黑" w:eastAsia="微软雅黑"/>
@@ -42387,7 +42752,7 @@
         <w:keepNext/>
         <w:spacing w:before="240" w:after="100"/>
       </w:pPr>
-      <w:bookmarkStart w:id="15" w:name="_Toc29509"/>
+      <w:bookmarkStart w:id="15" w:name="_Toc10689"/>
       <w:r>
         <w:rPr>
           <w:rFonts w:ascii="微软雅黑" w:hAnsi="微软雅黑" w:eastAsia="微软雅黑"/>
@@ -42580,7 +42945,7 @@
         <w:keepNext/>
         <w:spacing w:before="240" w:after="100"/>
       </w:pPr>
-      <w:bookmarkStart w:id="16" w:name="_Toc3900"/>
+      <w:bookmarkStart w:id="16" w:name="_Toc12974"/>
       <w:r>
         <w:rPr>
           <w:rFonts w:ascii="微软雅黑" w:hAnsi="微软雅黑" w:eastAsia="微软雅黑"/>
@@ -42831,7 +43196,7 @@
         <w:color w:val="7A8492"/>
         <w:sz w:val="16"/>
       </w:rPr>
-      <w:t xml:space="preserve"> 页    ADVP-SRS-001 · v0.2.1</w:t>
+      <w:t xml:space="preserve"> 页    ADVP-SRS-001 · v0.2.4</w:t>
     </w:r>
   </w:p>
 </w:ftr>
@@ -42905,7 +43270,7 @@
         <w:color w:val="7A8492"/>
         <w:sz w:val="17"/>
       </w:rPr>
-      <w:t>ADVP-SRS-001 · v0.2.1</w:t>
+      <w:t>ADVP-SRS-001 · v0.2.4</w:t>
     </w:r>
   </w:p>
 </w:hdr>
@@ -43109,29 +43474,29 @@
     <w:lsdException w:uiPriority="99" w:name="table of authorities"/>
     <w:lsdException w:uiPriority="99" w:semiHidden="0" w:name="macro"/>
     <w:lsdException w:uiPriority="99" w:name="toa heading"/>
-    <w:lsdException w:qFormat="1" w:uiPriority="99" w:semiHidden="0" w:name="List"/>
-    <w:lsdException w:qFormat="1" w:uiPriority="99" w:semiHidden="0" w:name="List Bullet"/>
-    <w:lsdException w:qFormat="1" w:uiPriority="99" w:semiHidden="0" w:name="List Number"/>
-    <w:lsdException w:qFormat="1" w:uiPriority="99" w:semiHidden="0" w:name="List 2"/>
-    <w:lsdException w:qFormat="1" w:uiPriority="99" w:semiHidden="0" w:name="List 3"/>
+    <w:lsdException w:uiPriority="99" w:semiHidden="0" w:name="List"/>
+    <w:lsdException w:uiPriority="99" w:semiHidden="0" w:name="List Bullet"/>
+    <w:lsdException w:uiPriority="99" w:semiHidden="0" w:name="List Number"/>
+    <w:lsdException w:uiPriority="99" w:semiHidden="0" w:name="List 2"/>
+    <w:lsdException w:uiPriority="99" w:semiHidden="0" w:name="List 3"/>
     <w:lsdException w:uiPriority="99" w:name="List 4"/>
     <w:lsdException w:uiPriority="99" w:name="List 5"/>
-    <w:lsdException w:qFormat="1" w:uiPriority="99" w:semiHidden="0" w:name="List Bullet 2"/>
-    <w:lsdException w:qFormat="1" w:uiPriority="99" w:semiHidden="0" w:name="List Bullet 3"/>
+    <w:lsdException w:uiPriority="99" w:semiHidden="0" w:name="List Bullet 2"/>
+    <w:lsdException w:uiPriority="99" w:semiHidden="0" w:name="List Bullet 3"/>
     <w:lsdException w:uiPriority="99" w:name="List Bullet 4"/>
     <w:lsdException w:uiPriority="99" w:name="List Bullet 5"/>
-    <w:lsdException w:qFormat="1" w:uiPriority="99" w:semiHidden="0" w:name="List Number 2"/>
-    <w:lsdException w:qFormat="1" w:uiPriority="99" w:semiHidden="0" w:name="List Number 3"/>
+    <w:lsdException w:uiPriority="99" w:semiHidden="0" w:name="List Number 2"/>
+    <w:lsdException w:uiPriority="99" w:semiHidden="0" w:name="List Number 3"/>
     <w:lsdException w:uiPriority="99" w:name="List Number 4"/>
     <w:lsdException w:uiPriority="99" w:name="List Number 5"/>
     <w:lsdException w:qFormat="1" w:unhideWhenUsed="0" w:uiPriority="10" w:semiHidden="0" w:name="Title"/>
     <w:lsdException w:uiPriority="99" w:name="Closing"/>
     <w:lsdException w:uiPriority="99" w:name="Signature"/>
     <w:lsdException w:uiPriority="1" w:name="Default Paragraph Font"/>
-    <w:lsdException w:qFormat="1" w:uiPriority="99" w:semiHidden="0" w:name="Body Text"/>
+    <w:lsdException w:uiPriority="99" w:semiHidden="0" w:name="Body Text"/>
     <w:lsdException w:uiPriority="99" w:name="Body Text Indent"/>
-    <w:lsdException w:qFormat="1" w:uiPriority="99" w:semiHidden="0" w:name="List Continue"/>
-    <w:lsdException w:qFormat="1" w:uiPriority="99" w:semiHidden="0" w:name="List Continue 2"/>
+    <w:lsdException w:uiPriority="99" w:semiHidden="0" w:name="List Continue"/>
+    <w:lsdException w:uiPriority="99" w:semiHidden="0" w:name="List Continue 2"/>
     <w:lsdException w:uiPriority="99" w:semiHidden="0" w:name="List Continue 3"/>
     <w:lsdException w:uiPriority="99" w:name="List Continue 4"/>
     <w:lsdException w:uiPriority="99" w:name="List Continue 5"/>
@@ -43142,8 +43507,8 @@
     <w:lsdException w:uiPriority="99" w:name="Body Text First Indent"/>
     <w:lsdException w:uiPriority="99" w:name="Body Text First Indent 2"/>
     <w:lsdException w:uiPriority="99" w:name="Note Heading"/>
-    <w:lsdException w:qFormat="1" w:uiPriority="99" w:semiHidden="0" w:name="Body Text 2"/>
-    <w:lsdException w:qFormat="1" w:uiPriority="99" w:semiHidden="0" w:name="Body Text 3"/>
+    <w:lsdException w:uiPriority="99" w:semiHidden="0" w:name="Body Text 2"/>
+    <w:lsdException w:uiPriority="99" w:semiHidden="0" w:name="Body Text 3"/>
     <w:lsdException w:uiPriority="99" w:name="Body Text Indent 2"/>
     <w:lsdException w:uiPriority="99" w:name="Body Text Indent 3"/>
     <w:lsdException w:uiPriority="99" w:name="Block Text"/>
@@ -43165,7 +43530,7 @@
     <w:lsdException w:uiPriority="99" w:name="HTML Sample"/>
     <w:lsdException w:uiPriority="99" w:name="HTML Typewriter"/>
     <w:lsdException w:uiPriority="99" w:name="HTML Variable"/>
-    <w:lsdException w:qFormat="1" w:uiPriority="99" w:name="Normal Table"/>
+    <w:lsdException w:uiPriority="99" w:name="Normal Table"/>
     <w:lsdException w:uiPriority="99" w:name="annotation subject"/>
     <w:lsdException w:uiPriority="99" w:name="Table Simple 1"/>
     <w:lsdException w:uiPriority="99" w:name="Table Simple 2"/>
@@ -43210,7 +43575,7 @@
     <w:lsdException w:uiPriority="99" w:name="Table Web 2"/>
     <w:lsdException w:uiPriority="99" w:name="Table Web 3"/>
     <w:lsdException w:uiPriority="99" w:name="Balloon Text"/>
-    <w:lsdException w:unhideWhenUsed="0" w:uiPriority="59" w:semiHidden="0" w:name="Table Grid"/>
+    <w:lsdException w:qFormat="1" w:unhideWhenUsed="0" w:uiPriority="59" w:semiHidden="0" w:name="Table Grid"/>
     <w:lsdException w:uiPriority="99" w:name="Table Theme"/>
     <w:lsdException w:qFormat="1" w:unhideWhenUsed="0" w:uiPriority="1" w:semiHidden="0" w:name="No Spacing"/>
     <w:lsdException w:unhideWhenUsed="0" w:uiPriority="60" w:semiHidden="0" w:name="Light Shading"/>
@@ -43230,7 +43595,7 @@
     <w:lsdException w:unhideWhenUsed="0" w:uiPriority="60" w:semiHidden="0" w:name="Light Shading Accent 1"/>
     <w:lsdException w:unhideWhenUsed="0" w:uiPriority="61" w:semiHidden="0" w:name="Light List Accent 1"/>
     <w:lsdException w:unhideWhenUsed="0" w:uiPriority="62" w:semiHidden="0" w:name="Light Grid Accent 1"/>
-    <w:lsdException w:unhideWhenUsed="0" w:uiPriority="63" w:semiHidden="0" w:name="Medium Shading 1 Accent 1"/>
+    <w:lsdException w:qFormat="1" w:unhideWhenUsed="0" w:uiPriority="63" w:semiHidden="0" w:name="Medium Shading 1 Accent 1"/>
     <w:lsdException w:unhideWhenUsed="0" w:uiPriority="64" w:semiHidden="0" w:name="Medium Shading 2 Accent 1"/>
     <w:lsdException w:unhideWhenUsed="0" w:uiPriority="65" w:semiHidden="0" w:name="Medium List 1 Accent 1"/>
     <w:lsdException w:qFormat="1" w:unhideWhenUsed="0" w:uiPriority="34" w:semiHidden="0" w:name="List Paragraph"/>
@@ -43297,7 +43662,7 @@
     <w:lsdException w:unhideWhenUsed="0" w:uiPriority="68" w:semiHidden="0" w:name="Medium Grid 2 Accent 5"/>
     <w:lsdException w:unhideWhenUsed="0" w:uiPriority="69" w:semiHidden="0" w:name="Medium Grid 3 Accent 5"/>
     <w:lsdException w:unhideWhenUsed="0" w:uiPriority="70" w:semiHidden="0" w:name="Dark List Accent 5"/>
-    <w:lsdException w:qFormat="1" w:unhideWhenUsed="0" w:uiPriority="71" w:semiHidden="0" w:name="Colorful Shading Accent 5"/>
+    <w:lsdException w:unhideWhenUsed="0" w:uiPriority="71" w:semiHidden="0" w:name="Colorful Shading Accent 5"/>
     <w:lsdException w:unhideWhenUsed="0" w:uiPriority="72" w:semiHidden="0" w:name="Colorful List Accent 5"/>
     <w:lsdException w:unhideWhenUsed="0" w:uiPriority="73" w:semiHidden="0" w:name="Colorful Grid Accent 5"/>
     <w:lsdException w:unhideWhenUsed="0" w:uiPriority="60" w:semiHidden="0" w:name="Light Shading Accent 6"/>
@@ -43562,7 +43927,6 @@
     <w:name w:val="Normal Table"/>
     <w:semiHidden/>
     <w:unhideWhenUsed/>
-    <w:qFormat/>
     <w:uiPriority w:val="99"/>
     <w:tblPr>
       <w:tblCellMar>
@@ -43601,7 +43965,6 @@
     <w:name w:val="List 3"/>
     <w:basedOn w:val="1"/>
     <w:unhideWhenUsed/>
-    <w:qFormat/>
     <w:uiPriority w:val="99"/>
     <w:pPr>
       <w:ind w:left="1080" w:hanging="360"/>
@@ -43612,7 +43975,6 @@
     <w:name w:val="List Number 2"/>
     <w:basedOn w:val="1"/>
     <w:unhideWhenUsed/>
-    <w:qFormat/>
     <w:uiPriority w:val="99"/>
     <w:pPr>
       <w:numPr>
@@ -43626,7 +43988,6 @@
     <w:name w:val="List Number"/>
     <w:basedOn w:val="1"/>
     <w:unhideWhenUsed/>
-    <w:qFormat/>
     <w:uiPriority w:val="99"/>
     <w:pPr>
       <w:numPr>
@@ -43664,7 +44025,6 @@
     <w:name w:val="List Bullet"/>
     <w:basedOn w:val="1"/>
     <w:unhideWhenUsed/>
-    <w:qFormat/>
     <w:uiPriority w:val="99"/>
     <w:pPr>
       <w:numPr>
@@ -43679,7 +44039,6 @@
     <w:basedOn w:val="1"/>
     <w:link w:val="147"/>
     <w:unhideWhenUsed/>
-    <w:qFormat/>
     <w:uiPriority w:val="99"/>
     <w:pPr>
       <w:spacing w:after="120"/>
@@ -43693,7 +44052,6 @@
     <w:name w:val="List Bullet 3"/>
     <w:basedOn w:val="1"/>
     <w:unhideWhenUsed/>
-    <w:qFormat/>
     <w:uiPriority w:val="99"/>
     <w:pPr>
       <w:numPr>
@@ -43708,7 +44066,6 @@
     <w:basedOn w:val="1"/>
     <w:link w:val="145"/>
     <w:unhideWhenUsed/>
-    <w:qFormat/>
     <w:uiPriority w:val="99"/>
     <w:pPr>
       <w:spacing w:after="120"/>
@@ -43718,7 +44075,6 @@
     <w:name w:val="List Number 3"/>
     <w:basedOn w:val="1"/>
     <w:unhideWhenUsed/>
-    <w:qFormat/>
     <w:uiPriority w:val="99"/>
     <w:pPr>
       <w:numPr>
@@ -43732,7 +44088,6 @@
     <w:name w:val="List 2"/>
     <w:basedOn w:val="1"/>
     <w:unhideWhenUsed/>
-    <w:qFormat/>
     <w:uiPriority w:val="99"/>
     <w:pPr>
       <w:ind w:left="720" w:hanging="360"/>
@@ -43743,7 +44098,6 @@
     <w:name w:val="List Continue"/>
     <w:basedOn w:val="1"/>
     <w:unhideWhenUsed/>
-    <w:qFormat/>
     <w:uiPriority w:val="99"/>
     <w:pPr>
       <w:spacing w:after="120"/>
@@ -43755,7 +44109,6 @@
     <w:name w:val="List Bullet 2"/>
     <w:basedOn w:val="1"/>
     <w:unhideWhenUsed/>
-    <w:qFormat/>
     <w:uiPriority w:val="99"/>
     <w:pPr>
       <w:numPr>
@@ -43819,7 +44172,6 @@
     <w:name w:val="List"/>
     <w:basedOn w:val="1"/>
     <w:unhideWhenUsed/>
-    <w:qFormat/>
     <w:uiPriority w:val="99"/>
     <w:pPr>
       <w:ind w:left="360" w:hanging="360"/>
@@ -43842,7 +44194,6 @@
     <w:basedOn w:val="1"/>
     <w:link w:val="146"/>
     <w:unhideWhenUsed/>
-    <w:qFormat/>
     <w:uiPriority w:val="99"/>
     <w:pPr>
       <w:spacing w:after="120" w:line="480" w:lineRule="auto"/>
@@ -43852,7 +44203,6 @@
     <w:name w:val="List Continue 2"/>
     <w:basedOn w:val="1"/>
     <w:unhideWhenUsed/>
-    <w:qFormat/>
     <w:uiPriority w:val="99"/>
     <w:pPr>
       <w:spacing w:after="120"/>
@@ -43897,6 +44247,7 @@
   <w:style w:type="table" w:styleId="34">
     <w:name w:val="Table Grid"/>
     <w:basedOn w:val="33"/>
+    <w:qFormat/>
     <w:uiPriority w:val="59"/>
     <w:pPr>
       <w:spacing w:after="0" w:line="240" w:lineRule="auto"/>
@@ -46254,6 +46605,7 @@
   <w:style w:type="table" w:styleId="57">
     <w:name w:val="Medium Shading 1 Accent 1"/>
     <w:basedOn w:val="33"/>
+    <w:qFormat/>
     <w:uiPriority w:val="63"/>
     <w:pPr>
       <w:spacing w:after="0" w:line="240" w:lineRule="auto"/>
@@ -53713,7 +54065,6 @@
   <w:style w:type="table" w:styleId="117">
     <w:name w:val="Colorful Shading Accent 5"/>
     <w:basedOn w:val="33"/>
-    <w:qFormat/>
     <w:uiPriority w:val="71"/>
     <w:pPr>
       <w:spacing w:after="0" w:line="240" w:lineRule="auto"/>
@@ -55373,7 +55724,6 @@
     <w:name w:val="Heading 1 Char"/>
     <w:basedOn w:val="133"/>
     <w:link w:val="3"/>
-    <w:qFormat/>
     <w:uiPriority w:val="9"/>
     <w:rPr>
       <w:rFonts w:asciiTheme="majorHAnsi" w:hAnsiTheme="majorHAnsi" w:eastAsiaTheme="majorEastAsia" w:cstheme="majorBidi"/>
@@ -55388,7 +55738,6 @@
     <w:name w:val="Heading 2 Char"/>
     <w:basedOn w:val="133"/>
     <w:link w:val="4"/>
-    <w:qFormat/>
     <w:uiPriority w:val="9"/>
     <w:rPr>
       <w:rFonts w:asciiTheme="majorHAnsi" w:hAnsiTheme="majorHAnsi" w:eastAsiaTheme="majorEastAsia" w:cstheme="majorBidi"/>
@@ -55408,7 +55757,6 @@
     <w:name w:val="Heading 3 Char"/>
     <w:basedOn w:val="133"/>
     <w:link w:val="5"/>
-    <w:qFormat/>
     <w:uiPriority w:val="9"/>
     <w:rPr>
       <w:rFonts w:asciiTheme="majorHAnsi" w:hAnsiTheme="majorHAnsi" w:eastAsiaTheme="majorEastAsia" w:cstheme="majorBidi"/>
@@ -55440,7 +55788,6 @@
     <w:name w:val="Subtitle Char"/>
     <w:basedOn w:val="133"/>
     <w:link w:val="26"/>
-    <w:qFormat/>
     <w:uiPriority w:val="11"/>
     <w:rPr>
       <w:rFonts w:asciiTheme="majorHAnsi" w:hAnsiTheme="majorHAnsi" w:eastAsiaTheme="majorEastAsia" w:cstheme="majorBidi"/>
@@ -55471,21 +55818,18 @@
     <w:name w:val="Body Text Char"/>
     <w:basedOn w:val="133"/>
     <w:link w:val="19"/>
-    <w:qFormat/>
     <w:uiPriority w:val="99"/>
   </w:style>
   <w:style w:type="character" w:customStyle="1" w:styleId="146">
     <w:name w:val="Body Text 2 Char"/>
     <w:basedOn w:val="133"/>
     <w:link w:val="29"/>
-    <w:qFormat/>
     <w:uiPriority w:val="99"/>
   </w:style>
   <w:style w:type="character" w:customStyle="1" w:styleId="147">
     <w:name w:val="Body Text 3 Char"/>
     <w:basedOn w:val="133"/>
     <w:link w:val="17"/>
-    <w:qFormat/>
     <w:uiPriority w:val="99"/>
     <w:rPr>
       <w:sz w:val="16"/>
@@ -55496,6 +55840,7 @@
     <w:name w:val="Macro Text Char"/>
     <w:basedOn w:val="133"/>
     <w:link w:val="2"/>
+    <w:qFormat/>
     <w:uiPriority w:val="99"/>
     <w:rPr>
       <w:rFonts w:ascii="Courier" w:hAnsi="Courier"/>
@@ -55525,6 +55870,7 @@
     <w:name w:val="Quote Char"/>
     <w:basedOn w:val="133"/>
     <w:link w:val="149"/>
+    <w:qFormat/>
     <w:uiPriority w:val="29"/>
     <w:rPr>
       <w:i/>
@@ -55542,6 +55888,7 @@
     <w:basedOn w:val="133"/>
     <w:link w:val="6"/>
     <w:semiHidden/>
+    <w:qFormat/>
     <w:uiPriority w:val="9"/>
     <w:rPr>
       <w:rFonts w:asciiTheme="majorHAnsi" w:hAnsiTheme="majorHAnsi" w:eastAsiaTheme="majorEastAsia" w:cstheme="majorBidi"/>
@@ -55562,6 +55909,7 @@
     <w:basedOn w:val="133"/>
     <w:link w:val="7"/>
     <w:semiHidden/>
+    <w:qFormat/>
     <w:uiPriority w:val="9"/>
     <w:rPr>
       <w:rFonts w:asciiTheme="majorHAnsi" w:hAnsiTheme="majorHAnsi" w:eastAsiaTheme="majorEastAsia" w:cstheme="majorBidi"/>
@@ -55573,6 +55921,7 @@
     <w:basedOn w:val="133"/>
     <w:link w:val="8"/>
     <w:semiHidden/>
+    <w:qFormat/>
     <w:uiPriority w:val="9"/>
     <w:rPr>
       <w:rFonts w:asciiTheme="majorHAnsi" w:hAnsiTheme="majorHAnsi" w:eastAsiaTheme="majorEastAsia" w:cstheme="majorBidi"/>
@@ -55674,6 +56023,7 @@
     <w:name w:val="Intense Quote Char"/>
     <w:basedOn w:val="133"/>
     <w:link w:val="157"/>
+    <w:qFormat/>
     <w:uiPriority w:val="30"/>
     <w:rPr>
       <w:b/>

</xml_diff>

<commit_message>
chore(release): public snapshot v0.2.5
</commit_message>
<xml_diff>
--- a/docs/需求说明书.docx
+++ b/docs/需求说明书.docx
@@ -69,7 +69,7 @@
           <w:color w:val="5A6370"/>
           <w:sz w:val="20"/>
         </w:rPr>
-        <w:t>文档编号  ADVP-SRS-001        版本  v0.2.4</w:t>
+        <w:t>文档编号  ADVP-SRS-001        版本  v0.2.5</w:t>
       </w:r>
     </w:p>
     <w:p>
@@ -173,7 +173,7 @@
         <w:rPr>
           <w:rFonts w:ascii="微软雅黑" w:hAnsi="微软雅黑" w:eastAsia="微软雅黑"/>
         </w:rPr>
-        <w:instrText xml:space="preserve"> HYPERLINK \l _Toc29481 </w:instrText>
+        <w:instrText xml:space="preserve"> HYPERLINK \l _Toc27890 </w:instrText>
       </w:r>
       <w:r>
         <w:rPr>
@@ -194,7 +194,7 @@
         <w:fldChar w:fldCharType="begin"/>
       </w:r>
       <w:r>
-        <w:instrText xml:space="preserve"> PAGEREF _Toc29481 \h </w:instrText>
+        <w:instrText xml:space="preserve"> PAGEREF _Toc27890 \h </w:instrText>
       </w:r>
       <w:r>
         <w:fldChar w:fldCharType="separate"/>
@@ -231,7 +231,7 @@
         <w:rPr>
           <w:rFonts w:ascii="微软雅黑" w:hAnsi="微软雅黑" w:eastAsia="微软雅黑"/>
         </w:rPr>
-        <w:instrText xml:space="preserve"> HYPERLINK \l _Toc6066 </w:instrText>
+        <w:instrText xml:space="preserve"> HYPERLINK \l _Toc6122 </w:instrText>
       </w:r>
       <w:r>
         <w:rPr>
@@ -252,13 +252,13 @@
         <w:fldChar w:fldCharType="begin"/>
       </w:r>
       <w:r>
-        <w:instrText xml:space="preserve"> PAGEREF _Toc6066 \h </w:instrText>
+        <w:instrText xml:space="preserve"> PAGEREF _Toc6122 \h </w:instrText>
       </w:r>
       <w:r>
         <w:fldChar w:fldCharType="separate"/>
       </w:r>
       <w:r>
-        <w:t>4</w:t>
+        <w:t>5</w:t>
       </w:r>
       <w:r>
         <w:fldChar w:fldCharType="end"/>
@@ -289,7 +289,7 @@
         <w:rPr>
           <w:rFonts w:ascii="微软雅黑" w:hAnsi="微软雅黑" w:eastAsia="微软雅黑"/>
         </w:rPr>
-        <w:instrText xml:space="preserve"> HYPERLINK \l _Toc24056 </w:instrText>
+        <w:instrText xml:space="preserve"> HYPERLINK \l _Toc8356 </w:instrText>
       </w:r>
       <w:r>
         <w:rPr>
@@ -310,7 +310,7 @@
         <w:fldChar w:fldCharType="begin"/>
       </w:r>
       <w:r>
-        <w:instrText xml:space="preserve"> PAGEREF _Toc24056 \h </w:instrText>
+        <w:instrText xml:space="preserve"> PAGEREF _Toc8356 \h </w:instrText>
       </w:r>
       <w:r>
         <w:fldChar w:fldCharType="separate"/>
@@ -347,7 +347,7 @@
         <w:rPr>
           <w:rFonts w:ascii="微软雅黑" w:hAnsi="微软雅黑" w:eastAsia="微软雅黑"/>
         </w:rPr>
-        <w:instrText xml:space="preserve"> HYPERLINK \l _Toc13173 </w:instrText>
+        <w:instrText xml:space="preserve"> HYPERLINK \l _Toc15683 </w:instrText>
       </w:r>
       <w:r>
         <w:rPr>
@@ -368,7 +368,7 @@
         <w:fldChar w:fldCharType="begin"/>
       </w:r>
       <w:r>
-        <w:instrText xml:space="preserve"> PAGEREF _Toc13173 \h </w:instrText>
+        <w:instrText xml:space="preserve"> PAGEREF _Toc15683 \h </w:instrText>
       </w:r>
       <w:r>
         <w:fldChar w:fldCharType="separate"/>
@@ -405,7 +405,7 @@
         <w:rPr>
           <w:rFonts w:ascii="微软雅黑" w:hAnsi="微软雅黑" w:eastAsia="微软雅黑"/>
         </w:rPr>
-        <w:instrText xml:space="preserve"> HYPERLINK \l _Toc11842 </w:instrText>
+        <w:instrText xml:space="preserve"> HYPERLINK \l _Toc2033 </w:instrText>
       </w:r>
       <w:r>
         <w:rPr>
@@ -426,7 +426,7 @@
         <w:fldChar w:fldCharType="begin"/>
       </w:r>
       <w:r>
-        <w:instrText xml:space="preserve"> PAGEREF _Toc11842 \h </w:instrText>
+        <w:instrText xml:space="preserve"> PAGEREF _Toc2033 \h </w:instrText>
       </w:r>
       <w:r>
         <w:fldChar w:fldCharType="separate"/>
@@ -463,7 +463,7 @@
         <w:rPr>
           <w:rFonts w:ascii="微软雅黑" w:hAnsi="微软雅黑" w:eastAsia="微软雅黑"/>
         </w:rPr>
-        <w:instrText xml:space="preserve"> HYPERLINK \l _Toc12164 </w:instrText>
+        <w:instrText xml:space="preserve"> HYPERLINK \l _Toc14198 </w:instrText>
       </w:r>
       <w:r>
         <w:rPr>
@@ -484,7 +484,7 @@
         <w:fldChar w:fldCharType="begin"/>
       </w:r>
       <w:r>
-        <w:instrText xml:space="preserve"> PAGEREF _Toc12164 \h </w:instrText>
+        <w:instrText xml:space="preserve"> PAGEREF _Toc14198 \h </w:instrText>
       </w:r>
       <w:r>
         <w:fldChar w:fldCharType="separate"/>
@@ -521,7 +521,7 @@
         <w:rPr>
           <w:rFonts w:ascii="微软雅黑" w:hAnsi="微软雅黑" w:eastAsia="微软雅黑"/>
         </w:rPr>
-        <w:instrText xml:space="preserve"> HYPERLINK \l _Toc27760 </w:instrText>
+        <w:instrText xml:space="preserve"> HYPERLINK \l _Toc26279 </w:instrText>
       </w:r>
       <w:r>
         <w:rPr>
@@ -542,7 +542,7 @@
         <w:fldChar w:fldCharType="begin"/>
       </w:r>
       <w:r>
-        <w:instrText xml:space="preserve"> PAGEREF _Toc27760 \h </w:instrText>
+        <w:instrText xml:space="preserve"> PAGEREF _Toc26279 \h </w:instrText>
       </w:r>
       <w:r>
         <w:fldChar w:fldCharType="separate"/>
@@ -579,7 +579,7 @@
         <w:rPr>
           <w:rFonts w:ascii="微软雅黑" w:hAnsi="微软雅黑" w:eastAsia="微软雅黑"/>
         </w:rPr>
-        <w:instrText xml:space="preserve"> HYPERLINK \l _Toc29314 </w:instrText>
+        <w:instrText xml:space="preserve"> HYPERLINK \l _Toc6791 </w:instrText>
       </w:r>
       <w:r>
         <w:rPr>
@@ -600,7 +600,7 @@
         <w:fldChar w:fldCharType="begin"/>
       </w:r>
       <w:r>
-        <w:instrText xml:space="preserve"> PAGEREF _Toc29314 \h </w:instrText>
+        <w:instrText xml:space="preserve"> PAGEREF _Toc6791 \h </w:instrText>
       </w:r>
       <w:r>
         <w:fldChar w:fldCharType="separate"/>
@@ -637,7 +637,7 @@
         <w:rPr>
           <w:rFonts w:ascii="微软雅黑" w:hAnsi="微软雅黑" w:eastAsia="微软雅黑"/>
         </w:rPr>
-        <w:instrText xml:space="preserve"> HYPERLINK \l _Toc27895 </w:instrText>
+        <w:instrText xml:space="preserve"> HYPERLINK \l _Toc2684 </w:instrText>
       </w:r>
       <w:r>
         <w:rPr>
@@ -658,7 +658,7 @@
         <w:fldChar w:fldCharType="begin"/>
       </w:r>
       <w:r>
-        <w:instrText xml:space="preserve"> PAGEREF _Toc27895 \h </w:instrText>
+        <w:instrText xml:space="preserve"> PAGEREF _Toc2684 \h </w:instrText>
       </w:r>
       <w:r>
         <w:fldChar w:fldCharType="separate"/>
@@ -695,7 +695,7 @@
         <w:rPr>
           <w:rFonts w:ascii="微软雅黑" w:hAnsi="微软雅黑" w:eastAsia="微软雅黑"/>
         </w:rPr>
-        <w:instrText xml:space="preserve"> HYPERLINK \l _Toc19977 </w:instrText>
+        <w:instrText xml:space="preserve"> HYPERLINK \l _Toc26635 </w:instrText>
       </w:r>
       <w:r>
         <w:rPr>
@@ -716,7 +716,7 @@
         <w:fldChar w:fldCharType="begin"/>
       </w:r>
       <w:r>
-        <w:instrText xml:space="preserve"> PAGEREF _Toc19977 \h </w:instrText>
+        <w:instrText xml:space="preserve"> PAGEREF _Toc26635 \h </w:instrText>
       </w:r>
       <w:r>
         <w:fldChar w:fldCharType="separate"/>
@@ -753,7 +753,7 @@
         <w:rPr>
           <w:rFonts w:ascii="微软雅黑" w:hAnsi="微软雅黑" w:eastAsia="微软雅黑"/>
         </w:rPr>
-        <w:instrText xml:space="preserve"> HYPERLINK \l _Toc5686 </w:instrText>
+        <w:instrText xml:space="preserve"> HYPERLINK \l _Toc5768 </w:instrText>
       </w:r>
       <w:r>
         <w:rPr>
@@ -774,7 +774,7 @@
         <w:fldChar w:fldCharType="begin"/>
       </w:r>
       <w:r>
-        <w:instrText xml:space="preserve"> PAGEREF _Toc5686 \h </w:instrText>
+        <w:instrText xml:space="preserve"> PAGEREF _Toc5768 \h </w:instrText>
       </w:r>
       <w:r>
         <w:fldChar w:fldCharType="separate"/>
@@ -811,7 +811,7 @@
         <w:rPr>
           <w:rFonts w:ascii="微软雅黑" w:hAnsi="微软雅黑" w:eastAsia="微软雅黑"/>
         </w:rPr>
-        <w:instrText xml:space="preserve"> HYPERLINK \l _Toc9593 </w:instrText>
+        <w:instrText xml:space="preserve"> HYPERLINK \l _Toc1862 </w:instrText>
       </w:r>
       <w:r>
         <w:rPr>
@@ -832,7 +832,7 @@
         <w:fldChar w:fldCharType="begin"/>
       </w:r>
       <w:r>
-        <w:instrText xml:space="preserve"> PAGEREF _Toc9593 \h </w:instrText>
+        <w:instrText xml:space="preserve"> PAGEREF _Toc1862 \h </w:instrText>
       </w:r>
       <w:r>
         <w:fldChar w:fldCharType="separate"/>
@@ -869,7 +869,7 @@
         <w:rPr>
           <w:rFonts w:ascii="微软雅黑" w:hAnsi="微软雅黑" w:eastAsia="微软雅黑"/>
         </w:rPr>
-        <w:instrText xml:space="preserve"> HYPERLINK \l _Toc637 </w:instrText>
+        <w:instrText xml:space="preserve"> HYPERLINK \l _Toc2906 </w:instrText>
       </w:r>
       <w:r>
         <w:rPr>
@@ -890,7 +890,7 @@
         <w:fldChar w:fldCharType="begin"/>
       </w:r>
       <w:r>
-        <w:instrText xml:space="preserve"> PAGEREF _Toc637 \h </w:instrText>
+        <w:instrText xml:space="preserve"> PAGEREF _Toc2906 \h </w:instrText>
       </w:r>
       <w:r>
         <w:fldChar w:fldCharType="separate"/>
@@ -927,7 +927,7 @@
         <w:rPr>
           <w:rFonts w:ascii="微软雅黑" w:hAnsi="微软雅黑" w:eastAsia="微软雅黑"/>
         </w:rPr>
-        <w:instrText xml:space="preserve"> HYPERLINK \l _Toc17522 </w:instrText>
+        <w:instrText xml:space="preserve"> HYPERLINK \l _Toc23398 </w:instrText>
       </w:r>
       <w:r>
         <w:rPr>
@@ -948,7 +948,7 @@
         <w:fldChar w:fldCharType="begin"/>
       </w:r>
       <w:r>
-        <w:instrText xml:space="preserve"> PAGEREF _Toc17522 \h </w:instrText>
+        <w:instrText xml:space="preserve"> PAGEREF _Toc23398 \h </w:instrText>
       </w:r>
       <w:r>
         <w:fldChar w:fldCharType="separate"/>
@@ -985,7 +985,7 @@
         <w:rPr>
           <w:rFonts w:ascii="微软雅黑" w:hAnsi="微软雅黑" w:eastAsia="微软雅黑"/>
         </w:rPr>
-        <w:instrText xml:space="preserve"> HYPERLINK \l _Toc18240 </w:instrText>
+        <w:instrText xml:space="preserve"> HYPERLINK \l _Toc30944 </w:instrText>
       </w:r>
       <w:r>
         <w:rPr>
@@ -1006,7 +1006,7 @@
         <w:fldChar w:fldCharType="begin"/>
       </w:r>
       <w:r>
-        <w:instrText xml:space="preserve"> PAGEREF _Toc18240 \h </w:instrText>
+        <w:instrText xml:space="preserve"> PAGEREF _Toc30944 \h </w:instrText>
       </w:r>
       <w:r>
         <w:fldChar w:fldCharType="separate"/>
@@ -1043,7 +1043,7 @@
         <w:rPr>
           <w:rFonts w:ascii="微软雅黑" w:hAnsi="微软雅黑" w:eastAsia="微软雅黑"/>
         </w:rPr>
-        <w:instrText xml:space="preserve"> HYPERLINK \l _Toc10689 </w:instrText>
+        <w:instrText xml:space="preserve"> HYPERLINK \l _Toc20550 </w:instrText>
       </w:r>
       <w:r>
         <w:rPr>
@@ -1064,7 +1064,7 @@
         <w:fldChar w:fldCharType="begin"/>
       </w:r>
       <w:r>
-        <w:instrText xml:space="preserve"> PAGEREF _Toc10689 \h </w:instrText>
+        <w:instrText xml:space="preserve"> PAGEREF _Toc20550 \h </w:instrText>
       </w:r>
       <w:r>
         <w:fldChar w:fldCharType="separate"/>
@@ -1101,7 +1101,7 @@
         <w:rPr>
           <w:rFonts w:ascii="微软雅黑" w:hAnsi="微软雅黑" w:eastAsia="微软雅黑"/>
         </w:rPr>
-        <w:instrText xml:space="preserve"> HYPERLINK \l _Toc12974 </w:instrText>
+        <w:instrText xml:space="preserve"> HYPERLINK \l _Toc28805 </w:instrText>
       </w:r>
       <w:r>
         <w:rPr>
@@ -1122,7 +1122,7 @@
         <w:fldChar w:fldCharType="begin"/>
       </w:r>
       <w:r>
-        <w:instrText xml:space="preserve"> PAGEREF _Toc12974 \h </w:instrText>
+        <w:instrText xml:space="preserve"> PAGEREF _Toc28805 \h </w:instrText>
       </w:r>
       <w:r>
         <w:fldChar w:fldCharType="separate"/>
@@ -1161,7 +1161,7 @@
         <w:keepNext/>
         <w:spacing w:before="240" w:after="100"/>
       </w:pPr>
-      <w:bookmarkStart w:id="0" w:name="_Toc29481"/>
+      <w:bookmarkStart w:id="0" w:name="_Toc27890"/>
       <w:r>
         <w:rPr>
           <w:rFonts w:ascii="微软雅黑" w:hAnsi="微软雅黑" w:eastAsia="微软雅黑"/>
@@ -1434,7 +1434,7 @@
                 <w:color w:val="242A33"/>
                 <w:sz w:val="16"/>
               </w:rPr>
-              <w:t>v0.2.4</w:t>
+              <w:t>v0.2.5</w:t>
             </w:r>
           </w:p>
         </w:tc>
@@ -1920,12 +1920,6 @@
             <w:insideH w:val="single" w:color="auto" w:sz="4" w:space="0"/>
             <w:insideV w:val="single" w:color="auto" w:sz="4" w:space="0"/>
           </w:tblBorders>
-          <w:tblCellMar>
-            <w:top w:w="40" w:type="dxa"/>
-            <w:left w:w="70" w:type="dxa"/>
-            <w:bottom w:w="40" w:type="dxa"/>
-            <w:right w:w="70" w:type="dxa"/>
-          </w:tblCellMar>
         </w:tblPrEx>
         <w:trPr>
           <w:tblHeader/>
@@ -2067,7 +2061,7 @@
                 <w:color w:val="242A33"/>
                 <w:sz w:val="16"/>
               </w:rPr>
-              <w:t>v0.2.4</w:t>
+              <w:t>v0.2.5</w:t>
             </w:r>
           </w:p>
         </w:tc>
@@ -2105,7 +2099,7 @@
                 <w:color w:val="242A33"/>
                 <w:sz w:val="16"/>
               </w:rPr>
-              <w:t>fix(ci): force UTF-8 Python output on Windows runners</w:t>
+              <w:t>docs(log): add 2026-10-22 development work record</w:t>
             </w:r>
           </w:p>
         </w:tc>
@@ -2184,7 +2178,7 @@
                 <w:color w:val="242A33"/>
                 <w:sz w:val="16"/>
               </w:rPr>
-              <w:t>v0.2.3</w:t>
+              <w:t>v0.2.4</w:t>
             </w:r>
           </w:p>
         </w:tc>
@@ -2224,7 +2218,7 @@
                 <w:color w:val="242A33"/>
                 <w:sz w:val="16"/>
               </w:rPr>
-              <w:t>fix(ci): replace Windows-incompatible lychee action with local link checker</w:t>
+              <w:t>fix(ci): force UTF-8 Python output on Windows runners</w:t>
             </w:r>
           </w:p>
         </w:tc>
@@ -2304,7 +2298,7 @@
                 <w:color w:val="242A33"/>
                 <w:sz w:val="16"/>
               </w:rPr>
-              <w:t>v0.2.2</w:t>
+              <w:t>v0.2.3</w:t>
             </w:r>
           </w:p>
         </w:tc>
@@ -2342,7 +2336,7 @@
                 <w:color w:val="242A33"/>
                 <w:sz w:val="16"/>
               </w:rPr>
-              <w:t>fix(ci): correct frontend working-directory and document private protection limit</w:t>
+              <w:t>fix(ci): replace Windows-incompatible lychee action with local link checker</w:t>
             </w:r>
           </w:p>
         </w:tc>
@@ -2421,7 +2415,7 @@
                 <w:color w:val="242A33"/>
                 <w:sz w:val="16"/>
               </w:rPr>
-              <w:t>v0.2.1</w:t>
+              <w:t>v0.2.2</w:t>
             </w:r>
           </w:p>
         </w:tc>
@@ -2441,7 +2435,7 @@
                 <w:color w:val="242A33"/>
                 <w:sz w:val="16"/>
               </w:rPr>
-              <w:t>2026-10-22</w:t>
+              <w:t>2026-10-23</w:t>
             </w:r>
           </w:p>
         </w:tc>
@@ -2461,7 +2455,7 @@
                 <w:color w:val="242A33"/>
                 <w:sz w:val="16"/>
               </w:rPr>
-              <w:t>docs(repo): add GitHub publication guide and ignore local agent state</w:t>
+              <w:t>fix(ci): correct frontend working-directory and document private protection limit</w:t>
             </w:r>
           </w:p>
         </w:tc>
@@ -2541,7 +2535,7 @@
                 <w:color w:val="242A33"/>
                 <w:sz w:val="16"/>
               </w:rPr>
-              <w:t>v0.2.0</w:t>
+              <w:t>v0.2.1</w:t>
             </w:r>
           </w:p>
         </w:tc>
@@ -2579,7 +2573,7 @@
                 <w:color w:val="242A33"/>
                 <w:sz w:val="16"/>
               </w:rPr>
-              <w:t>feat(scope): adopt Apache-2.0, Kafka-required stream, single-dev 40-48 week plan</w:t>
+              <w:t>docs(repo): add GitHub publication guide and ignore local agent state</w:t>
             </w:r>
           </w:p>
         </w:tc>
@@ -2658,7 +2652,7 @@
                 <w:color w:val="242A33"/>
                 <w:sz w:val="16"/>
               </w:rPr>
-              <w:t>v0.1.1</w:t>
+              <w:t>v0.2.0</w:t>
             </w:r>
           </w:p>
         </w:tc>
@@ -2698,7 +2692,7 @@
                 <w:color w:val="242A33"/>
                 <w:sz w:val="16"/>
               </w:rPr>
-              <w:t>fix(repo): sanitize public export paths and checks</w:t>
+              <w:t>feat(scope): adopt Apache-2.0, Kafka-required stream, single-dev 40-48 week plan</w:t>
             </w:r>
           </w:p>
         </w:tc>
@@ -2778,6 +2772,123 @@
                 <w:color w:val="242A33"/>
                 <w:sz w:val="16"/>
               </w:rPr>
+              <w:t>v0.1.1</w:t>
+            </w:r>
+          </w:p>
+        </w:tc>
+        <w:tc>
+          <w:tcPr>
+            <w:tcW w:w="1928" w:type="dxa"/>
+          </w:tcPr>
+          <w:p>
+            <w:pPr>
+              <w:spacing w:before="20" w:after="20"/>
+            </w:pPr>
+            <w:r>
+              <w:rPr>
+                <w:rFonts w:ascii="微软雅黑" w:hAnsi="微软雅黑" w:eastAsia="微软雅黑"/>
+                <w:b w:val="0"/>
+                <w:color w:val="242A33"/>
+                <w:sz w:val="16"/>
+              </w:rPr>
+              <w:t>2026-10-22</w:t>
+            </w:r>
+          </w:p>
+        </w:tc>
+        <w:tc>
+          <w:tcPr>
+            <w:tcW w:w="1928" w:type="dxa"/>
+          </w:tcPr>
+          <w:p>
+            <w:pPr>
+              <w:spacing w:before="20" w:after="20"/>
+            </w:pPr>
+            <w:r>
+              <w:rPr>
+                <w:rFonts w:ascii="微软雅黑" w:hAnsi="微软雅黑" w:eastAsia="微软雅黑"/>
+                <w:b w:val="0"/>
+                <w:color w:val="242A33"/>
+                <w:sz w:val="16"/>
+              </w:rPr>
+              <w:t>fix(repo): sanitize public export paths and checks</w:t>
+            </w:r>
+          </w:p>
+        </w:tc>
+        <w:tc>
+          <w:tcPr>
+            <w:tcW w:w="1928" w:type="dxa"/>
+          </w:tcPr>
+          <w:p>
+            <w:pPr>
+              <w:spacing w:before="20" w:after="20"/>
+            </w:pPr>
+            <w:r>
+              <w:rPr>
+                <w:rFonts w:ascii="微软雅黑" w:hAnsi="微软雅黑" w:eastAsia="微软雅黑"/>
+                <w:b w:val="0"/>
+                <w:color w:val="242A33"/>
+                <w:sz w:val="16"/>
+              </w:rPr>
+              <w:t>ADVP 项目组</w:t>
+            </w:r>
+          </w:p>
+        </w:tc>
+        <w:tc>
+          <w:tcPr>
+            <w:tcW w:w="1928" w:type="dxa"/>
+          </w:tcPr>
+          <w:p>
+            <w:pPr>
+              <w:spacing w:before="20" w:after="20"/>
+            </w:pPr>
+            <w:r>
+              <w:rPr>
+                <w:rFonts w:ascii="微软雅黑" w:hAnsi="微软雅黑" w:eastAsia="微软雅黑"/>
+                <w:b w:val="0"/>
+                <w:color w:val="242A33"/>
+                <w:sz w:val="16"/>
+              </w:rPr>
+              <w:t>待确认</w:t>
+            </w:r>
+          </w:p>
+        </w:tc>
+      </w:tr>
+      <w:tr>
+        <w:tblPrEx>
+          <w:tblBorders>
+            <w:top w:val="single" w:color="auto" w:sz="4" w:space="0"/>
+            <w:left w:val="single" w:color="auto" w:sz="4" w:space="0"/>
+            <w:bottom w:val="single" w:color="auto" w:sz="4" w:space="0"/>
+            <w:right w:val="single" w:color="auto" w:sz="4" w:space="0"/>
+            <w:insideH w:val="single" w:color="auto" w:sz="4" w:space="0"/>
+            <w:insideV w:val="single" w:color="auto" w:sz="4" w:space="0"/>
+          </w:tblBorders>
+          <w:tblCellMar>
+            <w:top w:w="40" w:type="dxa"/>
+            <w:left w:w="70" w:type="dxa"/>
+            <w:bottom w:w="40" w:type="dxa"/>
+            <w:right w:w="70" w:type="dxa"/>
+          </w:tblCellMar>
+        </w:tblPrEx>
+        <w:trPr>
+          <w:jc w:val="center"/>
+        </w:trPr>
+        <w:tc>
+          <w:tcPr>
+            <w:tcW w:w="1928" w:type="dxa"/>
+            <w:shd w:val="clear" w:color="auto" w:fill="F5F7FA"/>
+          </w:tcPr>
+          <w:p>
+            <w:pPr>
+              <w:spacing w:before="20" w:after="20"/>
+            </w:pPr>
+            <w:r>
+              <w:rPr>
+                <w:rFonts w:ascii="微软雅黑" w:hAnsi="微软雅黑" w:eastAsia="微软雅黑"/>
+                <w:b w:val="0"/>
+                <w:color w:val="242A33"/>
+                <w:sz w:val="16"/>
+              </w:rPr>
               <w:t>v0.1.0</w:t>
             </w:r>
           </w:p>
@@ -2785,6 +2896,7 @@
         <w:tc>
           <w:tcPr>
             <w:tcW w:w="1928" w:type="dxa"/>
+            <w:shd w:val="clear" w:color="auto" w:fill="F5F7FA"/>
           </w:tcPr>
           <w:p>
             <w:pPr>
@@ -2804,6 +2916,7 @@
         <w:tc>
           <w:tcPr>
             <w:tcW w:w="1928" w:type="dxa"/>
+            <w:shd w:val="clear" w:color="auto" w:fill="F5F7FA"/>
           </w:tcPr>
           <w:p>
             <w:pPr>
@@ -2823,6 +2936,7 @@
         <w:tc>
           <w:tcPr>
             <w:tcW w:w="1928" w:type="dxa"/>
+            <w:shd w:val="clear" w:color="auto" w:fill="F5F7FA"/>
           </w:tcPr>
           <w:p>
             <w:pPr>
@@ -2842,6 +2956,7 @@
         <w:tc>
           <w:tcPr>
             <w:tcW w:w="1928" w:type="dxa"/>
+            <w:shd w:val="clear" w:color="auto" w:fill="F5F7FA"/>
           </w:tcPr>
           <w:p>
             <w:pPr>
@@ -3203,7 +3318,7 @@
         <w:keepNext/>
         <w:spacing w:before="240" w:after="100"/>
       </w:pPr>
-      <w:bookmarkStart w:id="1" w:name="_Toc6066"/>
+      <w:bookmarkStart w:id="1" w:name="_Toc6122"/>
       <w:r>
         <w:rPr>
           <w:rFonts w:ascii="微软雅黑" w:hAnsi="微软雅黑" w:eastAsia="微软雅黑"/>
@@ -4776,7 +4891,7 @@
         <w:keepNext/>
         <w:spacing w:before="240" w:after="100"/>
       </w:pPr>
-      <w:bookmarkStart w:id="2" w:name="_Toc24056"/>
+      <w:bookmarkStart w:id="2" w:name="_Toc8356"/>
       <w:r>
         <w:rPr>
           <w:rFonts w:ascii="微软雅黑" w:hAnsi="微软雅黑" w:eastAsia="微软雅黑"/>
@@ -7282,7 +7397,7 @@
         <w:keepNext/>
         <w:spacing w:before="240" w:after="100"/>
       </w:pPr>
-      <w:bookmarkStart w:id="3" w:name="_Toc13173"/>
+      <w:bookmarkStart w:id="3" w:name="_Toc15683"/>
       <w:r>
         <w:rPr>
           <w:rFonts w:ascii="微软雅黑" w:hAnsi="微软雅黑" w:eastAsia="微软雅黑"/>
@@ -21494,6 +21609,12 @@
             <w:insideH w:val="single" w:color="auto" w:sz="4" w:space="0"/>
             <w:insideV w:val="single" w:color="auto" w:sz="4" w:space="0"/>
           </w:tblBorders>
+          <w:tblCellMar>
+            <w:top w:w="40" w:type="dxa"/>
+            <w:left w:w="70" w:type="dxa"/>
+            <w:bottom w:w="40" w:type="dxa"/>
+            <w:right w:w="70" w:type="dxa"/>
+          </w:tblCellMar>
         </w:tblPrEx>
         <w:trPr>
           <w:tblHeader/>
@@ -22856,7 +22977,7 @@
         <w:keepNext/>
         <w:spacing w:before="240" w:after="100"/>
       </w:pPr>
-      <w:bookmarkStart w:id="4" w:name="_Toc11842"/>
+      <w:bookmarkStart w:id="4" w:name="_Toc2033"/>
       <w:r>
         <w:rPr>
           <w:rFonts w:ascii="微软雅黑" w:hAnsi="微软雅黑" w:eastAsia="微软雅黑"/>
@@ -26759,7 +26880,7 @@
         <w:keepNext/>
         <w:spacing w:before="240" w:after="100"/>
       </w:pPr>
-      <w:bookmarkStart w:id="5" w:name="_Toc12164"/>
+      <w:bookmarkStart w:id="5" w:name="_Toc14198"/>
       <w:r>
         <w:rPr>
           <w:rFonts w:ascii="微软雅黑" w:hAnsi="微软雅黑" w:eastAsia="微软雅黑"/>
@@ -29205,7 +29326,7 @@
         <w:keepNext/>
         <w:spacing w:before="240" w:after="100"/>
       </w:pPr>
-      <w:bookmarkStart w:id="6" w:name="_Toc27760"/>
+      <w:bookmarkStart w:id="6" w:name="_Toc26279"/>
       <w:r>
         <w:rPr>
           <w:rFonts w:ascii="微软雅黑" w:hAnsi="微软雅黑" w:eastAsia="微软雅黑"/>
@@ -29904,7 +30025,7 @@
         <w:keepNext/>
         <w:spacing w:before="240" w:after="100"/>
       </w:pPr>
-      <w:bookmarkStart w:id="7" w:name="_Toc29314"/>
+      <w:bookmarkStart w:id="7" w:name="_Toc6791"/>
       <w:r>
         <w:rPr>
           <w:rFonts w:ascii="微软雅黑" w:hAnsi="微软雅黑" w:eastAsia="微软雅黑"/>
@@ -31979,7 +32100,7 @@
         <w:keepNext/>
         <w:spacing w:before="240" w:after="100"/>
       </w:pPr>
-      <w:bookmarkStart w:id="8" w:name="_Toc27895"/>
+      <w:bookmarkStart w:id="8" w:name="_Toc2684"/>
       <w:r>
         <w:rPr>
           <w:rFonts w:ascii="微软雅黑" w:hAnsi="微软雅黑" w:eastAsia="微软雅黑"/>
@@ -33148,7 +33269,7 @@
         <w:keepNext/>
         <w:spacing w:before="240" w:after="100"/>
       </w:pPr>
-      <w:bookmarkStart w:id="9" w:name="_Toc19977"/>
+      <w:bookmarkStart w:id="9" w:name="_Toc26635"/>
       <w:r>
         <w:rPr>
           <w:rFonts w:ascii="微软雅黑" w:hAnsi="微软雅黑" w:eastAsia="微软雅黑"/>
@@ -33676,7 +33797,7 @@
         <w:keepNext/>
         <w:spacing w:before="240" w:after="100"/>
       </w:pPr>
-      <w:bookmarkStart w:id="10" w:name="_Toc5686"/>
+      <w:bookmarkStart w:id="10" w:name="_Toc5768"/>
       <w:r>
         <w:rPr>
           <w:rFonts w:ascii="微软雅黑" w:hAnsi="微软雅黑" w:eastAsia="微软雅黑"/>
@@ -34567,7 +34688,7 @@
         <w:keepNext/>
         <w:spacing w:before="240" w:after="100"/>
       </w:pPr>
-      <w:bookmarkStart w:id="11" w:name="_Toc9593"/>
+      <w:bookmarkStart w:id="11" w:name="_Toc1862"/>
       <w:r>
         <w:rPr>
           <w:rFonts w:ascii="微软雅黑" w:hAnsi="微软雅黑" w:eastAsia="微软雅黑"/>
@@ -35934,7 +36055,7 @@
         <w:keepNext/>
         <w:spacing w:before="240" w:after="100"/>
       </w:pPr>
-      <w:bookmarkStart w:id="12" w:name="_Toc637"/>
+      <w:bookmarkStart w:id="12" w:name="_Toc2906"/>
       <w:r>
         <w:rPr>
           <w:rFonts w:ascii="微软雅黑" w:hAnsi="微软雅黑" w:eastAsia="微软雅黑"/>
@@ -37890,7 +38011,7 @@
         <w:keepNext/>
         <w:spacing w:before="240" w:after="100"/>
       </w:pPr>
-      <w:bookmarkStart w:id="13" w:name="_Toc17522"/>
+      <w:bookmarkStart w:id="13" w:name="_Toc23398"/>
       <w:r>
         <w:rPr>
           <w:rFonts w:ascii="微软雅黑" w:hAnsi="微软雅黑" w:eastAsia="微软雅黑"/>
@@ -41528,7 +41649,7 @@
         <w:keepNext/>
         <w:spacing w:before="240" w:after="100"/>
       </w:pPr>
-      <w:bookmarkStart w:id="14" w:name="_Toc18240"/>
+      <w:bookmarkStart w:id="14" w:name="_Toc30944"/>
       <w:r>
         <w:rPr>
           <w:rFonts w:ascii="微软雅黑" w:hAnsi="微软雅黑" w:eastAsia="微软雅黑"/>
@@ -41577,12 +41698,6 @@
             <w:insideH w:val="single" w:color="auto" w:sz="4" w:space="0"/>
             <w:insideV w:val="single" w:color="auto" w:sz="4" w:space="0"/>
           </w:tblBorders>
-          <w:tblCellMar>
-            <w:top w:w="40" w:type="dxa"/>
-            <w:left w:w="70" w:type="dxa"/>
-            <w:bottom w:w="40" w:type="dxa"/>
-            <w:right w:w="70" w:type="dxa"/>
-          </w:tblCellMar>
         </w:tblPrEx>
         <w:trPr>
           <w:tblHeader/>
@@ -42752,7 +42867,7 @@
         <w:keepNext/>
         <w:spacing w:before="240" w:after="100"/>
       </w:pPr>
-      <w:bookmarkStart w:id="15" w:name="_Toc10689"/>
+      <w:bookmarkStart w:id="15" w:name="_Toc20550"/>
       <w:r>
         <w:rPr>
           <w:rFonts w:ascii="微软雅黑" w:hAnsi="微软雅黑" w:eastAsia="微软雅黑"/>
@@ -42945,7 +43060,7 @@
         <w:keepNext/>
         <w:spacing w:before="240" w:after="100"/>
       </w:pPr>
-      <w:bookmarkStart w:id="16" w:name="_Toc12974"/>
+      <w:bookmarkStart w:id="16" w:name="_Toc28805"/>
       <w:r>
         <w:rPr>
           <w:rFonts w:ascii="微软雅黑" w:hAnsi="微软雅黑" w:eastAsia="微软雅黑"/>
@@ -43196,7 +43311,7 @@
         <w:color w:val="7A8492"/>
         <w:sz w:val="16"/>
       </w:rPr>
-      <w:t xml:space="preserve"> 页    ADVP-SRS-001 · v0.2.4</w:t>
+      <w:t xml:space="preserve"> 页    ADVP-SRS-001 · v0.2.5</w:t>
     </w:r>
   </w:p>
 </w:ftr>
@@ -43270,7 +43385,7 @@
         <w:color w:val="7A8492"/>
         <w:sz w:val="17"/>
       </w:rPr>
-      <w:t>ADVP-SRS-001 · v0.2.4</w:t>
+      <w:t>ADVP-SRS-001 · v0.2.5</w:t>
     </w:r>
   </w:p>
 </w:hdr>
@@ -43575,7 +43690,7 @@
     <w:lsdException w:uiPriority="99" w:name="Table Web 2"/>
     <w:lsdException w:uiPriority="99" w:name="Table Web 3"/>
     <w:lsdException w:uiPriority="99" w:name="Balloon Text"/>
-    <w:lsdException w:qFormat="1" w:unhideWhenUsed="0" w:uiPriority="59" w:semiHidden="0" w:name="Table Grid"/>
+    <w:lsdException w:unhideWhenUsed="0" w:uiPriority="59" w:semiHidden="0" w:name="Table Grid"/>
     <w:lsdException w:uiPriority="99" w:name="Table Theme"/>
     <w:lsdException w:qFormat="1" w:unhideWhenUsed="0" w:uiPriority="1" w:semiHidden="0" w:name="No Spacing"/>
     <w:lsdException w:unhideWhenUsed="0" w:uiPriority="60" w:semiHidden="0" w:name="Light Shading"/>
@@ -43595,7 +43710,7 @@
     <w:lsdException w:unhideWhenUsed="0" w:uiPriority="60" w:semiHidden="0" w:name="Light Shading Accent 1"/>
     <w:lsdException w:unhideWhenUsed="0" w:uiPriority="61" w:semiHidden="0" w:name="Light List Accent 1"/>
     <w:lsdException w:unhideWhenUsed="0" w:uiPriority="62" w:semiHidden="0" w:name="Light Grid Accent 1"/>
-    <w:lsdException w:qFormat="1" w:unhideWhenUsed="0" w:uiPriority="63" w:semiHidden="0" w:name="Medium Shading 1 Accent 1"/>
+    <w:lsdException w:unhideWhenUsed="0" w:uiPriority="63" w:semiHidden="0" w:name="Medium Shading 1 Accent 1"/>
     <w:lsdException w:unhideWhenUsed="0" w:uiPriority="64" w:semiHidden="0" w:name="Medium Shading 2 Accent 1"/>
     <w:lsdException w:unhideWhenUsed="0" w:uiPriority="65" w:semiHidden="0" w:name="Medium List 1 Accent 1"/>
     <w:lsdException w:qFormat="1" w:unhideWhenUsed="0" w:uiPriority="34" w:semiHidden="0" w:name="List Paragraph"/>
@@ -43626,8 +43741,8 @@
     <w:lsdException w:unhideWhenUsed="0" w:uiPriority="60" w:semiHidden="0" w:name="Light Shading Accent 3"/>
     <w:lsdException w:unhideWhenUsed="0" w:uiPriority="61" w:semiHidden="0" w:name="Light List Accent 3"/>
     <w:lsdException w:unhideWhenUsed="0" w:uiPriority="62" w:semiHidden="0" w:name="Light Grid Accent 3"/>
-    <w:lsdException w:unhideWhenUsed="0" w:uiPriority="63" w:semiHidden="0" w:name="Medium Shading 1 Accent 3"/>
-    <w:lsdException w:unhideWhenUsed="0" w:uiPriority="64" w:semiHidden="0" w:name="Medium Shading 2 Accent 3"/>
+    <w:lsdException w:qFormat="1" w:unhideWhenUsed="0" w:uiPriority="63" w:semiHidden="0" w:name="Medium Shading 1 Accent 3"/>
+    <w:lsdException w:qFormat="1" w:unhideWhenUsed="0" w:uiPriority="64" w:semiHidden="0" w:name="Medium Shading 2 Accent 3"/>
     <w:lsdException w:unhideWhenUsed="0" w:uiPriority="65" w:semiHidden="0" w:name="Medium List 1 Accent 3"/>
     <w:lsdException w:unhideWhenUsed="0" w:uiPriority="66" w:semiHidden="0" w:name="Medium List 2 Accent 3"/>
     <w:lsdException w:unhideWhenUsed="0" w:uiPriority="67" w:semiHidden="0" w:name="Medium Grid 1 Accent 3"/>
@@ -44247,7 +44362,6 @@
   <w:style w:type="table" w:styleId="34">
     <w:name w:val="Table Grid"/>
     <w:basedOn w:val="33"/>
-    <w:qFormat/>
     <w:uiPriority w:val="59"/>
     <w:pPr>
       <w:spacing w:after="0" w:line="240" w:lineRule="auto"/>
@@ -46605,7 +46719,6 @@
   <w:style w:type="table" w:styleId="57">
     <w:name w:val="Medium Shading 1 Accent 1"/>
     <w:basedOn w:val="33"/>
-    <w:qFormat/>
     <w:uiPriority w:val="63"/>
     <w:pPr>
       <w:spacing w:after="0" w:line="240" w:lineRule="auto"/>
@@ -46820,6 +46933,7 @@
   <w:style w:type="table" w:styleId="59">
     <w:name w:val="Medium Shading 1 Accent 3"/>
     <w:basedOn w:val="33"/>
+    <w:qFormat/>
     <w:uiPriority w:val="63"/>
     <w:pPr>
       <w:spacing w:after="0" w:line="240" w:lineRule="auto"/>
@@ -47743,6 +47857,7 @@
   <w:style w:type="table" w:styleId="66">
     <w:name w:val="Medium Shading 2 Accent 3"/>
     <w:basedOn w:val="33"/>
+    <w:qFormat/>
     <w:uiPriority w:val="64"/>
     <w:pPr>
       <w:spacing w:after="0" w:line="240" w:lineRule="auto"/>
@@ -55840,7 +55955,6 @@
     <w:name w:val="Macro Text Char"/>
     <w:basedOn w:val="133"/>
     <w:link w:val="2"/>
-    <w:qFormat/>
     <w:uiPriority w:val="99"/>
     <w:rPr>
       <w:rFonts w:ascii="Courier" w:hAnsi="Courier"/>
@@ -55870,7 +55984,6 @@
     <w:name w:val="Quote Char"/>
     <w:basedOn w:val="133"/>
     <w:link w:val="149"/>
-    <w:qFormat/>
     <w:uiPriority w:val="29"/>
     <w:rPr>
       <w:i/>
@@ -55888,7 +56001,6 @@
     <w:basedOn w:val="133"/>
     <w:link w:val="6"/>
     <w:semiHidden/>
-    <w:qFormat/>
     <w:uiPriority w:val="9"/>
     <w:rPr>
       <w:rFonts w:asciiTheme="majorHAnsi" w:hAnsiTheme="majorHAnsi" w:eastAsiaTheme="majorEastAsia" w:cstheme="majorBidi"/>
@@ -55909,7 +56021,6 @@
     <w:basedOn w:val="133"/>
     <w:link w:val="7"/>
     <w:semiHidden/>
-    <w:qFormat/>
     <w:uiPriority w:val="9"/>
     <w:rPr>
       <w:rFonts w:asciiTheme="majorHAnsi" w:hAnsiTheme="majorHAnsi" w:eastAsiaTheme="majorEastAsia" w:cstheme="majorBidi"/>
@@ -55921,7 +56032,6 @@
     <w:basedOn w:val="133"/>
     <w:link w:val="8"/>
     <w:semiHidden/>
-    <w:qFormat/>
     <w:uiPriority w:val="9"/>
     <w:rPr>
       <w:rFonts w:asciiTheme="majorHAnsi" w:hAnsiTheme="majorHAnsi" w:eastAsiaTheme="majorEastAsia" w:cstheme="majorBidi"/>
@@ -56023,7 +56133,6 @@
     <w:name w:val="Intense Quote Char"/>
     <w:basedOn w:val="133"/>
     <w:link w:val="157"/>
-    <w:qFormat/>
     <w:uiPriority w:val="30"/>
     <w:rPr>
       <w:b/>

</xml_diff>

<commit_message>
chore(release): public snapshot v0.2.5 (#2)
Co-authored-by: AngelinatheMellowWish <311235986+AngelinatheMellowWish@users.noreply.github.com>
</commit_message>
<xml_diff>
--- a/docs/需求说明书.docx
+++ b/docs/需求说明书.docx
@@ -69,7 +69,7 @@
           <w:color w:val="5A6370"/>
           <w:sz w:val="20"/>
         </w:rPr>
-        <w:t>文档编号  ADVP-SRS-001        版本  v0.2.4</w:t>
+        <w:t>文档编号  ADVP-SRS-001        版本  v0.2.5</w:t>
       </w:r>
     </w:p>
     <w:p>
@@ -173,7 +173,7 @@
         <w:rPr>
           <w:rFonts w:ascii="微软雅黑" w:hAnsi="微软雅黑" w:eastAsia="微软雅黑"/>
         </w:rPr>
-        <w:instrText xml:space="preserve"> HYPERLINK \l _Toc29481 </w:instrText>
+        <w:instrText xml:space="preserve"> HYPERLINK \l _Toc27890 </w:instrText>
       </w:r>
       <w:r>
         <w:rPr>
@@ -194,7 +194,7 @@
         <w:fldChar w:fldCharType="begin"/>
       </w:r>
       <w:r>
-        <w:instrText xml:space="preserve"> PAGEREF _Toc29481 \h </w:instrText>
+        <w:instrText xml:space="preserve"> PAGEREF _Toc27890 \h </w:instrText>
       </w:r>
       <w:r>
         <w:fldChar w:fldCharType="separate"/>
@@ -231,7 +231,7 @@
         <w:rPr>
           <w:rFonts w:ascii="微软雅黑" w:hAnsi="微软雅黑" w:eastAsia="微软雅黑"/>
         </w:rPr>
-        <w:instrText xml:space="preserve"> HYPERLINK \l _Toc6066 </w:instrText>
+        <w:instrText xml:space="preserve"> HYPERLINK \l _Toc6122 </w:instrText>
       </w:r>
       <w:r>
         <w:rPr>
@@ -252,13 +252,13 @@
         <w:fldChar w:fldCharType="begin"/>
       </w:r>
       <w:r>
-        <w:instrText xml:space="preserve"> PAGEREF _Toc6066 \h </w:instrText>
+        <w:instrText xml:space="preserve"> PAGEREF _Toc6122 \h </w:instrText>
       </w:r>
       <w:r>
         <w:fldChar w:fldCharType="separate"/>
       </w:r>
       <w:r>
-        <w:t>4</w:t>
+        <w:t>5</w:t>
       </w:r>
       <w:r>
         <w:fldChar w:fldCharType="end"/>
@@ -289,7 +289,7 @@
         <w:rPr>
           <w:rFonts w:ascii="微软雅黑" w:hAnsi="微软雅黑" w:eastAsia="微软雅黑"/>
         </w:rPr>
-        <w:instrText xml:space="preserve"> HYPERLINK \l _Toc24056 </w:instrText>
+        <w:instrText xml:space="preserve"> HYPERLINK \l _Toc8356 </w:instrText>
       </w:r>
       <w:r>
         <w:rPr>
@@ -310,7 +310,7 @@
         <w:fldChar w:fldCharType="begin"/>
       </w:r>
       <w:r>
-        <w:instrText xml:space="preserve"> PAGEREF _Toc24056 \h </w:instrText>
+        <w:instrText xml:space="preserve"> PAGEREF _Toc8356 \h </w:instrText>
       </w:r>
       <w:r>
         <w:fldChar w:fldCharType="separate"/>
@@ -347,7 +347,7 @@
         <w:rPr>
           <w:rFonts w:ascii="微软雅黑" w:hAnsi="微软雅黑" w:eastAsia="微软雅黑"/>
         </w:rPr>
-        <w:instrText xml:space="preserve"> HYPERLINK \l _Toc13173 </w:instrText>
+        <w:instrText xml:space="preserve"> HYPERLINK \l _Toc15683 </w:instrText>
       </w:r>
       <w:r>
         <w:rPr>
@@ -368,7 +368,7 @@
         <w:fldChar w:fldCharType="begin"/>
       </w:r>
       <w:r>
-        <w:instrText xml:space="preserve"> PAGEREF _Toc13173 \h </w:instrText>
+        <w:instrText xml:space="preserve"> PAGEREF _Toc15683 \h </w:instrText>
       </w:r>
       <w:r>
         <w:fldChar w:fldCharType="separate"/>
@@ -405,7 +405,7 @@
         <w:rPr>
           <w:rFonts w:ascii="微软雅黑" w:hAnsi="微软雅黑" w:eastAsia="微软雅黑"/>
         </w:rPr>
-        <w:instrText xml:space="preserve"> HYPERLINK \l _Toc11842 </w:instrText>
+        <w:instrText xml:space="preserve"> HYPERLINK \l _Toc2033 </w:instrText>
       </w:r>
       <w:r>
         <w:rPr>
@@ -426,7 +426,7 @@
         <w:fldChar w:fldCharType="begin"/>
       </w:r>
       <w:r>
-        <w:instrText xml:space="preserve"> PAGEREF _Toc11842 \h </w:instrText>
+        <w:instrText xml:space="preserve"> PAGEREF _Toc2033 \h </w:instrText>
       </w:r>
       <w:r>
         <w:fldChar w:fldCharType="separate"/>
@@ -463,7 +463,7 @@
         <w:rPr>
           <w:rFonts w:ascii="微软雅黑" w:hAnsi="微软雅黑" w:eastAsia="微软雅黑"/>
         </w:rPr>
-        <w:instrText xml:space="preserve"> HYPERLINK \l _Toc12164 </w:instrText>
+        <w:instrText xml:space="preserve"> HYPERLINK \l _Toc14198 </w:instrText>
       </w:r>
       <w:r>
         <w:rPr>
@@ -484,7 +484,7 @@
         <w:fldChar w:fldCharType="begin"/>
       </w:r>
       <w:r>
-        <w:instrText xml:space="preserve"> PAGEREF _Toc12164 \h </w:instrText>
+        <w:instrText xml:space="preserve"> PAGEREF _Toc14198 \h </w:instrText>
       </w:r>
       <w:r>
         <w:fldChar w:fldCharType="separate"/>
@@ -521,7 +521,7 @@
         <w:rPr>
           <w:rFonts w:ascii="微软雅黑" w:hAnsi="微软雅黑" w:eastAsia="微软雅黑"/>
         </w:rPr>
-        <w:instrText xml:space="preserve"> HYPERLINK \l _Toc27760 </w:instrText>
+        <w:instrText xml:space="preserve"> HYPERLINK \l _Toc26279 </w:instrText>
       </w:r>
       <w:r>
         <w:rPr>
@@ -542,7 +542,7 @@
         <w:fldChar w:fldCharType="begin"/>
       </w:r>
       <w:r>
-        <w:instrText xml:space="preserve"> PAGEREF _Toc27760 \h </w:instrText>
+        <w:instrText xml:space="preserve"> PAGEREF _Toc26279 \h </w:instrText>
       </w:r>
       <w:r>
         <w:fldChar w:fldCharType="separate"/>
@@ -579,7 +579,7 @@
         <w:rPr>
           <w:rFonts w:ascii="微软雅黑" w:hAnsi="微软雅黑" w:eastAsia="微软雅黑"/>
         </w:rPr>
-        <w:instrText xml:space="preserve"> HYPERLINK \l _Toc29314 </w:instrText>
+        <w:instrText xml:space="preserve"> HYPERLINK \l _Toc6791 </w:instrText>
       </w:r>
       <w:r>
         <w:rPr>
@@ -600,7 +600,7 @@
         <w:fldChar w:fldCharType="begin"/>
       </w:r>
       <w:r>
-        <w:instrText xml:space="preserve"> PAGEREF _Toc29314 \h </w:instrText>
+        <w:instrText xml:space="preserve"> PAGEREF _Toc6791 \h </w:instrText>
       </w:r>
       <w:r>
         <w:fldChar w:fldCharType="separate"/>
@@ -637,7 +637,7 @@
         <w:rPr>
           <w:rFonts w:ascii="微软雅黑" w:hAnsi="微软雅黑" w:eastAsia="微软雅黑"/>
         </w:rPr>
-        <w:instrText xml:space="preserve"> HYPERLINK \l _Toc27895 </w:instrText>
+        <w:instrText xml:space="preserve"> HYPERLINK \l _Toc2684 </w:instrText>
       </w:r>
       <w:r>
         <w:rPr>
@@ -658,7 +658,7 @@
         <w:fldChar w:fldCharType="begin"/>
       </w:r>
       <w:r>
-        <w:instrText xml:space="preserve"> PAGEREF _Toc27895 \h </w:instrText>
+        <w:instrText xml:space="preserve"> PAGEREF _Toc2684 \h </w:instrText>
       </w:r>
       <w:r>
         <w:fldChar w:fldCharType="separate"/>
@@ -695,7 +695,7 @@
         <w:rPr>
           <w:rFonts w:ascii="微软雅黑" w:hAnsi="微软雅黑" w:eastAsia="微软雅黑"/>
         </w:rPr>
-        <w:instrText xml:space="preserve"> HYPERLINK \l _Toc19977 </w:instrText>
+        <w:instrText xml:space="preserve"> HYPERLINK \l _Toc26635 </w:instrText>
       </w:r>
       <w:r>
         <w:rPr>
@@ -716,7 +716,7 @@
         <w:fldChar w:fldCharType="begin"/>
       </w:r>
       <w:r>
-        <w:instrText xml:space="preserve"> PAGEREF _Toc19977 \h </w:instrText>
+        <w:instrText xml:space="preserve"> PAGEREF _Toc26635 \h </w:instrText>
       </w:r>
       <w:r>
         <w:fldChar w:fldCharType="separate"/>
@@ -753,7 +753,7 @@
         <w:rPr>
           <w:rFonts w:ascii="微软雅黑" w:hAnsi="微软雅黑" w:eastAsia="微软雅黑"/>
         </w:rPr>
-        <w:instrText xml:space="preserve"> HYPERLINK \l _Toc5686 </w:instrText>
+        <w:instrText xml:space="preserve"> HYPERLINK \l _Toc5768 </w:instrText>
       </w:r>
       <w:r>
         <w:rPr>
@@ -774,7 +774,7 @@
         <w:fldChar w:fldCharType="begin"/>
       </w:r>
       <w:r>
-        <w:instrText xml:space="preserve"> PAGEREF _Toc5686 \h </w:instrText>
+        <w:instrText xml:space="preserve"> PAGEREF _Toc5768 \h </w:instrText>
       </w:r>
       <w:r>
         <w:fldChar w:fldCharType="separate"/>
@@ -811,7 +811,7 @@
         <w:rPr>
           <w:rFonts w:ascii="微软雅黑" w:hAnsi="微软雅黑" w:eastAsia="微软雅黑"/>
         </w:rPr>
-        <w:instrText xml:space="preserve"> HYPERLINK \l _Toc9593 </w:instrText>
+        <w:instrText xml:space="preserve"> HYPERLINK \l _Toc1862 </w:instrText>
       </w:r>
       <w:r>
         <w:rPr>
@@ -832,7 +832,7 @@
         <w:fldChar w:fldCharType="begin"/>
       </w:r>
       <w:r>
-        <w:instrText xml:space="preserve"> PAGEREF _Toc9593 \h </w:instrText>
+        <w:instrText xml:space="preserve"> PAGEREF _Toc1862 \h </w:instrText>
       </w:r>
       <w:r>
         <w:fldChar w:fldCharType="separate"/>
@@ -869,7 +869,7 @@
         <w:rPr>
           <w:rFonts w:ascii="微软雅黑" w:hAnsi="微软雅黑" w:eastAsia="微软雅黑"/>
         </w:rPr>
-        <w:instrText xml:space="preserve"> HYPERLINK \l _Toc637 </w:instrText>
+        <w:instrText xml:space="preserve"> HYPERLINK \l _Toc2906 </w:instrText>
       </w:r>
       <w:r>
         <w:rPr>
@@ -890,7 +890,7 @@
         <w:fldChar w:fldCharType="begin"/>
       </w:r>
       <w:r>
-        <w:instrText xml:space="preserve"> PAGEREF _Toc637 \h </w:instrText>
+        <w:instrText xml:space="preserve"> PAGEREF _Toc2906 \h </w:instrText>
       </w:r>
       <w:r>
         <w:fldChar w:fldCharType="separate"/>
@@ -927,7 +927,7 @@
         <w:rPr>
           <w:rFonts w:ascii="微软雅黑" w:hAnsi="微软雅黑" w:eastAsia="微软雅黑"/>
         </w:rPr>
-        <w:instrText xml:space="preserve"> HYPERLINK \l _Toc17522 </w:instrText>
+        <w:instrText xml:space="preserve"> HYPERLINK \l _Toc23398 </w:instrText>
       </w:r>
       <w:r>
         <w:rPr>
@@ -948,7 +948,7 @@
         <w:fldChar w:fldCharType="begin"/>
       </w:r>
       <w:r>
-        <w:instrText xml:space="preserve"> PAGEREF _Toc17522 \h </w:instrText>
+        <w:instrText xml:space="preserve"> PAGEREF _Toc23398 \h </w:instrText>
       </w:r>
       <w:r>
         <w:fldChar w:fldCharType="separate"/>
@@ -985,7 +985,7 @@
         <w:rPr>
           <w:rFonts w:ascii="微软雅黑" w:hAnsi="微软雅黑" w:eastAsia="微软雅黑"/>
         </w:rPr>
-        <w:instrText xml:space="preserve"> HYPERLINK \l _Toc18240 </w:instrText>
+        <w:instrText xml:space="preserve"> HYPERLINK \l _Toc30944 </w:instrText>
       </w:r>
       <w:r>
         <w:rPr>
@@ -1006,7 +1006,7 @@
         <w:fldChar w:fldCharType="begin"/>
       </w:r>
       <w:r>
-        <w:instrText xml:space="preserve"> PAGEREF _Toc18240 \h </w:instrText>
+        <w:instrText xml:space="preserve"> PAGEREF _Toc30944 \h </w:instrText>
       </w:r>
       <w:r>
         <w:fldChar w:fldCharType="separate"/>
@@ -1043,7 +1043,7 @@
         <w:rPr>
           <w:rFonts w:ascii="微软雅黑" w:hAnsi="微软雅黑" w:eastAsia="微软雅黑"/>
         </w:rPr>
-        <w:instrText xml:space="preserve"> HYPERLINK \l _Toc10689 </w:instrText>
+        <w:instrText xml:space="preserve"> HYPERLINK \l _Toc20550 </w:instrText>
       </w:r>
       <w:r>
         <w:rPr>
@@ -1064,7 +1064,7 @@
         <w:fldChar w:fldCharType="begin"/>
       </w:r>
       <w:r>
-        <w:instrText xml:space="preserve"> PAGEREF _Toc10689 \h </w:instrText>
+        <w:instrText xml:space="preserve"> PAGEREF _Toc20550 \h </w:instrText>
       </w:r>
       <w:r>
         <w:fldChar w:fldCharType="separate"/>
@@ -1101,7 +1101,7 @@
         <w:rPr>
           <w:rFonts w:ascii="微软雅黑" w:hAnsi="微软雅黑" w:eastAsia="微软雅黑"/>
         </w:rPr>
-        <w:instrText xml:space="preserve"> HYPERLINK \l _Toc12974 </w:instrText>
+        <w:instrText xml:space="preserve"> HYPERLINK \l _Toc28805 </w:instrText>
       </w:r>
       <w:r>
         <w:rPr>
@@ -1122,7 +1122,7 @@
         <w:fldChar w:fldCharType="begin"/>
       </w:r>
       <w:r>
-        <w:instrText xml:space="preserve"> PAGEREF _Toc12974 \h </w:instrText>
+        <w:instrText xml:space="preserve"> PAGEREF _Toc28805 \h </w:instrText>
       </w:r>
       <w:r>
         <w:fldChar w:fldCharType="separate"/>
@@ -1161,7 +1161,7 @@
         <w:keepNext/>
         <w:spacing w:before="240" w:after="100"/>
       </w:pPr>
-      <w:bookmarkStart w:id="0" w:name="_Toc29481"/>
+      <w:bookmarkStart w:id="0" w:name="_Toc27890"/>
       <w:r>
         <w:rPr>
           <w:rFonts w:ascii="微软雅黑" w:hAnsi="微软雅黑" w:eastAsia="微软雅黑"/>
@@ -1434,7 +1434,7 @@
                 <w:color w:val="242A33"/>
                 <w:sz w:val="16"/>
               </w:rPr>
-              <w:t>v0.2.4</w:t>
+              <w:t>v0.2.5</w:t>
             </w:r>
           </w:p>
         </w:tc>
@@ -1920,12 +1920,6 @@
             <w:insideH w:val="single" w:color="auto" w:sz="4" w:space="0"/>
             <w:insideV w:val="single" w:color="auto" w:sz="4" w:space="0"/>
           </w:tblBorders>
-          <w:tblCellMar>
-            <w:top w:w="40" w:type="dxa"/>
-            <w:left w:w="70" w:type="dxa"/>
-            <w:bottom w:w="40" w:type="dxa"/>
-            <w:right w:w="70" w:type="dxa"/>
-          </w:tblCellMar>
         </w:tblPrEx>
         <w:trPr>
           <w:tblHeader/>
@@ -2067,7 +2061,7 @@
                 <w:color w:val="242A33"/>
                 <w:sz w:val="16"/>
               </w:rPr>
-              <w:t>v0.2.4</w:t>
+              <w:t>v0.2.5</w:t>
             </w:r>
           </w:p>
         </w:tc>
@@ -2105,7 +2099,7 @@
                 <w:color w:val="242A33"/>
                 <w:sz w:val="16"/>
               </w:rPr>
-              <w:t>fix(ci): force UTF-8 Python output on Windows runners</w:t>
+              <w:t>docs(log): add 2026-10-22 development work record</w:t>
             </w:r>
           </w:p>
         </w:tc>
@@ -2184,7 +2178,7 @@
                 <w:color w:val="242A33"/>
                 <w:sz w:val="16"/>
               </w:rPr>
-              <w:t>v0.2.3</w:t>
+              <w:t>v0.2.4</w:t>
             </w:r>
           </w:p>
         </w:tc>
@@ -2224,7 +2218,7 @@
                 <w:color w:val="242A33"/>
                 <w:sz w:val="16"/>
               </w:rPr>
-              <w:t>fix(ci): replace Windows-incompatible lychee action with local link checker</w:t>
+              <w:t>fix(ci): force UTF-8 Python output on Windows runners</w:t>
             </w:r>
           </w:p>
         </w:tc>
@@ -2304,7 +2298,7 @@
                 <w:color w:val="242A33"/>
                 <w:sz w:val="16"/>
               </w:rPr>
-              <w:t>v0.2.2</w:t>
+              <w:t>v0.2.3</w:t>
             </w:r>
           </w:p>
         </w:tc>
@@ -2342,7 +2336,7 @@
                 <w:color w:val="242A33"/>
                 <w:sz w:val="16"/>
               </w:rPr>
-              <w:t>fix(ci): correct frontend working-directory and document private protection limit</w:t>
+              <w:t>fix(ci): replace Windows-incompatible lychee action with local link checker</w:t>
             </w:r>
           </w:p>
         </w:tc>
@@ -2421,7 +2415,7 @@
                 <w:color w:val="242A33"/>
                 <w:sz w:val="16"/>
               </w:rPr>
-              <w:t>v0.2.1</w:t>
+              <w:t>v0.2.2</w:t>
             </w:r>
           </w:p>
         </w:tc>
@@ -2441,7 +2435,7 @@
                 <w:color w:val="242A33"/>
                 <w:sz w:val="16"/>
               </w:rPr>
-              <w:t>2026-10-22</w:t>
+              <w:t>2026-10-23</w:t>
             </w:r>
           </w:p>
         </w:tc>
@@ -2461,7 +2455,7 @@
                 <w:color w:val="242A33"/>
                 <w:sz w:val="16"/>
               </w:rPr>
-              <w:t>docs(repo): add GitHub publication guide and ignore local agent state</w:t>
+              <w:t>fix(ci): correct frontend working-directory and document private protection limit</w:t>
             </w:r>
           </w:p>
         </w:tc>
@@ -2541,7 +2535,7 @@
                 <w:color w:val="242A33"/>
                 <w:sz w:val="16"/>
               </w:rPr>
-              <w:t>v0.2.0</w:t>
+              <w:t>v0.2.1</w:t>
             </w:r>
           </w:p>
         </w:tc>
@@ -2579,7 +2573,7 @@
                 <w:color w:val="242A33"/>
                 <w:sz w:val="16"/>
               </w:rPr>
-              <w:t>feat(scope): adopt Apache-2.0, Kafka-required stream, single-dev 40-48 week plan</w:t>
+              <w:t>docs(repo): add GitHub publication guide and ignore local agent state</w:t>
             </w:r>
           </w:p>
         </w:tc>
@@ -2658,7 +2652,7 @@
                 <w:color w:val="242A33"/>
                 <w:sz w:val="16"/>
               </w:rPr>
-              <w:t>v0.1.1</w:t>
+              <w:t>v0.2.0</w:t>
             </w:r>
           </w:p>
         </w:tc>
@@ -2698,7 +2692,7 @@
                 <w:color w:val="242A33"/>
                 <w:sz w:val="16"/>
               </w:rPr>
-              <w:t>fix(repo): sanitize public export paths and checks</w:t>
+              <w:t>feat(scope): adopt Apache-2.0, Kafka-required stream, single-dev 40-48 week plan</w:t>
             </w:r>
           </w:p>
         </w:tc>
@@ -2778,6 +2772,123 @@
                 <w:color w:val="242A33"/>
                 <w:sz w:val="16"/>
               </w:rPr>
+              <w:t>v0.1.1</w:t>
+            </w:r>
+          </w:p>
+        </w:tc>
+        <w:tc>
+          <w:tcPr>
+            <w:tcW w:w="1928" w:type="dxa"/>
+          </w:tcPr>
+          <w:p>
+            <w:pPr>
+              <w:spacing w:before="20" w:after="20"/>
+            </w:pPr>
+            <w:r>
+              <w:rPr>
+                <w:rFonts w:ascii="微软雅黑" w:hAnsi="微软雅黑" w:eastAsia="微软雅黑"/>
+                <w:b w:val="0"/>
+                <w:color w:val="242A33"/>
+                <w:sz w:val="16"/>
+              </w:rPr>
+              <w:t>2026-10-22</w:t>
+            </w:r>
+          </w:p>
+        </w:tc>
+        <w:tc>
+          <w:tcPr>
+            <w:tcW w:w="1928" w:type="dxa"/>
+          </w:tcPr>
+          <w:p>
+            <w:pPr>
+              <w:spacing w:before="20" w:after="20"/>
+            </w:pPr>
+            <w:r>
+              <w:rPr>
+                <w:rFonts w:ascii="微软雅黑" w:hAnsi="微软雅黑" w:eastAsia="微软雅黑"/>
+                <w:b w:val="0"/>
+                <w:color w:val="242A33"/>
+                <w:sz w:val="16"/>
+              </w:rPr>
+              <w:t>fix(repo): sanitize public export paths and checks</w:t>
+            </w:r>
+          </w:p>
+        </w:tc>
+        <w:tc>
+          <w:tcPr>
+            <w:tcW w:w="1928" w:type="dxa"/>
+          </w:tcPr>
+          <w:p>
+            <w:pPr>
+              <w:spacing w:before="20" w:after="20"/>
+            </w:pPr>
+            <w:r>
+              <w:rPr>
+                <w:rFonts w:ascii="微软雅黑" w:hAnsi="微软雅黑" w:eastAsia="微软雅黑"/>
+                <w:b w:val="0"/>
+                <w:color w:val="242A33"/>
+                <w:sz w:val="16"/>
+              </w:rPr>
+              <w:t>ADVP 项目组</w:t>
+            </w:r>
+          </w:p>
+        </w:tc>
+        <w:tc>
+          <w:tcPr>
+            <w:tcW w:w="1928" w:type="dxa"/>
+          </w:tcPr>
+          <w:p>
+            <w:pPr>
+              <w:spacing w:before="20" w:after="20"/>
+            </w:pPr>
+            <w:r>
+              <w:rPr>
+                <w:rFonts w:ascii="微软雅黑" w:hAnsi="微软雅黑" w:eastAsia="微软雅黑"/>
+                <w:b w:val="0"/>
+                <w:color w:val="242A33"/>
+                <w:sz w:val="16"/>
+              </w:rPr>
+              <w:t>待确认</w:t>
+            </w:r>
+          </w:p>
+        </w:tc>
+      </w:tr>
+      <w:tr>
+        <w:tblPrEx>
+          <w:tblBorders>
+            <w:top w:val="single" w:color="auto" w:sz="4" w:space="0"/>
+            <w:left w:val="single" w:color="auto" w:sz="4" w:space="0"/>
+            <w:bottom w:val="single" w:color="auto" w:sz="4" w:space="0"/>
+            <w:right w:val="single" w:color="auto" w:sz="4" w:space="0"/>
+            <w:insideH w:val="single" w:color="auto" w:sz="4" w:space="0"/>
+            <w:insideV w:val="single" w:color="auto" w:sz="4" w:space="0"/>
+          </w:tblBorders>
+          <w:tblCellMar>
+            <w:top w:w="40" w:type="dxa"/>
+            <w:left w:w="70" w:type="dxa"/>
+            <w:bottom w:w="40" w:type="dxa"/>
+            <w:right w:w="70" w:type="dxa"/>
+          </w:tblCellMar>
+        </w:tblPrEx>
+        <w:trPr>
+          <w:jc w:val="center"/>
+        </w:trPr>
+        <w:tc>
+          <w:tcPr>
+            <w:tcW w:w="1928" w:type="dxa"/>
+            <w:shd w:val="clear" w:color="auto" w:fill="F5F7FA"/>
+          </w:tcPr>
+          <w:p>
+            <w:pPr>
+              <w:spacing w:before="20" w:after="20"/>
+            </w:pPr>
+            <w:r>
+              <w:rPr>
+                <w:rFonts w:ascii="微软雅黑" w:hAnsi="微软雅黑" w:eastAsia="微软雅黑"/>
+                <w:b w:val="0"/>
+                <w:color w:val="242A33"/>
+                <w:sz w:val="16"/>
+              </w:rPr>
               <w:t>v0.1.0</w:t>
             </w:r>
           </w:p>
@@ -2785,6 +2896,7 @@
         <w:tc>
           <w:tcPr>
             <w:tcW w:w="1928" w:type="dxa"/>
+            <w:shd w:val="clear" w:color="auto" w:fill="F5F7FA"/>
           </w:tcPr>
           <w:p>
             <w:pPr>
@@ -2804,6 +2916,7 @@
         <w:tc>
           <w:tcPr>
             <w:tcW w:w="1928" w:type="dxa"/>
+            <w:shd w:val="clear" w:color="auto" w:fill="F5F7FA"/>
           </w:tcPr>
           <w:p>
             <w:pPr>
@@ -2823,6 +2936,7 @@
         <w:tc>
           <w:tcPr>
             <w:tcW w:w="1928" w:type="dxa"/>
+            <w:shd w:val="clear" w:color="auto" w:fill="F5F7FA"/>
           </w:tcPr>
           <w:p>
             <w:pPr>
@@ -2842,6 +2956,7 @@
         <w:tc>
           <w:tcPr>
             <w:tcW w:w="1928" w:type="dxa"/>
+            <w:shd w:val="clear" w:color="auto" w:fill="F5F7FA"/>
           </w:tcPr>
           <w:p>
             <w:pPr>
@@ -3203,7 +3318,7 @@
         <w:keepNext/>
         <w:spacing w:before="240" w:after="100"/>
       </w:pPr>
-      <w:bookmarkStart w:id="1" w:name="_Toc6066"/>
+      <w:bookmarkStart w:id="1" w:name="_Toc6122"/>
       <w:r>
         <w:rPr>
           <w:rFonts w:ascii="微软雅黑" w:hAnsi="微软雅黑" w:eastAsia="微软雅黑"/>
@@ -4776,7 +4891,7 @@
         <w:keepNext/>
         <w:spacing w:before="240" w:after="100"/>
       </w:pPr>
-      <w:bookmarkStart w:id="2" w:name="_Toc24056"/>
+      <w:bookmarkStart w:id="2" w:name="_Toc8356"/>
       <w:r>
         <w:rPr>
           <w:rFonts w:ascii="微软雅黑" w:hAnsi="微软雅黑" w:eastAsia="微软雅黑"/>
@@ -7282,7 +7397,7 @@
         <w:keepNext/>
         <w:spacing w:before="240" w:after="100"/>
       </w:pPr>
-      <w:bookmarkStart w:id="3" w:name="_Toc13173"/>
+      <w:bookmarkStart w:id="3" w:name="_Toc15683"/>
       <w:r>
         <w:rPr>
           <w:rFonts w:ascii="微软雅黑" w:hAnsi="微软雅黑" w:eastAsia="微软雅黑"/>
@@ -21494,6 +21609,12 @@
             <w:insideH w:val="single" w:color="auto" w:sz="4" w:space="0"/>
             <w:insideV w:val="single" w:color="auto" w:sz="4" w:space="0"/>
           </w:tblBorders>
+          <w:tblCellMar>
+            <w:top w:w="40" w:type="dxa"/>
+            <w:left w:w="70" w:type="dxa"/>
+            <w:bottom w:w="40" w:type="dxa"/>
+            <w:right w:w="70" w:type="dxa"/>
+          </w:tblCellMar>
         </w:tblPrEx>
         <w:trPr>
           <w:tblHeader/>
@@ -22856,7 +22977,7 @@
         <w:keepNext/>
         <w:spacing w:before="240" w:after="100"/>
       </w:pPr>
-      <w:bookmarkStart w:id="4" w:name="_Toc11842"/>
+      <w:bookmarkStart w:id="4" w:name="_Toc2033"/>
       <w:r>
         <w:rPr>
           <w:rFonts w:ascii="微软雅黑" w:hAnsi="微软雅黑" w:eastAsia="微软雅黑"/>
@@ -26759,7 +26880,7 @@
         <w:keepNext/>
         <w:spacing w:before="240" w:after="100"/>
       </w:pPr>
-      <w:bookmarkStart w:id="5" w:name="_Toc12164"/>
+      <w:bookmarkStart w:id="5" w:name="_Toc14198"/>
       <w:r>
         <w:rPr>
           <w:rFonts w:ascii="微软雅黑" w:hAnsi="微软雅黑" w:eastAsia="微软雅黑"/>
@@ -29205,7 +29326,7 @@
         <w:keepNext/>
         <w:spacing w:before="240" w:after="100"/>
       </w:pPr>
-      <w:bookmarkStart w:id="6" w:name="_Toc27760"/>
+      <w:bookmarkStart w:id="6" w:name="_Toc26279"/>
       <w:r>
         <w:rPr>
           <w:rFonts w:ascii="微软雅黑" w:hAnsi="微软雅黑" w:eastAsia="微软雅黑"/>
@@ -29904,7 +30025,7 @@
         <w:keepNext/>
         <w:spacing w:before="240" w:after="100"/>
       </w:pPr>
-      <w:bookmarkStart w:id="7" w:name="_Toc29314"/>
+      <w:bookmarkStart w:id="7" w:name="_Toc6791"/>
       <w:r>
         <w:rPr>
           <w:rFonts w:ascii="微软雅黑" w:hAnsi="微软雅黑" w:eastAsia="微软雅黑"/>
@@ -31979,7 +32100,7 @@
         <w:keepNext/>
         <w:spacing w:before="240" w:after="100"/>
       </w:pPr>
-      <w:bookmarkStart w:id="8" w:name="_Toc27895"/>
+      <w:bookmarkStart w:id="8" w:name="_Toc2684"/>
       <w:r>
         <w:rPr>
           <w:rFonts w:ascii="微软雅黑" w:hAnsi="微软雅黑" w:eastAsia="微软雅黑"/>
@@ -33148,7 +33269,7 @@
         <w:keepNext/>
         <w:spacing w:before="240" w:after="100"/>
       </w:pPr>
-      <w:bookmarkStart w:id="9" w:name="_Toc19977"/>
+      <w:bookmarkStart w:id="9" w:name="_Toc26635"/>
       <w:r>
         <w:rPr>
           <w:rFonts w:ascii="微软雅黑" w:hAnsi="微软雅黑" w:eastAsia="微软雅黑"/>
@@ -33676,7 +33797,7 @@
         <w:keepNext/>
         <w:spacing w:before="240" w:after="100"/>
       </w:pPr>
-      <w:bookmarkStart w:id="10" w:name="_Toc5686"/>
+      <w:bookmarkStart w:id="10" w:name="_Toc5768"/>
       <w:r>
         <w:rPr>
           <w:rFonts w:ascii="微软雅黑" w:hAnsi="微软雅黑" w:eastAsia="微软雅黑"/>
@@ -34567,7 +34688,7 @@
         <w:keepNext/>
         <w:spacing w:before="240" w:after="100"/>
       </w:pPr>
-      <w:bookmarkStart w:id="11" w:name="_Toc9593"/>
+      <w:bookmarkStart w:id="11" w:name="_Toc1862"/>
       <w:r>
         <w:rPr>
           <w:rFonts w:ascii="微软雅黑" w:hAnsi="微软雅黑" w:eastAsia="微软雅黑"/>
@@ -35934,7 +36055,7 @@
         <w:keepNext/>
         <w:spacing w:before="240" w:after="100"/>
       </w:pPr>
-      <w:bookmarkStart w:id="12" w:name="_Toc637"/>
+      <w:bookmarkStart w:id="12" w:name="_Toc2906"/>
       <w:r>
         <w:rPr>
           <w:rFonts w:ascii="微软雅黑" w:hAnsi="微软雅黑" w:eastAsia="微软雅黑"/>
@@ -37890,7 +38011,7 @@
         <w:keepNext/>
         <w:spacing w:before="240" w:after="100"/>
       </w:pPr>
-      <w:bookmarkStart w:id="13" w:name="_Toc17522"/>
+      <w:bookmarkStart w:id="13" w:name="_Toc23398"/>
       <w:r>
         <w:rPr>
           <w:rFonts w:ascii="微软雅黑" w:hAnsi="微软雅黑" w:eastAsia="微软雅黑"/>
@@ -41528,7 +41649,7 @@
         <w:keepNext/>
         <w:spacing w:before="240" w:after="100"/>
       </w:pPr>
-      <w:bookmarkStart w:id="14" w:name="_Toc18240"/>
+      <w:bookmarkStart w:id="14" w:name="_Toc30944"/>
       <w:r>
         <w:rPr>
           <w:rFonts w:ascii="微软雅黑" w:hAnsi="微软雅黑" w:eastAsia="微软雅黑"/>
@@ -41577,12 +41698,6 @@
             <w:insideH w:val="single" w:color="auto" w:sz="4" w:space="0"/>
             <w:insideV w:val="single" w:color="auto" w:sz="4" w:space="0"/>
           </w:tblBorders>
-          <w:tblCellMar>
-            <w:top w:w="40" w:type="dxa"/>
-            <w:left w:w="70" w:type="dxa"/>
-            <w:bottom w:w="40" w:type="dxa"/>
-            <w:right w:w="70" w:type="dxa"/>
-          </w:tblCellMar>
         </w:tblPrEx>
         <w:trPr>
           <w:tblHeader/>
@@ -42752,7 +42867,7 @@
         <w:keepNext/>
         <w:spacing w:before="240" w:after="100"/>
       </w:pPr>
-      <w:bookmarkStart w:id="15" w:name="_Toc10689"/>
+      <w:bookmarkStart w:id="15" w:name="_Toc20550"/>
       <w:r>
         <w:rPr>
           <w:rFonts w:ascii="微软雅黑" w:hAnsi="微软雅黑" w:eastAsia="微软雅黑"/>
@@ -42945,7 +43060,7 @@
         <w:keepNext/>
         <w:spacing w:before="240" w:after="100"/>
       </w:pPr>
-      <w:bookmarkStart w:id="16" w:name="_Toc12974"/>
+      <w:bookmarkStart w:id="16" w:name="_Toc28805"/>
       <w:r>
         <w:rPr>
           <w:rFonts w:ascii="微软雅黑" w:hAnsi="微软雅黑" w:eastAsia="微软雅黑"/>
@@ -43196,7 +43311,7 @@
         <w:color w:val="7A8492"/>
         <w:sz w:val="16"/>
       </w:rPr>
-      <w:t xml:space="preserve"> 页    ADVP-SRS-001 · v0.2.4</w:t>
+      <w:t xml:space="preserve"> 页    ADVP-SRS-001 · v0.2.5</w:t>
     </w:r>
   </w:p>
 </w:ftr>
@@ -43270,7 +43385,7 @@
         <w:color w:val="7A8492"/>
         <w:sz w:val="17"/>
       </w:rPr>
-      <w:t>ADVP-SRS-001 · v0.2.4</w:t>
+      <w:t>ADVP-SRS-001 · v0.2.5</w:t>
     </w:r>
   </w:p>
 </w:hdr>
@@ -43575,7 +43690,7 @@
     <w:lsdException w:uiPriority="99" w:name="Table Web 2"/>
     <w:lsdException w:uiPriority="99" w:name="Table Web 3"/>
     <w:lsdException w:uiPriority="99" w:name="Balloon Text"/>
-    <w:lsdException w:qFormat="1" w:unhideWhenUsed="0" w:uiPriority="59" w:semiHidden="0" w:name="Table Grid"/>
+    <w:lsdException w:unhideWhenUsed="0" w:uiPriority="59" w:semiHidden="0" w:name="Table Grid"/>
     <w:lsdException w:uiPriority="99" w:name="Table Theme"/>
     <w:lsdException w:qFormat="1" w:unhideWhenUsed="0" w:uiPriority="1" w:semiHidden="0" w:name="No Spacing"/>
     <w:lsdException w:unhideWhenUsed="0" w:uiPriority="60" w:semiHidden="0" w:name="Light Shading"/>
@@ -43595,7 +43710,7 @@
     <w:lsdException w:unhideWhenUsed="0" w:uiPriority="60" w:semiHidden="0" w:name="Light Shading Accent 1"/>
     <w:lsdException w:unhideWhenUsed="0" w:uiPriority="61" w:semiHidden="0" w:name="Light List Accent 1"/>
     <w:lsdException w:unhideWhenUsed="0" w:uiPriority="62" w:semiHidden="0" w:name="Light Grid Accent 1"/>
-    <w:lsdException w:qFormat="1" w:unhideWhenUsed="0" w:uiPriority="63" w:semiHidden="0" w:name="Medium Shading 1 Accent 1"/>
+    <w:lsdException w:unhideWhenUsed="0" w:uiPriority="63" w:semiHidden="0" w:name="Medium Shading 1 Accent 1"/>
     <w:lsdException w:unhideWhenUsed="0" w:uiPriority="64" w:semiHidden="0" w:name="Medium Shading 2 Accent 1"/>
     <w:lsdException w:unhideWhenUsed="0" w:uiPriority="65" w:semiHidden="0" w:name="Medium List 1 Accent 1"/>
     <w:lsdException w:qFormat="1" w:unhideWhenUsed="0" w:uiPriority="34" w:semiHidden="0" w:name="List Paragraph"/>
@@ -43626,8 +43741,8 @@
     <w:lsdException w:unhideWhenUsed="0" w:uiPriority="60" w:semiHidden="0" w:name="Light Shading Accent 3"/>
     <w:lsdException w:unhideWhenUsed="0" w:uiPriority="61" w:semiHidden="0" w:name="Light List Accent 3"/>
     <w:lsdException w:unhideWhenUsed="0" w:uiPriority="62" w:semiHidden="0" w:name="Light Grid Accent 3"/>
-    <w:lsdException w:unhideWhenUsed="0" w:uiPriority="63" w:semiHidden="0" w:name="Medium Shading 1 Accent 3"/>
-    <w:lsdException w:unhideWhenUsed="0" w:uiPriority="64" w:semiHidden="0" w:name="Medium Shading 2 Accent 3"/>
+    <w:lsdException w:qFormat="1" w:unhideWhenUsed="0" w:uiPriority="63" w:semiHidden="0" w:name="Medium Shading 1 Accent 3"/>
+    <w:lsdException w:qFormat="1" w:unhideWhenUsed="0" w:uiPriority="64" w:semiHidden="0" w:name="Medium Shading 2 Accent 3"/>
     <w:lsdException w:unhideWhenUsed="0" w:uiPriority="65" w:semiHidden="0" w:name="Medium List 1 Accent 3"/>
     <w:lsdException w:unhideWhenUsed="0" w:uiPriority="66" w:semiHidden="0" w:name="Medium List 2 Accent 3"/>
     <w:lsdException w:unhideWhenUsed="0" w:uiPriority="67" w:semiHidden="0" w:name="Medium Grid 1 Accent 3"/>
@@ -44247,7 +44362,6 @@
   <w:style w:type="table" w:styleId="34">
     <w:name w:val="Table Grid"/>
     <w:basedOn w:val="33"/>
-    <w:qFormat/>
     <w:uiPriority w:val="59"/>
     <w:pPr>
       <w:spacing w:after="0" w:line="240" w:lineRule="auto"/>
@@ -46605,7 +46719,6 @@
   <w:style w:type="table" w:styleId="57">
     <w:name w:val="Medium Shading 1 Accent 1"/>
     <w:basedOn w:val="33"/>
-    <w:qFormat/>
     <w:uiPriority w:val="63"/>
     <w:pPr>
       <w:spacing w:after="0" w:line="240" w:lineRule="auto"/>
@@ -46820,6 +46933,7 @@
   <w:style w:type="table" w:styleId="59">
     <w:name w:val="Medium Shading 1 Accent 3"/>
     <w:basedOn w:val="33"/>
+    <w:qFormat/>
     <w:uiPriority w:val="63"/>
     <w:pPr>
       <w:spacing w:after="0" w:line="240" w:lineRule="auto"/>
@@ -47743,6 +47857,7 @@
   <w:style w:type="table" w:styleId="66">
     <w:name w:val="Medium Shading 2 Accent 3"/>
     <w:basedOn w:val="33"/>
+    <w:qFormat/>
     <w:uiPriority w:val="64"/>
     <w:pPr>
       <w:spacing w:after="0" w:line="240" w:lineRule="auto"/>
@@ -55840,7 +55955,6 @@
     <w:name w:val="Macro Text Char"/>
     <w:basedOn w:val="133"/>
     <w:link w:val="2"/>
-    <w:qFormat/>
     <w:uiPriority w:val="99"/>
     <w:rPr>
       <w:rFonts w:ascii="Courier" w:hAnsi="Courier"/>
@@ -55870,7 +55984,6 @@
     <w:name w:val="Quote Char"/>
     <w:basedOn w:val="133"/>
     <w:link w:val="149"/>
-    <w:qFormat/>
     <w:uiPriority w:val="29"/>
     <w:rPr>
       <w:i/>
@@ -55888,7 +56001,6 @@
     <w:basedOn w:val="133"/>
     <w:link w:val="6"/>
     <w:semiHidden/>
-    <w:qFormat/>
     <w:uiPriority w:val="9"/>
     <w:rPr>
       <w:rFonts w:asciiTheme="majorHAnsi" w:hAnsiTheme="majorHAnsi" w:eastAsiaTheme="majorEastAsia" w:cstheme="majorBidi"/>
@@ -55909,7 +56021,6 @@
     <w:basedOn w:val="133"/>
     <w:link w:val="7"/>
     <w:semiHidden/>
-    <w:qFormat/>
     <w:uiPriority w:val="9"/>
     <w:rPr>
       <w:rFonts w:asciiTheme="majorHAnsi" w:hAnsiTheme="majorHAnsi" w:eastAsiaTheme="majorEastAsia" w:cstheme="majorBidi"/>
@@ -55921,7 +56032,6 @@
     <w:basedOn w:val="133"/>
     <w:link w:val="8"/>
     <w:semiHidden/>
-    <w:qFormat/>
     <w:uiPriority w:val="9"/>
     <w:rPr>
       <w:rFonts w:asciiTheme="majorHAnsi" w:hAnsiTheme="majorHAnsi" w:eastAsiaTheme="majorEastAsia" w:cstheme="majorBidi"/>
@@ -56023,7 +56133,6 @@
     <w:name w:val="Intense Quote Char"/>
     <w:basedOn w:val="133"/>
     <w:link w:val="157"/>
-    <w:qFormat/>
     <w:uiPriority w:val="30"/>
     <w:rPr>
       <w:b/>

</xml_diff>